<commit_message>
commit segundo en gitbash: Se edita la platilla para el informe y darle estructura
</commit_message>
<xml_diff>
--- a/Actividad_n1_Miguel_Salazar_Reina.docx
+++ b/Actividad_n1_Miguel_Salazar_Reina.docx
@@ -1322,30 +1322,9 @@
         <w:jc w:val="both"/>
         <w:rPr>
           <w:rFonts w:ascii="Times New Roman" w:hAnsi="Times New Roman" w:cs="Times New Roman"/>
-          <w:b/>
-          <w:bCs/>
-          <w:lang w:eastAsia="es-EC"/>
-        </w:rPr>
-      </w:pPr>
-    </w:p>
-    <w:p>
-      <w:pPr>
-        <w:rPr>
-          <w:rFonts w:ascii="Arial" w:hAnsi="Arial" w:cs="Arial"/>
-          <w:b/>
-          <w:bCs/>
-          <w:lang w:eastAsia="es-EC"/>
-        </w:rPr>
-      </w:pPr>
-      <w:r>
-        <w:rPr>
-          <w:rFonts w:ascii="Arial" w:hAnsi="Arial" w:cs="Arial"/>
-          <w:b/>
-          <w:bCs/>
-          <w:lang w:eastAsia="es-EC"/>
-        </w:rPr>
-        <w:br w:type="page"/>
-      </w:r>
+          <w:lang w:eastAsia="es-EC"/>
+        </w:rPr>
+      </w:pPr>
     </w:p>
     <w:p>
       <w:pPr>
@@ -1353,20 +1332,2951 @@
         <w:spacing w:line="360" w:lineRule="auto"/>
         <w:jc w:val="both"/>
         <w:rPr>
+          <w:rFonts w:ascii="Times New Roman" w:hAnsi="Times New Roman" w:cs="Times New Roman"/>
+          <w:lang w:eastAsia="es-EC"/>
+        </w:rPr>
+      </w:pPr>
+    </w:p>
+    <w:p>
+      <w:pPr>
+        <w:pStyle w:val="Sinespaciado"/>
+        <w:spacing w:line="360" w:lineRule="auto"/>
+        <w:jc w:val="both"/>
+        <w:rPr>
+          <w:rFonts w:ascii="Times New Roman" w:hAnsi="Times New Roman" w:cs="Times New Roman"/>
+          <w:lang w:eastAsia="es-EC"/>
+        </w:rPr>
+      </w:pPr>
+    </w:p>
+    <w:p>
+      <w:pPr>
+        <w:pStyle w:val="Sinespaciado"/>
+        <w:spacing w:line="360" w:lineRule="auto"/>
+        <w:jc w:val="both"/>
+        <w:rPr>
+          <w:rFonts w:ascii="Times New Roman" w:hAnsi="Times New Roman" w:cs="Times New Roman"/>
+          <w:lang w:eastAsia="es-EC"/>
+        </w:rPr>
+      </w:pPr>
+    </w:p>
+    <w:p>
+      <w:pPr>
+        <w:pStyle w:val="Sinespaciado"/>
+        <w:spacing w:line="360" w:lineRule="auto"/>
+        <w:jc w:val="both"/>
+        <w:rPr>
+          <w:rFonts w:ascii="Times New Roman" w:hAnsi="Times New Roman" w:cs="Times New Roman"/>
+          <w:lang w:eastAsia="es-EC"/>
+        </w:rPr>
+      </w:pPr>
+    </w:p>
+    <w:p>
+      <w:pPr>
+        <w:pStyle w:val="Sinespaciado"/>
+        <w:spacing w:line="360" w:lineRule="auto"/>
+        <w:jc w:val="both"/>
+        <w:rPr>
+          <w:rFonts w:ascii="Times New Roman" w:hAnsi="Times New Roman" w:cs="Times New Roman"/>
+          <w:lang w:eastAsia="es-EC"/>
+        </w:rPr>
+      </w:pPr>
+    </w:p>
+    <w:p>
+      <w:pPr>
+        <w:pStyle w:val="Sinespaciado"/>
+        <w:spacing w:line="360" w:lineRule="auto"/>
+        <w:jc w:val="both"/>
+        <w:rPr>
+          <w:rFonts w:ascii="Times New Roman" w:hAnsi="Times New Roman" w:cs="Times New Roman"/>
+          <w:lang w:eastAsia="es-EC"/>
+        </w:rPr>
+      </w:pPr>
+    </w:p>
+    <w:p>
+      <w:pPr>
+        <w:pStyle w:val="Sinespaciado"/>
+        <w:spacing w:line="360" w:lineRule="auto"/>
+        <w:jc w:val="both"/>
+        <w:rPr>
+          <w:rFonts w:ascii="Times New Roman" w:hAnsi="Times New Roman" w:cs="Times New Roman"/>
+          <w:lang w:eastAsia="es-EC"/>
+        </w:rPr>
+      </w:pPr>
+    </w:p>
+    <w:p>
+      <w:pPr>
+        <w:pStyle w:val="Sinespaciado"/>
+        <w:spacing w:line="360" w:lineRule="auto"/>
+        <w:jc w:val="both"/>
+        <w:rPr>
+          <w:rFonts w:ascii="Times New Roman" w:hAnsi="Times New Roman" w:cs="Times New Roman"/>
+          <w:lang w:eastAsia="es-EC"/>
+        </w:rPr>
+      </w:pPr>
+    </w:p>
+    <w:p>
+      <w:pPr>
+        <w:pStyle w:val="Sinespaciado"/>
+        <w:spacing w:line="360" w:lineRule="auto"/>
+        <w:jc w:val="both"/>
+        <w:rPr>
+          <w:rFonts w:ascii="Times New Roman" w:hAnsi="Times New Roman" w:cs="Times New Roman"/>
+          <w:lang w:eastAsia="es-EC"/>
+        </w:rPr>
+      </w:pPr>
+    </w:p>
+    <w:p>
+      <w:pPr>
+        <w:pStyle w:val="Sinespaciado"/>
+        <w:spacing w:line="360" w:lineRule="auto"/>
+        <w:jc w:val="both"/>
+        <w:rPr>
+          <w:rFonts w:ascii="Times New Roman" w:hAnsi="Times New Roman" w:cs="Times New Roman"/>
+          <w:lang w:eastAsia="es-EC"/>
+        </w:rPr>
+      </w:pPr>
+    </w:p>
+    <w:p>
+      <w:pPr>
+        <w:pStyle w:val="Sinespaciado"/>
+        <w:spacing w:line="360" w:lineRule="auto"/>
+        <w:jc w:val="both"/>
+        <w:rPr>
+          <w:rFonts w:ascii="Times New Roman" w:hAnsi="Times New Roman" w:cs="Times New Roman"/>
+          <w:lang w:eastAsia="es-EC"/>
+        </w:rPr>
+      </w:pPr>
+    </w:p>
+    <w:p>
+      <w:pPr>
+        <w:pStyle w:val="Sinespaciado"/>
+        <w:spacing w:line="360" w:lineRule="auto"/>
+        <w:jc w:val="both"/>
+        <w:rPr>
+          <w:rFonts w:ascii="Times New Roman" w:hAnsi="Times New Roman" w:cs="Times New Roman"/>
+          <w:b/>
+          <w:bCs/>
+          <w:lang w:eastAsia="es-EC"/>
+        </w:rPr>
+      </w:pPr>
+    </w:p>
+    <w:p>
+      <w:pPr>
+        <w:rPr>
+          <w:rFonts w:ascii="Times New Roman" w:hAnsi="Times New Roman" w:cs="Times New Roman"/>
+          <w:b/>
+          <w:bCs/>
+          <w:lang w:eastAsia="es-EC"/>
+        </w:rPr>
+      </w:pPr>
+      <w:r>
+        <w:rPr>
           <w:rFonts w:ascii="Arial" w:hAnsi="Arial" w:cs="Arial"/>
           <w:b/>
           <w:bCs/>
           <w:lang w:eastAsia="es-EC"/>
         </w:rPr>
-      </w:pPr>
-      <w:r>
+        <w:br w:type="page"/>
+      </w:r>
+      <w:r>
+        <w:rPr>
+          <w:rFonts w:ascii="Times New Roman" w:hAnsi="Times New Roman" w:cs="Times New Roman"/>
+          <w:b/>
+          <w:bCs/>
+          <w:lang w:eastAsia="es-EC"/>
+        </w:rPr>
+        <w:lastRenderedPageBreak/>
+        <w:t>2. OBJETIVOS</w:t>
+      </w:r>
+    </w:p>
+    <w:p>
+      <w:pPr>
+        <w:rPr>
+          <w:rFonts w:ascii="Times New Roman" w:hAnsi="Times New Roman" w:cs="Times New Roman"/>
+          <w:b/>
+          <w:bCs/>
+          <w:lang w:eastAsia="es-EC"/>
+        </w:rPr>
+      </w:pPr>
+      <w:r>
+        <w:rPr>
+          <w:rFonts w:ascii="Times New Roman" w:hAnsi="Times New Roman" w:cs="Times New Roman"/>
+          <w:b/>
+          <w:bCs/>
+          <w:lang w:eastAsia="es-EC"/>
+        </w:rPr>
+        <w:t>2.1 Objetivo general</w:t>
+      </w:r>
+    </w:p>
+    <w:p>
+      <w:pPr>
+        <w:rPr>
+          <w:rFonts w:ascii="Times New Roman" w:hAnsi="Times New Roman" w:cs="Times New Roman"/>
+          <w:lang w:eastAsia="es-EC"/>
+        </w:rPr>
+      </w:pPr>
+      <w:r>
+        <w:rPr>
+          <w:rFonts w:ascii="Times New Roman" w:hAnsi="Times New Roman" w:cs="Times New Roman"/>
+          <w:lang w:eastAsia="es-EC"/>
+        </w:rPr>
+        <w:t xml:space="preserve">Diseñar la arquitectura lógica de un Sistema de Control de Rescate y Adopción Animal mediante diagramas UML, patrones de diseño y una estructura de control de versiones basada en </w:t>
+      </w:r>
+      <w:proofErr w:type="spellStart"/>
+      <w:r>
+        <w:rPr>
+          <w:rFonts w:ascii="Times New Roman" w:hAnsi="Times New Roman" w:cs="Times New Roman"/>
+          <w:lang w:eastAsia="es-EC"/>
+        </w:rPr>
+        <w:t>Gitflow</w:t>
+      </w:r>
+      <w:proofErr w:type="spellEnd"/>
+      <w:r>
+        <w:rPr>
+          <w:rFonts w:ascii="Times New Roman" w:hAnsi="Times New Roman" w:cs="Times New Roman"/>
+          <w:lang w:eastAsia="es-EC"/>
+        </w:rPr>
+        <w:t>.</w:t>
+      </w:r>
+    </w:p>
+    <w:p>
+      <w:pPr>
+        <w:pStyle w:val="Prrafodelista"/>
+        <w:numPr>
+          <w:ilvl w:val="0"/>
+          <w:numId w:val="22"/>
+        </w:numPr>
+        <w:rPr>
+          <w:rFonts w:ascii="Times New Roman" w:hAnsi="Times New Roman" w:cs="Times New Roman"/>
+          <w:lang w:eastAsia="es-EC"/>
+        </w:rPr>
+      </w:pPr>
+      <w:r>
+        <w:rPr>
+          <w:rFonts w:ascii="Times New Roman" w:hAnsi="Times New Roman" w:cs="Times New Roman"/>
+          <w:lang w:eastAsia="es-EC"/>
+        </w:rPr>
+        <w:t>Identificar los principales actores y funcionalidades del Sistema de Control de Rescate y Adopción Animal.</w:t>
+      </w:r>
+    </w:p>
+    <w:p>
+      <w:pPr>
+        <w:pStyle w:val="Prrafodelista"/>
+        <w:numPr>
+          <w:ilvl w:val="0"/>
+          <w:numId w:val="22"/>
+        </w:numPr>
+        <w:rPr>
+          <w:rFonts w:ascii="Times New Roman" w:hAnsi="Times New Roman" w:cs="Times New Roman"/>
+          <w:lang w:eastAsia="es-EC"/>
+        </w:rPr>
+      </w:pPr>
+      <w:r>
+        <w:rPr>
+          <w:rFonts w:ascii="Times New Roman" w:hAnsi="Times New Roman" w:cs="Times New Roman"/>
+          <w:lang w:eastAsia="es-EC"/>
+        </w:rPr>
+        <w:t xml:space="preserve">  Representar mediante UML las clases y relaciones principales del sistema.</w:t>
+      </w:r>
+    </w:p>
+    <w:p>
+      <w:pPr>
+        <w:pStyle w:val="Prrafodelista"/>
+        <w:numPr>
+          <w:ilvl w:val="0"/>
+          <w:numId w:val="22"/>
+        </w:numPr>
+        <w:rPr>
+          <w:rFonts w:ascii="Times New Roman" w:hAnsi="Times New Roman" w:cs="Times New Roman"/>
+          <w:lang w:eastAsia="es-EC"/>
+        </w:rPr>
+      </w:pPr>
+      <w:r>
+        <w:rPr>
+          <w:rFonts w:ascii="Times New Roman" w:hAnsi="Times New Roman" w:cs="Times New Roman"/>
+          <w:lang w:eastAsia="es-EC"/>
+        </w:rPr>
+        <w:t xml:space="preserve">Aplicar los patrones de diseño Singleton, </w:t>
+      </w:r>
+      <w:proofErr w:type="spellStart"/>
+      <w:r>
+        <w:rPr>
+          <w:rFonts w:ascii="Times New Roman" w:hAnsi="Times New Roman" w:cs="Times New Roman"/>
+          <w:lang w:eastAsia="es-EC"/>
+        </w:rPr>
+        <w:t>Observer</w:t>
+      </w:r>
+      <w:proofErr w:type="spellEnd"/>
+      <w:r>
+        <w:rPr>
+          <w:rFonts w:ascii="Times New Roman" w:hAnsi="Times New Roman" w:cs="Times New Roman"/>
+          <w:lang w:eastAsia="es-EC"/>
+        </w:rPr>
+        <w:t xml:space="preserve"> y Factory dentro del diseño propuesto.</w:t>
+      </w:r>
+    </w:p>
+    <w:p>
+      <w:pPr>
+        <w:pStyle w:val="Prrafodelista"/>
+        <w:numPr>
+          <w:ilvl w:val="0"/>
+          <w:numId w:val="22"/>
+        </w:numPr>
+        <w:rPr>
+          <w:rFonts w:ascii="Times New Roman" w:hAnsi="Times New Roman" w:cs="Times New Roman"/>
+          <w:lang w:eastAsia="es-EC"/>
+        </w:rPr>
+      </w:pPr>
+      <w:r>
+        <w:rPr>
+          <w:rFonts w:ascii="Times New Roman" w:hAnsi="Times New Roman" w:cs="Times New Roman"/>
+          <w:lang w:eastAsia="es-EC"/>
+        </w:rPr>
+        <w:t>Representar la arquitectura general del sistema y su relación con el control de versiones.</w:t>
+      </w:r>
+    </w:p>
+    <w:p>
+      <w:pPr>
+        <w:pStyle w:val="Prrafodelista"/>
+        <w:numPr>
+          <w:ilvl w:val="0"/>
+          <w:numId w:val="22"/>
+        </w:numPr>
+        <w:rPr>
+          <w:rFonts w:ascii="Times New Roman" w:hAnsi="Times New Roman" w:cs="Times New Roman"/>
+          <w:lang w:eastAsia="es-EC"/>
+        </w:rPr>
+      </w:pPr>
+      <w:r>
+        <w:rPr>
+          <w:rFonts w:ascii="Times New Roman" w:hAnsi="Times New Roman" w:cs="Times New Roman"/>
+          <w:lang w:eastAsia="es-EC"/>
+        </w:rPr>
+        <w:t xml:space="preserve">  Configurar y utilizar Git y GitHub para registrar los avances del trabajo mediante </w:t>
+      </w:r>
+      <w:proofErr w:type="spellStart"/>
+      <w:r>
+        <w:rPr>
+          <w:rFonts w:ascii="Times New Roman" w:hAnsi="Times New Roman" w:cs="Times New Roman"/>
+          <w:lang w:eastAsia="es-EC"/>
+        </w:rPr>
+        <w:t>commits</w:t>
+      </w:r>
+      <w:proofErr w:type="spellEnd"/>
+      <w:r>
+        <w:rPr>
+          <w:rFonts w:ascii="Times New Roman" w:hAnsi="Times New Roman" w:cs="Times New Roman"/>
+          <w:lang w:eastAsia="es-EC"/>
+        </w:rPr>
+        <w:t>.</w:t>
+      </w:r>
+    </w:p>
+    <w:p>
+      <w:pPr>
+        <w:pStyle w:val="Prrafodelista"/>
+        <w:numPr>
+          <w:ilvl w:val="0"/>
+          <w:numId w:val="22"/>
+        </w:numPr>
+        <w:rPr>
+          <w:rFonts w:ascii="Times New Roman" w:hAnsi="Times New Roman" w:cs="Times New Roman"/>
+          <w:lang w:eastAsia="es-EC"/>
+        </w:rPr>
+      </w:pPr>
+      <w:r>
+        <w:rPr>
+          <w:rFonts w:ascii="Times New Roman" w:hAnsi="Times New Roman" w:cs="Times New Roman"/>
+          <w:lang w:eastAsia="es-EC"/>
+        </w:rPr>
+        <w:t xml:space="preserve">  Organizar el repositorio mediante una estructura de ramas basada en </w:t>
+      </w:r>
+      <w:proofErr w:type="spellStart"/>
+      <w:r>
+        <w:rPr>
+          <w:rFonts w:ascii="Times New Roman" w:hAnsi="Times New Roman" w:cs="Times New Roman"/>
+          <w:lang w:eastAsia="es-EC"/>
+        </w:rPr>
+        <w:t>Gitflow</w:t>
+      </w:r>
+      <w:proofErr w:type="spellEnd"/>
+      <w:r>
+        <w:rPr>
+          <w:rFonts w:ascii="Times New Roman" w:hAnsi="Times New Roman" w:cs="Times New Roman"/>
+          <w:lang w:eastAsia="es-EC"/>
+        </w:rPr>
+        <w:t>.</w:t>
+      </w:r>
+    </w:p>
+    <w:p>
+      <w:pPr>
+        <w:rPr>
+          <w:rFonts w:ascii="Times New Roman" w:hAnsi="Times New Roman" w:cs="Times New Roman"/>
+          <w:b/>
+          <w:bCs/>
+          <w:lang w:eastAsia="es-EC"/>
+        </w:rPr>
+      </w:pPr>
+      <w:r>
+        <w:rPr>
+          <w:rFonts w:ascii="Times New Roman" w:hAnsi="Times New Roman" w:cs="Times New Roman"/>
+          <w:b/>
+          <w:bCs/>
+          <w:lang w:eastAsia="es-EC"/>
+        </w:rPr>
+        <w:t>3. DESCRIPCIÓN DEL SISTEMA</w:t>
+      </w:r>
+    </w:p>
+    <w:p>
+      <w:pPr>
+        <w:rPr>
+          <w:rFonts w:ascii="Times New Roman" w:hAnsi="Times New Roman" w:cs="Times New Roman"/>
+          <w:lang w:eastAsia="es-EC"/>
+        </w:rPr>
+      </w:pPr>
+      <w:r>
+        <w:rPr>
+          <w:rFonts w:ascii="Times New Roman" w:hAnsi="Times New Roman" w:cs="Times New Roman"/>
+          <w:lang w:eastAsia="es-EC"/>
+        </w:rPr>
+        <w:t>El Sistema de Control de Rescate y Adopción Animal tiene como finalidad apoyar la gestión de animales que han sido rescatados y requieren atención, seguimiento y posteriormente un proceso de adopción.</w:t>
+      </w:r>
+    </w:p>
+    <w:p>
+      <w:pPr>
+        <w:rPr>
+          <w:rFonts w:ascii="Times New Roman" w:hAnsi="Times New Roman" w:cs="Times New Roman"/>
+          <w:lang w:eastAsia="es-EC"/>
+        </w:rPr>
+      </w:pPr>
+      <w:r>
+        <w:rPr>
+          <w:rFonts w:ascii="Times New Roman" w:hAnsi="Times New Roman" w:cs="Times New Roman"/>
+          <w:lang w:eastAsia="es-EC"/>
+        </w:rPr>
+        <w:t>Dentro del sistema se consideran animales como perros, gatos y otros animales que puedan ser registrados dentro del proceso de rescate</w:t>
+      </w:r>
+      <w:r>
+        <w:rPr>
+          <w:rFonts w:ascii="Times New Roman" w:hAnsi="Times New Roman" w:cs="Times New Roman"/>
+          <w:lang w:eastAsia="es-EC"/>
+        </w:rPr>
+        <w:t>, c</w:t>
+      </w:r>
+      <w:r>
+        <w:rPr>
+          <w:rFonts w:ascii="Times New Roman" w:hAnsi="Times New Roman" w:cs="Times New Roman"/>
+          <w:lang w:eastAsia="es-EC"/>
+        </w:rPr>
+        <w:t>ada animal puede encontrarse en diferentes estados, como Rescatado, En Tratamiento o Adopción, permitiendo realizar un seguimiento de su situación.</w:t>
+      </w:r>
+    </w:p>
+    <w:p>
+      <w:pPr>
+        <w:rPr>
+          <w:rFonts w:ascii="Times New Roman" w:hAnsi="Times New Roman" w:cs="Times New Roman"/>
+          <w:lang w:eastAsia="es-EC"/>
+        </w:rPr>
+      </w:pPr>
+      <w:r>
+        <w:rPr>
+          <w:rFonts w:ascii="Times New Roman" w:hAnsi="Times New Roman" w:cs="Times New Roman"/>
+          <w:lang w:eastAsia="es-EC"/>
+        </w:rPr>
+        <w:t>Además, el sistema contempla la participación de voluntarios y veterinarios. Los voluntarios pueden colaborar en actividades relacionadas con el rescate y seguimiento, mientras que los veterinarios pueden registrar y gestionar información relacionada con la atención de los animales.</w:t>
+      </w:r>
+    </w:p>
+    <w:p>
+      <w:pPr>
+        <w:rPr>
+          <w:rFonts w:ascii="Times New Roman" w:hAnsi="Times New Roman" w:cs="Times New Roman"/>
+          <w:lang w:eastAsia="es-EC"/>
+        </w:rPr>
+      </w:pPr>
+      <w:r>
+        <w:rPr>
+          <w:rFonts w:ascii="Times New Roman" w:hAnsi="Times New Roman" w:cs="Times New Roman"/>
+          <w:lang w:eastAsia="es-EC"/>
+        </w:rPr>
+        <w:t>El diseño propuesto busca organizar estas funcionalidades mediante clases, relaciones y patrones de diseño, dejando establecida una base lógica para una futura implementación del sistema.</w:t>
+      </w:r>
+    </w:p>
+    <w:p>
+      <w:pPr>
+        <w:rPr>
+          <w:rFonts w:ascii="Times New Roman" w:hAnsi="Times New Roman" w:cs="Times New Roman"/>
+          <w:b/>
+          <w:bCs/>
+          <w:lang w:eastAsia="es-EC"/>
+        </w:rPr>
+      </w:pPr>
+      <w:r>
+        <w:rPr>
+          <w:rFonts w:ascii="Times New Roman" w:hAnsi="Times New Roman" w:cs="Times New Roman"/>
+          <w:b/>
+          <w:bCs/>
+          <w:lang w:eastAsia="es-EC"/>
+        </w:rPr>
+        <w:t>4. DIAGRAMA DE CASOS DE USO</w:t>
+      </w:r>
+    </w:p>
+    <w:p>
+      <w:pPr>
+        <w:rPr>
+          <w:rFonts w:ascii="Times New Roman" w:hAnsi="Times New Roman" w:cs="Times New Roman"/>
+          <w:lang w:eastAsia="es-EC"/>
+        </w:rPr>
+      </w:pPr>
+      <w:r>
+        <w:rPr>
+          <w:rFonts w:ascii="Times New Roman" w:hAnsi="Times New Roman" w:cs="Times New Roman"/>
+          <w:lang w:eastAsia="es-EC"/>
+        </w:rPr>
+        <w:t>El diagrama de casos de uso permite identificar los principales actores que interactúan con el Sistema de Control de Rescate y Adopción Animal y las funciones que pueden realizar dentro del sistema.</w:t>
+      </w:r>
+    </w:p>
+    <w:p>
+      <w:pPr>
+        <w:rPr>
+          <w:rFonts w:ascii="Times New Roman" w:hAnsi="Times New Roman" w:cs="Times New Roman"/>
+          <w:lang w:eastAsia="es-EC"/>
+        </w:rPr>
+      </w:pPr>
+      <w:r>
+        <w:rPr>
+          <w:rFonts w:ascii="Times New Roman" w:hAnsi="Times New Roman" w:cs="Times New Roman"/>
+          <w:lang w:eastAsia="es-EC"/>
+        </w:rPr>
+        <w:t>En este diagrama se representan las interacciones entre los usuarios y las funcionalidades relacionadas con el registro, rescate, atención y adopción de los animales.</w:t>
+      </w:r>
+    </w:p>
+    <w:p>
+      <w:pPr>
+        <w:rPr>
+          <w:rFonts w:ascii="Times New Roman" w:hAnsi="Times New Roman" w:cs="Times New Roman"/>
+          <w:lang w:eastAsia="es-EC"/>
+        </w:rPr>
+      </w:pPr>
+      <w:r>
+        <w:rPr>
+          <w:noProof/>
+        </w:rPr>
+        <w:lastRenderedPageBreak/>
+        <w:drawing>
+          <wp:inline distT="0" distB="0" distL="0" distR="0" wp14:anchorId="4706287D" wp14:editId="2EA5AE4D">
+            <wp:extent cx="5514063" cy="3962400"/>
+            <wp:effectExtent l="0" t="0" r="0" b="0"/>
+            <wp:docPr id="295975701" name="Imagen 2"/>
+            <wp:cNvGraphicFramePr>
+              <a:graphicFrameLocks xmlns:a="http://schemas.openxmlformats.org/drawingml/2006/main" noChangeAspect="1"/>
+            </wp:cNvGraphicFramePr>
+            <a:graphic xmlns:a="http://schemas.openxmlformats.org/drawingml/2006/main">
+              <a:graphicData uri="http://schemas.openxmlformats.org/drawingml/2006/picture">
+                <pic:pic xmlns:pic="http://schemas.openxmlformats.org/drawingml/2006/picture">
+                  <pic:nvPicPr>
+                    <pic:cNvPr id="0" name="Picture 2"/>
+                    <pic:cNvPicPr>
+                      <a:picLocks noChangeAspect="1" noChangeArrowheads="1"/>
+                    </pic:cNvPicPr>
+                  </pic:nvPicPr>
+                  <pic:blipFill rotWithShape="1">
+                    <a:blip r:embed="rId14" cstate="print">
+                      <a:extLst>
+                        <a:ext uri="{28A0092B-C50C-407E-A947-70E740481C1C}">
+                          <a14:useLocalDpi xmlns:a14="http://schemas.microsoft.com/office/drawing/2010/main" val="0"/>
+                        </a:ext>
+                      </a:extLst>
+                    </a:blip>
+                    <a:srcRect r="29308" b="9699"/>
+                    <a:stretch>
+                      <a:fillRect/>
+                    </a:stretch>
+                  </pic:blipFill>
+                  <pic:spPr bwMode="auto">
+                    <a:xfrm>
+                      <a:off x="0" y="0"/>
+                      <a:ext cx="5525062" cy="3970304"/>
+                    </a:xfrm>
+                    <a:prstGeom prst="rect">
+                      <a:avLst/>
+                    </a:prstGeom>
+                    <a:noFill/>
+                    <a:ln>
+                      <a:noFill/>
+                    </a:ln>
+                    <a:extLst>
+                      <a:ext uri="{53640926-AAD7-44D8-BBD7-CCE9431645EC}">
+                        <a14:shadowObscured xmlns:a14="http://schemas.microsoft.com/office/drawing/2010/main"/>
+                      </a:ext>
+                    </a:extLst>
+                  </pic:spPr>
+                </pic:pic>
+              </a:graphicData>
+            </a:graphic>
+          </wp:inline>
+        </w:drawing>
+      </w:r>
+    </w:p>
+    <w:p>
+      <w:pPr>
+        <w:rPr>
+          <w:rFonts w:ascii="Times New Roman" w:hAnsi="Times New Roman" w:cs="Times New Roman"/>
+          <w:lang w:eastAsia="es-EC"/>
+        </w:rPr>
+      </w:pPr>
+      <w:r>
+        <w:rPr>
+          <w:rFonts w:ascii="Times New Roman" w:hAnsi="Times New Roman" w:cs="Times New Roman"/>
+          <w:lang w:eastAsia="es-EC"/>
+        </w:rPr>
+        <w:t>La representación permite observar de manera general cómo los diferentes actores participan en los procesos definidos para el sistema.</w:t>
+      </w:r>
+    </w:p>
+    <w:p>
+      <w:pPr>
+        <w:rPr>
+          <w:rFonts w:ascii="Times New Roman" w:hAnsi="Times New Roman" w:cs="Times New Roman"/>
+          <w:b/>
+          <w:bCs/>
+          <w:lang w:eastAsia="es-EC"/>
+        </w:rPr>
+      </w:pPr>
+      <w:r>
+        <w:rPr>
+          <w:rFonts w:ascii="Times New Roman" w:hAnsi="Times New Roman" w:cs="Times New Roman"/>
+          <w:b/>
+          <w:bCs/>
+          <w:lang w:eastAsia="es-EC"/>
+        </w:rPr>
+        <w:t>5. DIAGRAMA DE CLASES UML</w:t>
+      </w:r>
+    </w:p>
+    <w:p>
+      <w:pPr>
+        <w:rPr>
+          <w:rFonts w:ascii="Times New Roman" w:hAnsi="Times New Roman" w:cs="Times New Roman"/>
+          <w:lang w:eastAsia="es-EC"/>
+        </w:rPr>
+      </w:pPr>
+      <w:r>
+        <w:rPr>
+          <w:rFonts w:ascii="Times New Roman" w:hAnsi="Times New Roman" w:cs="Times New Roman"/>
+          <w:lang w:eastAsia="es-EC"/>
+        </w:rPr>
+        <w:t>El diagrama de clases representa la estructura estática propuesta para el sistema. En él se identifican las principales clases, atributos, métodos y relaciones necesarias para representar la información y comportamiento del sistema.</w:t>
+      </w:r>
+    </w:p>
+    <w:p>
+      <w:pPr>
+        <w:rPr>
+          <w:rFonts w:ascii="Times New Roman" w:hAnsi="Times New Roman" w:cs="Times New Roman"/>
+          <w:lang w:eastAsia="es-EC"/>
+        </w:rPr>
+      </w:pPr>
+      <w:r>
+        <w:rPr>
+          <w:rFonts w:ascii="Times New Roman" w:hAnsi="Times New Roman" w:cs="Times New Roman"/>
+          <w:lang w:eastAsia="es-EC"/>
+        </w:rPr>
+        <w:t>Las clases permiten organizar los diferentes elementos que intervienen en el proceso de rescate y adopción, estableciendo relaciones entre los animales, usuarios, voluntarios, veterinarios, adopciones y demás elementos considerados en el diseño.</w:t>
+      </w:r>
+    </w:p>
+    <w:p>
+      <w:pPr>
+        <w:rPr>
+          <w:rFonts w:ascii="Times New Roman" w:hAnsi="Times New Roman" w:cs="Times New Roman"/>
+          <w:lang w:eastAsia="es-EC"/>
+        </w:rPr>
+      </w:pPr>
+      <w:r>
+        <w:rPr>
+          <w:rFonts w:ascii="Times New Roman" w:hAnsi="Times New Roman" w:cs="Times New Roman"/>
+          <w:lang w:eastAsia="es-EC"/>
+        </w:rPr>
+        <w:t>La utilización del diagrama facilita la comprensión de cómo podrían organizarse los componentes del sistema antes de realizar una implementación.</w:t>
+      </w:r>
+    </w:p>
+    <w:p>
+      <w:pPr>
+        <w:rPr>
+          <w:rFonts w:ascii="Times New Roman" w:hAnsi="Times New Roman" w:cs="Times New Roman"/>
+          <w:b/>
+          <w:bCs/>
+          <w:lang w:eastAsia="es-EC"/>
+        </w:rPr>
+      </w:pPr>
+      <w:r>
+        <w:rPr>
+          <w:noProof/>
+        </w:rPr>
+        <w:lastRenderedPageBreak/>
+        <w:drawing>
+          <wp:inline distT="0" distB="0" distL="0" distR="0" wp14:anchorId="7DFF42A0" wp14:editId="6E03BCAD">
+            <wp:extent cx="5400040" cy="4073525"/>
+            <wp:effectExtent l="0" t="0" r="0" b="3175"/>
+            <wp:docPr id="150271291" name="Imagen 3"/>
+            <wp:cNvGraphicFramePr>
+              <a:graphicFrameLocks xmlns:a="http://schemas.openxmlformats.org/drawingml/2006/main" noChangeAspect="1"/>
+            </wp:cNvGraphicFramePr>
+            <a:graphic xmlns:a="http://schemas.openxmlformats.org/drawingml/2006/main">
+              <a:graphicData uri="http://schemas.openxmlformats.org/drawingml/2006/picture">
+                <pic:pic xmlns:pic="http://schemas.openxmlformats.org/drawingml/2006/picture">
+                  <pic:nvPicPr>
+                    <pic:cNvPr id="0" name="Picture 4"/>
+                    <pic:cNvPicPr>
+                      <a:picLocks noChangeAspect="1" noChangeArrowheads="1"/>
+                    </pic:cNvPicPr>
+                  </pic:nvPicPr>
+                  <pic:blipFill>
+                    <a:blip r:embed="rId15" cstate="print">
+                      <a:extLst>
+                        <a:ext uri="{28A0092B-C50C-407E-A947-70E740481C1C}">
+                          <a14:useLocalDpi xmlns:a14="http://schemas.microsoft.com/office/drawing/2010/main" val="0"/>
+                        </a:ext>
+                      </a:extLst>
+                    </a:blip>
+                    <a:srcRect/>
+                    <a:stretch>
+                      <a:fillRect/>
+                    </a:stretch>
+                  </pic:blipFill>
+                  <pic:spPr bwMode="auto">
+                    <a:xfrm>
+                      <a:off x="0" y="0"/>
+                      <a:ext cx="5400040" cy="4073525"/>
+                    </a:xfrm>
+                    <a:prstGeom prst="rect">
+                      <a:avLst/>
+                    </a:prstGeom>
+                    <a:noFill/>
+                    <a:ln>
+                      <a:noFill/>
+                    </a:ln>
+                  </pic:spPr>
+                </pic:pic>
+              </a:graphicData>
+            </a:graphic>
+          </wp:inline>
+        </w:drawing>
+      </w:r>
+    </w:p>
+    <w:p>
+      <w:pPr>
+        <w:rPr>
+          <w:rFonts w:ascii="Times New Roman" w:hAnsi="Times New Roman" w:cs="Times New Roman"/>
+          <w:b/>
+          <w:bCs/>
+          <w:lang w:eastAsia="es-EC"/>
+        </w:rPr>
+      </w:pPr>
+      <w:r>
+        <w:rPr>
+          <w:rFonts w:ascii="Times New Roman" w:hAnsi="Times New Roman" w:cs="Times New Roman"/>
+          <w:b/>
+          <w:bCs/>
+          <w:lang w:eastAsia="es-EC"/>
+        </w:rPr>
+        <w:t>6. APLICACIÓN DE PATRONES DE DISEÑO</w:t>
+      </w:r>
+    </w:p>
+    <w:p>
+      <w:pPr>
+        <w:rPr>
+          <w:rFonts w:ascii="Times New Roman" w:hAnsi="Times New Roman" w:cs="Times New Roman"/>
+          <w:lang w:eastAsia="es-EC"/>
+        </w:rPr>
+      </w:pPr>
+      <w:r>
+        <w:rPr>
+          <w:rFonts w:ascii="Times New Roman" w:hAnsi="Times New Roman" w:cs="Times New Roman"/>
+          <w:lang w:eastAsia="es-EC"/>
+        </w:rPr>
+        <w:t xml:space="preserve">Para el diseño del sistema se consideraron tres patrones de diseño: Singleton, </w:t>
+      </w:r>
+      <w:proofErr w:type="spellStart"/>
+      <w:r>
+        <w:rPr>
+          <w:rFonts w:ascii="Times New Roman" w:hAnsi="Times New Roman" w:cs="Times New Roman"/>
+          <w:lang w:eastAsia="es-EC"/>
+        </w:rPr>
+        <w:t>Observer</w:t>
+      </w:r>
+      <w:proofErr w:type="spellEnd"/>
+      <w:r>
+        <w:rPr>
+          <w:rFonts w:ascii="Times New Roman" w:hAnsi="Times New Roman" w:cs="Times New Roman"/>
+          <w:lang w:eastAsia="es-EC"/>
+        </w:rPr>
+        <w:t xml:space="preserve"> y Factory. Cada uno representa una alternativa para solucionar una necesidad específica dentro de la arquitectura propuesta.</w:t>
+      </w:r>
+    </w:p>
+    <w:p>
+      <w:pPr>
+        <w:rPr>
+          <w:rFonts w:ascii="Times New Roman" w:hAnsi="Times New Roman" w:cs="Times New Roman"/>
+          <w:b/>
+          <w:bCs/>
+          <w:lang w:eastAsia="es-EC"/>
+        </w:rPr>
+      </w:pPr>
+      <w:r>
+        <w:rPr>
+          <w:rFonts w:ascii="Times New Roman" w:hAnsi="Times New Roman" w:cs="Times New Roman"/>
+          <w:b/>
+          <w:bCs/>
+          <w:lang w:eastAsia="es-EC"/>
+        </w:rPr>
+        <w:t>6.1 Patrón Singleton</w:t>
+      </w:r>
+    </w:p>
+    <w:p>
+      <w:pPr>
+        <w:rPr>
+          <w:rFonts w:ascii="Times New Roman" w:hAnsi="Times New Roman" w:cs="Times New Roman"/>
+          <w:lang w:eastAsia="es-EC"/>
+        </w:rPr>
+      </w:pPr>
+      <w:r>
+        <w:rPr>
+          <w:rFonts w:ascii="Times New Roman" w:hAnsi="Times New Roman" w:cs="Times New Roman"/>
+          <w:lang w:eastAsia="es-EC"/>
+        </w:rPr>
+        <w:t>El patrón Singleton permite controlar la creación de una clase para que exista una única instancia de esta durante la ejecución del sistema.</w:t>
+      </w:r>
+    </w:p>
+    <w:p>
+      <w:pPr>
+        <w:rPr>
+          <w:rFonts w:ascii="Times New Roman" w:hAnsi="Times New Roman" w:cs="Times New Roman"/>
+          <w:lang w:eastAsia="es-EC"/>
+        </w:rPr>
+      </w:pPr>
+      <w:r>
+        <w:rPr>
+          <w:rFonts w:ascii="Times New Roman" w:hAnsi="Times New Roman" w:cs="Times New Roman"/>
+          <w:lang w:eastAsia="es-EC"/>
+        </w:rPr>
+        <w:t>Dentro del diseño propuesto puede utilizarse para representar un componente centralizado que requiera una única instancia, evitando crear múltiples objetos innecesarios del mismo componente.</w:t>
+      </w:r>
+    </w:p>
+    <w:p>
+      <w:pPr>
+        <w:rPr>
+          <w:rFonts w:ascii="Times New Roman" w:hAnsi="Times New Roman" w:cs="Times New Roman"/>
+          <w:lang w:eastAsia="es-EC"/>
+        </w:rPr>
+      </w:pPr>
+      <w:r>
+        <w:rPr>
+          <w:noProof/>
+        </w:rPr>
+        <w:drawing>
+          <wp:inline distT="0" distB="0" distL="0" distR="0" wp14:anchorId="62EF2DF1" wp14:editId="22381D38">
+            <wp:extent cx="4991100" cy="2204720"/>
+            <wp:effectExtent l="0" t="0" r="0" b="5080"/>
+            <wp:docPr id="1499597852" name="Imagen 4"/>
+            <wp:cNvGraphicFramePr>
+              <a:graphicFrameLocks xmlns:a="http://schemas.openxmlformats.org/drawingml/2006/main" noChangeAspect="1"/>
+            </wp:cNvGraphicFramePr>
+            <a:graphic xmlns:a="http://schemas.openxmlformats.org/drawingml/2006/main">
+              <a:graphicData uri="http://schemas.openxmlformats.org/drawingml/2006/picture">
+                <pic:pic xmlns:pic="http://schemas.openxmlformats.org/drawingml/2006/picture">
+                  <pic:nvPicPr>
+                    <pic:cNvPr id="0" name="Picture 6"/>
+                    <pic:cNvPicPr>
+                      <a:picLocks noChangeAspect="1" noChangeArrowheads="1"/>
+                    </pic:cNvPicPr>
+                  </pic:nvPicPr>
+                  <pic:blipFill rotWithShape="1">
+                    <a:blip r:embed="rId16" cstate="print">
+                      <a:extLst>
+                        <a:ext uri="{28A0092B-C50C-407E-A947-70E740481C1C}">
+                          <a14:useLocalDpi xmlns:a14="http://schemas.microsoft.com/office/drawing/2010/main" val="0"/>
+                        </a:ext>
+                      </a:extLst>
+                    </a:blip>
+                    <a:srcRect r="27893" b="33528"/>
+                    <a:stretch>
+                      <a:fillRect/>
+                    </a:stretch>
+                  </pic:blipFill>
+                  <pic:spPr bwMode="auto">
+                    <a:xfrm>
+                      <a:off x="0" y="0"/>
+                      <a:ext cx="4996263" cy="2207001"/>
+                    </a:xfrm>
+                    <a:prstGeom prst="rect">
+                      <a:avLst/>
+                    </a:prstGeom>
+                    <a:noFill/>
+                    <a:ln>
+                      <a:noFill/>
+                    </a:ln>
+                    <a:extLst>
+                      <a:ext uri="{53640926-AAD7-44D8-BBD7-CCE9431645EC}">
+                        <a14:shadowObscured xmlns:a14="http://schemas.microsoft.com/office/drawing/2010/main"/>
+                      </a:ext>
+                    </a:extLst>
+                  </pic:spPr>
+                </pic:pic>
+              </a:graphicData>
+            </a:graphic>
+          </wp:inline>
+        </w:drawing>
+      </w:r>
+    </w:p>
+    <w:p>
+      <w:pPr>
+        <w:rPr>
+          <w:rFonts w:ascii="Times New Roman" w:hAnsi="Times New Roman" w:cs="Times New Roman"/>
+          <w:lang w:eastAsia="es-EC"/>
+        </w:rPr>
+      </w:pPr>
+      <w:r>
+        <w:rPr>
+          <w:rFonts w:ascii="Times New Roman" w:hAnsi="Times New Roman" w:cs="Times New Roman"/>
+          <w:lang w:eastAsia="es-EC"/>
+        </w:rPr>
+        <w:lastRenderedPageBreak/>
+        <w:t>La representación permite observar cómo se plantea el uso de una instancia única dentro de la arquitectura propuesta</w:t>
+      </w:r>
+    </w:p>
+    <w:p>
+      <w:pPr>
+        <w:rPr>
+          <w:rFonts w:ascii="Times New Roman" w:hAnsi="Times New Roman" w:cs="Times New Roman"/>
+          <w:b/>
+          <w:bCs/>
+          <w:lang w:eastAsia="es-EC"/>
+        </w:rPr>
+      </w:pPr>
+      <w:r>
+        <w:rPr>
+          <w:rFonts w:ascii="Times New Roman" w:hAnsi="Times New Roman" w:cs="Times New Roman"/>
+          <w:b/>
+          <w:bCs/>
+          <w:lang w:eastAsia="es-EC"/>
+        </w:rPr>
+        <w:t xml:space="preserve">6.2 Patrón </w:t>
+      </w:r>
+      <w:proofErr w:type="spellStart"/>
+      <w:r>
+        <w:rPr>
+          <w:rFonts w:ascii="Times New Roman" w:hAnsi="Times New Roman" w:cs="Times New Roman"/>
+          <w:b/>
+          <w:bCs/>
+          <w:lang w:eastAsia="es-EC"/>
+        </w:rPr>
+        <w:t>Observer</w:t>
+      </w:r>
+      <w:proofErr w:type="spellEnd"/>
+    </w:p>
+    <w:p>
+      <w:pPr>
+        <w:rPr>
+          <w:rFonts w:ascii="Times New Roman" w:hAnsi="Times New Roman" w:cs="Times New Roman"/>
+          <w:lang w:eastAsia="es-EC"/>
+        </w:rPr>
+      </w:pPr>
+      <w:r>
+        <w:rPr>
+          <w:rFonts w:ascii="Times New Roman" w:hAnsi="Times New Roman" w:cs="Times New Roman"/>
+          <w:lang w:eastAsia="es-EC"/>
+        </w:rPr>
+        <w:t xml:space="preserve">El patrón </w:t>
+      </w:r>
+      <w:proofErr w:type="spellStart"/>
+      <w:r>
+        <w:rPr>
+          <w:rFonts w:ascii="Times New Roman" w:hAnsi="Times New Roman" w:cs="Times New Roman"/>
+          <w:lang w:eastAsia="es-EC"/>
+        </w:rPr>
+        <w:t>Observer</w:t>
+      </w:r>
+      <w:proofErr w:type="spellEnd"/>
+      <w:r>
+        <w:rPr>
+          <w:rFonts w:ascii="Times New Roman" w:hAnsi="Times New Roman" w:cs="Times New Roman"/>
+          <w:lang w:eastAsia="es-EC"/>
+        </w:rPr>
+        <w:t xml:space="preserve"> permite establecer una relación entre un objeto principal y otros objetos que necesitan recibir información cuando ocurre algún cambio.</w:t>
+      </w:r>
+    </w:p>
+    <w:p>
+      <w:pPr>
+        <w:rPr>
+          <w:rFonts w:ascii="Times New Roman" w:hAnsi="Times New Roman" w:cs="Times New Roman"/>
+          <w:lang w:eastAsia="es-EC"/>
+        </w:rPr>
+      </w:pPr>
+      <w:r>
+        <w:rPr>
+          <w:rFonts w:ascii="Times New Roman" w:hAnsi="Times New Roman" w:cs="Times New Roman"/>
+          <w:lang w:eastAsia="es-EC"/>
+        </w:rPr>
+        <w:t>En el sistema de rescate y adopción puede relacionarse con situaciones en las que sea necesario notificar a determinados usuarios o participantes sobre cambios en el estado o información de un animal.</w:t>
+      </w:r>
+    </w:p>
+    <w:p>
+      <w:pPr>
+        <w:rPr>
+          <w:rFonts w:ascii="Times New Roman" w:hAnsi="Times New Roman" w:cs="Times New Roman"/>
+          <w:lang w:eastAsia="es-EC"/>
+        </w:rPr>
+      </w:pPr>
+      <w:r>
+        <w:rPr>
+          <w:noProof/>
+        </w:rPr>
+        <w:drawing>
+          <wp:inline distT="0" distB="0" distL="0" distR="0" wp14:anchorId="12B75CC7" wp14:editId="3980EE06">
+            <wp:extent cx="4719234" cy="2585487"/>
+            <wp:effectExtent l="0" t="0" r="5715" b="5715"/>
+            <wp:docPr id="2142752960" name="Imagen 5"/>
+            <wp:cNvGraphicFramePr>
+              <a:graphicFrameLocks xmlns:a="http://schemas.openxmlformats.org/drawingml/2006/main" noChangeAspect="1"/>
+            </wp:cNvGraphicFramePr>
+            <a:graphic xmlns:a="http://schemas.openxmlformats.org/drawingml/2006/main">
+              <a:graphicData uri="http://schemas.openxmlformats.org/drawingml/2006/picture">
+                <pic:pic xmlns:pic="http://schemas.openxmlformats.org/drawingml/2006/picture">
+                  <pic:nvPicPr>
+                    <pic:cNvPr id="0" name="Picture 8"/>
+                    <pic:cNvPicPr>
+                      <a:picLocks noChangeAspect="1" noChangeArrowheads="1"/>
+                    </pic:cNvPicPr>
+                  </pic:nvPicPr>
+                  <pic:blipFill rotWithShape="1">
+                    <a:blip r:embed="rId17" cstate="print">
+                      <a:extLst>
+                        <a:ext uri="{28A0092B-C50C-407E-A947-70E740481C1C}">
+                          <a14:useLocalDpi xmlns:a14="http://schemas.microsoft.com/office/drawing/2010/main" val="0"/>
+                        </a:ext>
+                      </a:extLst>
+                    </a:blip>
+                    <a:srcRect r="30715" b="32525"/>
+                    <a:stretch>
+                      <a:fillRect/>
+                    </a:stretch>
+                  </pic:blipFill>
+                  <pic:spPr bwMode="auto">
+                    <a:xfrm>
+                      <a:off x="0" y="0"/>
+                      <a:ext cx="4725894" cy="2589136"/>
+                    </a:xfrm>
+                    <a:prstGeom prst="rect">
+                      <a:avLst/>
+                    </a:prstGeom>
+                    <a:noFill/>
+                    <a:ln>
+                      <a:noFill/>
+                    </a:ln>
+                    <a:extLst>
+                      <a:ext uri="{53640926-AAD7-44D8-BBD7-CCE9431645EC}">
+                        <a14:shadowObscured xmlns:a14="http://schemas.microsoft.com/office/drawing/2010/main"/>
+                      </a:ext>
+                    </a:extLst>
+                  </pic:spPr>
+                </pic:pic>
+              </a:graphicData>
+            </a:graphic>
+          </wp:inline>
+        </w:drawing>
+      </w:r>
+    </w:p>
+    <w:p>
+      <w:pPr>
+        <w:rPr>
+          <w:rFonts w:ascii="Times New Roman" w:hAnsi="Times New Roman" w:cs="Times New Roman"/>
+          <w:lang w:eastAsia="es-EC"/>
+        </w:rPr>
+      </w:pPr>
+      <w:r>
+        <w:rPr>
+          <w:rFonts w:ascii="Times New Roman" w:hAnsi="Times New Roman" w:cs="Times New Roman"/>
+          <w:lang w:eastAsia="es-EC"/>
+        </w:rPr>
+        <w:t>Este patrón permite plantear un mecanismo de notificación que evita que los componentes que reciben la información tengan que estar directamente acoplados al objeto que genera el cambio.</w:t>
+      </w:r>
+    </w:p>
+    <w:p>
+      <w:pPr>
+        <w:rPr>
+          <w:rFonts w:ascii="Times New Roman" w:hAnsi="Times New Roman" w:cs="Times New Roman"/>
+          <w:b/>
+          <w:bCs/>
+          <w:lang w:eastAsia="es-EC"/>
+        </w:rPr>
+      </w:pPr>
+      <w:r>
+        <w:rPr>
+          <w:rFonts w:ascii="Times New Roman" w:hAnsi="Times New Roman" w:cs="Times New Roman"/>
+          <w:b/>
+          <w:bCs/>
+          <w:lang w:eastAsia="es-EC"/>
+        </w:rPr>
+        <w:t>6.3 Patrón Factory</w:t>
+      </w:r>
+    </w:p>
+    <w:p>
+      <w:pPr>
+        <w:rPr>
+          <w:rFonts w:ascii="Times New Roman" w:hAnsi="Times New Roman" w:cs="Times New Roman"/>
+          <w:lang w:eastAsia="es-EC"/>
+        </w:rPr>
+      </w:pPr>
+      <w:r>
+        <w:rPr>
+          <w:rFonts w:ascii="Times New Roman" w:hAnsi="Times New Roman" w:cs="Times New Roman"/>
+          <w:lang w:eastAsia="es-EC"/>
+        </w:rPr>
+        <w:t>El patrón Factory permite centralizar la creación de diferentes objetos relacionados, evitando que el código que utiliza estos objetos tenga que encargarse directamente de su construcción.</w:t>
+      </w:r>
+    </w:p>
+    <w:p>
+      <w:pPr>
+        <w:rPr>
+          <w:rFonts w:ascii="Times New Roman" w:hAnsi="Times New Roman" w:cs="Times New Roman"/>
+          <w:lang w:eastAsia="es-EC"/>
+        </w:rPr>
+      </w:pPr>
+      <w:r>
+        <w:rPr>
+          <w:rFonts w:ascii="Times New Roman" w:hAnsi="Times New Roman" w:cs="Times New Roman"/>
+          <w:lang w:eastAsia="es-EC"/>
+        </w:rPr>
+        <w:t>En el sistema propuesto, este patrón puede utilizarse para organizar la creación de diferentes tipos de animales u objetos que compartan características comunes.</w:t>
+      </w:r>
+    </w:p>
+    <w:p>
+      <w:pPr>
+        <w:rPr>
+          <w:rFonts w:ascii="Times New Roman" w:hAnsi="Times New Roman" w:cs="Times New Roman"/>
+          <w:lang w:eastAsia="es-EC"/>
+        </w:rPr>
+      </w:pPr>
+      <w:r>
+        <w:rPr>
+          <w:noProof/>
+        </w:rPr>
+        <w:drawing>
+          <wp:inline distT="0" distB="0" distL="0" distR="0" wp14:anchorId="23DE5DC1" wp14:editId="6BCA01F2">
+            <wp:extent cx="5518889" cy="1929539"/>
+            <wp:effectExtent l="0" t="0" r="5715" b="0"/>
+            <wp:docPr id="624388325" name="Imagen 6"/>
+            <wp:cNvGraphicFramePr>
+              <a:graphicFrameLocks xmlns:a="http://schemas.openxmlformats.org/drawingml/2006/main" noChangeAspect="1"/>
+            </wp:cNvGraphicFramePr>
+            <a:graphic xmlns:a="http://schemas.openxmlformats.org/drawingml/2006/main">
+              <a:graphicData uri="http://schemas.openxmlformats.org/drawingml/2006/picture">
+                <pic:pic xmlns:pic="http://schemas.openxmlformats.org/drawingml/2006/picture">
+                  <pic:nvPicPr>
+                    <pic:cNvPr id="0" name="Picture 10"/>
+                    <pic:cNvPicPr>
+                      <a:picLocks noChangeAspect="1" noChangeArrowheads="1"/>
+                    </pic:cNvPicPr>
+                  </pic:nvPicPr>
+                  <pic:blipFill rotWithShape="1">
+                    <a:blip r:embed="rId18">
+                      <a:extLst>
+                        <a:ext uri="{28A0092B-C50C-407E-A947-70E740481C1C}">
+                          <a14:useLocalDpi xmlns:a14="http://schemas.microsoft.com/office/drawing/2010/main" val="0"/>
+                        </a:ext>
+                      </a:extLst>
+                    </a:blip>
+                    <a:srcRect t="34117" r="34707" b="26798"/>
+                    <a:stretch>
+                      <a:fillRect/>
+                    </a:stretch>
+                  </pic:blipFill>
+                  <pic:spPr bwMode="auto">
+                    <a:xfrm>
+                      <a:off x="0" y="0"/>
+                      <a:ext cx="5553774" cy="1941736"/>
+                    </a:xfrm>
+                    <a:prstGeom prst="rect">
+                      <a:avLst/>
+                    </a:prstGeom>
+                    <a:noFill/>
+                    <a:ln>
+                      <a:noFill/>
+                    </a:ln>
+                    <a:extLst>
+                      <a:ext uri="{53640926-AAD7-44D8-BBD7-CCE9431645EC}">
+                        <a14:shadowObscured xmlns:a14="http://schemas.microsoft.com/office/drawing/2010/main"/>
+                      </a:ext>
+                    </a:extLst>
+                  </pic:spPr>
+                </pic:pic>
+              </a:graphicData>
+            </a:graphic>
+          </wp:inline>
+        </w:drawing>
+      </w:r>
+    </w:p>
+    <w:p>
+      <w:pPr>
+        <w:rPr>
+          <w:rFonts w:ascii="Times New Roman" w:hAnsi="Times New Roman" w:cs="Times New Roman"/>
+          <w:lang w:eastAsia="es-EC"/>
+        </w:rPr>
+      </w:pPr>
+      <w:r>
+        <w:rPr>
+          <w:rFonts w:ascii="Times New Roman" w:hAnsi="Times New Roman" w:cs="Times New Roman"/>
+          <w:lang w:eastAsia="es-EC"/>
+        </w:rPr>
+        <w:t>El patrón permite organizar la creación de objetos y facilita que en el futuro puedan incorporarse nuevos tipos sin modificar excesivamente la estructura principal.</w:t>
+      </w:r>
+    </w:p>
+    <w:p>
+      <w:pPr>
+        <w:rPr>
+          <w:rFonts w:ascii="Times New Roman" w:hAnsi="Times New Roman" w:cs="Times New Roman"/>
+          <w:b/>
+          <w:bCs/>
+          <w:lang w:eastAsia="es-EC"/>
+        </w:rPr>
+      </w:pPr>
+      <w:r>
+        <w:rPr>
+          <w:rFonts w:ascii="Times New Roman" w:hAnsi="Times New Roman" w:cs="Times New Roman"/>
+          <w:b/>
+          <w:bCs/>
+          <w:lang w:eastAsia="es-EC"/>
+        </w:rPr>
+        <w:lastRenderedPageBreak/>
+        <w:t>7. ARQUITECTURA GENERAL DEL SISTEMA</w:t>
+      </w:r>
+    </w:p>
+    <w:p>
+      <w:pPr>
+        <w:rPr>
+          <w:rFonts w:ascii="Times New Roman" w:hAnsi="Times New Roman" w:cs="Times New Roman"/>
+          <w:lang w:eastAsia="es-EC"/>
+        </w:rPr>
+      </w:pPr>
+      <w:r>
+        <w:rPr>
+          <w:rFonts w:ascii="Times New Roman" w:hAnsi="Times New Roman" w:cs="Times New Roman"/>
+          <w:lang w:eastAsia="es-EC"/>
+        </w:rPr>
+        <w:t>La arquitectura general integra los elementos principales considerados durante el diseño del Sistema de Control de Rescate y Adopción Animal.</w:t>
+      </w:r>
+    </w:p>
+    <w:p>
+      <w:pPr>
+        <w:rPr>
+          <w:rFonts w:ascii="Times New Roman" w:hAnsi="Times New Roman" w:cs="Times New Roman"/>
+          <w:lang w:eastAsia="es-EC"/>
+        </w:rPr>
+      </w:pPr>
+      <w:r>
+        <w:rPr>
+          <w:rFonts w:ascii="Times New Roman" w:hAnsi="Times New Roman" w:cs="Times New Roman"/>
+          <w:lang w:eastAsia="es-EC"/>
+        </w:rPr>
+        <w:t>En esta representación se relacionan los componentes del sistema con el control de versiones mediante GitHub. De esta manera, además de plantear la estructura lógica de la solución, se considera una forma organizada de gestionar los avances del proyecto.</w:t>
+      </w:r>
+    </w:p>
+    <w:p>
+      <w:pPr>
+        <w:rPr>
+          <w:rFonts w:ascii="Times New Roman" w:hAnsi="Times New Roman" w:cs="Times New Roman"/>
+          <w:lang w:eastAsia="es-EC"/>
+        </w:rPr>
+      </w:pPr>
+      <w:r>
+        <w:rPr>
+          <w:rFonts w:ascii="Times New Roman" w:hAnsi="Times New Roman" w:cs="Times New Roman"/>
+          <w:lang w:eastAsia="es-EC"/>
+        </w:rPr>
+        <w:t>La utilización de Git y GitHub permite mantener un historial de modificaciones y trabajar mediante diferentes ramas de acuerdo con el flujo de trabajo establecido.</w:t>
+      </w:r>
+    </w:p>
+    <w:p>
+      <w:pPr>
+        <w:rPr>
+          <w:rFonts w:ascii="Times New Roman" w:hAnsi="Times New Roman" w:cs="Times New Roman"/>
+          <w:lang w:eastAsia="es-EC"/>
+        </w:rPr>
+      </w:pPr>
+      <w:r>
+        <w:rPr>
+          <w:noProof/>
+        </w:rPr>
+        <w:drawing>
+          <wp:inline distT="0" distB="0" distL="0" distR="0" wp14:anchorId="61621B36" wp14:editId="690969E8">
+            <wp:extent cx="6290077" cy="4145797"/>
+            <wp:effectExtent l="0" t="0" r="0" b="7620"/>
+            <wp:docPr id="617335067" name="Imagen 1"/>
+            <wp:cNvGraphicFramePr>
+              <a:graphicFrameLocks xmlns:a="http://schemas.openxmlformats.org/drawingml/2006/main" noChangeAspect="1"/>
+            </wp:cNvGraphicFramePr>
+            <a:graphic xmlns:a="http://schemas.openxmlformats.org/drawingml/2006/main">
+              <a:graphicData uri="http://schemas.openxmlformats.org/drawingml/2006/picture">
+                <pic:pic xmlns:pic="http://schemas.openxmlformats.org/drawingml/2006/picture">
+                  <pic:nvPicPr>
+                    <pic:cNvPr id="617335067" name=""/>
+                    <pic:cNvPicPr/>
+                  </pic:nvPicPr>
+                  <pic:blipFill rotWithShape="1">
+                    <a:blip r:embed="rId19"/>
+                    <a:srcRect l="22157" t="15042" r="18576" b="23474"/>
+                    <a:stretch>
+                      <a:fillRect/>
+                    </a:stretch>
+                  </pic:blipFill>
+                  <pic:spPr bwMode="auto">
+                    <a:xfrm>
+                      <a:off x="0" y="0"/>
+                      <a:ext cx="6330686" cy="4172562"/>
+                    </a:xfrm>
+                    <a:prstGeom prst="rect">
+                      <a:avLst/>
+                    </a:prstGeom>
+                    <a:ln>
+                      <a:noFill/>
+                    </a:ln>
+                    <a:extLst>
+                      <a:ext uri="{53640926-AAD7-44D8-BBD7-CCE9431645EC}">
+                        <a14:shadowObscured xmlns:a14="http://schemas.microsoft.com/office/drawing/2010/main"/>
+                      </a:ext>
+                    </a:extLst>
+                  </pic:spPr>
+                </pic:pic>
+              </a:graphicData>
+            </a:graphic>
+          </wp:inline>
+        </w:drawing>
+      </w:r>
+    </w:p>
+    <w:p>
+      <w:pPr>
+        <w:rPr>
+          <w:rFonts w:ascii="Times New Roman" w:hAnsi="Times New Roman" w:cs="Times New Roman"/>
+          <w:lang w:eastAsia="es-EC"/>
+        </w:rPr>
+      </w:pPr>
+      <w:r>
+        <w:rPr>
+          <w:rFonts w:ascii="Times New Roman" w:hAnsi="Times New Roman" w:cs="Times New Roman"/>
+          <w:lang w:eastAsia="es-EC"/>
+        </w:rPr>
+        <w:t>La arquitectura propuesta representa de manera general cómo se relacionan los componentes del sistema y el mecanismo utilizado para gestionar las diferentes versiones del proyecto.</w:t>
+      </w:r>
+    </w:p>
+    <w:p>
+      <w:pPr>
+        <w:rPr>
+          <w:rFonts w:ascii="Times New Roman" w:hAnsi="Times New Roman" w:cs="Times New Roman"/>
+          <w:b/>
+          <w:bCs/>
+          <w:lang w:eastAsia="es-EC"/>
+        </w:rPr>
+      </w:pPr>
+      <w:r>
+        <w:rPr>
+          <w:rFonts w:ascii="Times New Roman" w:hAnsi="Times New Roman" w:cs="Times New Roman"/>
+          <w:b/>
+          <w:bCs/>
+          <w:lang w:eastAsia="es-EC"/>
+        </w:rPr>
+        <w:t>8. CONTROL DE VERSIONES CON GIT Y GITHUB</w:t>
+      </w:r>
+    </w:p>
+    <w:p>
+      <w:pPr>
+        <w:rPr>
+          <w:rFonts w:ascii="Times New Roman" w:hAnsi="Times New Roman" w:cs="Times New Roman"/>
+          <w:lang w:eastAsia="es-EC"/>
+        </w:rPr>
+      </w:pPr>
+      <w:r>
+        <w:rPr>
+          <w:rFonts w:ascii="Times New Roman" w:hAnsi="Times New Roman" w:cs="Times New Roman"/>
+          <w:lang w:eastAsia="es-EC"/>
+        </w:rPr>
+        <w:t>Para el control de versiones del proyecto se utilizó Git como sistema de control de versiones y GitHub como plataforma para almacenar y gestionar el repositorio remoto.</w:t>
+      </w:r>
+    </w:p>
+    <w:p>
+      <w:pPr>
+        <w:rPr>
+          <w:rFonts w:ascii="Times New Roman" w:hAnsi="Times New Roman" w:cs="Times New Roman"/>
+          <w:lang w:eastAsia="es-EC"/>
+        </w:rPr>
+      </w:pPr>
+      <w:r>
+        <w:rPr>
+          <w:rFonts w:ascii="Times New Roman" w:hAnsi="Times New Roman" w:cs="Times New Roman"/>
+          <w:lang w:eastAsia="es-EC"/>
+        </w:rPr>
+        <w:t>El repositorio utilizado corresponde al proyecto Sistema de Control de Rescate y Adopción Animal y se configuró como un repositorio público.</w:t>
+      </w:r>
+    </w:p>
+    <w:p>
+      <w:pPr>
+        <w:rPr>
+          <w:rFonts w:ascii="Times New Roman" w:hAnsi="Times New Roman" w:cs="Times New Roman"/>
+          <w:lang w:eastAsia="es-EC"/>
+        </w:rPr>
+      </w:pPr>
+      <w:r>
+        <w:rPr>
+          <w:rFonts w:ascii="Times New Roman" w:hAnsi="Times New Roman" w:cs="Times New Roman"/>
+          <w:lang w:eastAsia="es-EC"/>
+        </w:rPr>
+        <w:t xml:space="preserve">La estructura de ramas utilizada se basa en </w:t>
+      </w:r>
+      <w:proofErr w:type="spellStart"/>
+      <w:r>
+        <w:rPr>
+          <w:rFonts w:ascii="Times New Roman" w:hAnsi="Times New Roman" w:cs="Times New Roman"/>
+          <w:lang w:eastAsia="es-EC"/>
+        </w:rPr>
+        <w:t>Gitflow</w:t>
+      </w:r>
+      <w:proofErr w:type="spellEnd"/>
+      <w:r>
+        <w:rPr>
+          <w:rFonts w:ascii="Times New Roman" w:hAnsi="Times New Roman" w:cs="Times New Roman"/>
+          <w:lang w:eastAsia="es-EC"/>
+        </w:rPr>
+        <w:t>, considerando las siguientes ramas:</w:t>
+      </w:r>
+    </w:p>
+    <w:p>
+      <w:pPr>
+        <w:numPr>
+          <w:ilvl w:val="0"/>
+          <w:numId w:val="23"/>
+        </w:numPr>
+        <w:rPr>
+          <w:rFonts w:ascii="Times New Roman" w:hAnsi="Times New Roman" w:cs="Times New Roman"/>
+          <w:lang w:eastAsia="es-EC"/>
+        </w:rPr>
+      </w:pPr>
+      <w:proofErr w:type="gramStart"/>
+      <w:r>
+        <w:rPr>
+          <w:rFonts w:ascii="Times New Roman" w:hAnsi="Times New Roman" w:cs="Times New Roman"/>
+          <w:lang w:eastAsia="es-EC"/>
+        </w:rPr>
+        <w:t>master</w:t>
+      </w:r>
+      <w:proofErr w:type="gramEnd"/>
+      <w:r>
+        <w:rPr>
+          <w:rFonts w:ascii="Times New Roman" w:hAnsi="Times New Roman" w:cs="Times New Roman"/>
+          <w:lang w:eastAsia="es-EC"/>
+        </w:rPr>
+        <w:t>: rama principal que representa la versión estable del proyecto.</w:t>
+      </w:r>
+    </w:p>
+    <w:p>
+      <w:pPr>
+        <w:numPr>
+          <w:ilvl w:val="0"/>
+          <w:numId w:val="23"/>
+        </w:numPr>
+        <w:rPr>
+          <w:rFonts w:ascii="Times New Roman" w:hAnsi="Times New Roman" w:cs="Times New Roman"/>
+          <w:lang w:eastAsia="es-EC"/>
+        </w:rPr>
+      </w:pPr>
+      <w:proofErr w:type="spellStart"/>
+      <w:r>
+        <w:rPr>
+          <w:rFonts w:ascii="Times New Roman" w:hAnsi="Times New Roman" w:cs="Times New Roman"/>
+          <w:lang w:eastAsia="es-EC"/>
+        </w:rPr>
+        <w:t>develop</w:t>
+      </w:r>
+      <w:proofErr w:type="spellEnd"/>
+      <w:r>
+        <w:rPr>
+          <w:rFonts w:ascii="Times New Roman" w:hAnsi="Times New Roman" w:cs="Times New Roman"/>
+          <w:lang w:eastAsia="es-EC"/>
+        </w:rPr>
+        <w:t>: rama destinada a integrar los avances del desarrollo.</w:t>
+      </w:r>
+    </w:p>
+    <w:p>
+      <w:pPr>
+        <w:numPr>
+          <w:ilvl w:val="0"/>
+          <w:numId w:val="23"/>
+        </w:numPr>
+        <w:rPr>
+          <w:rFonts w:ascii="Times New Roman" w:hAnsi="Times New Roman" w:cs="Times New Roman"/>
+          <w:lang w:eastAsia="es-EC"/>
+        </w:rPr>
+      </w:pPr>
+      <w:proofErr w:type="spellStart"/>
+      <w:r>
+        <w:rPr>
+          <w:rFonts w:ascii="Times New Roman" w:hAnsi="Times New Roman" w:cs="Times New Roman"/>
+          <w:lang w:eastAsia="es-EC"/>
+        </w:rPr>
+        <w:lastRenderedPageBreak/>
+        <w:t>feature</w:t>
+      </w:r>
+      <w:proofErr w:type="spellEnd"/>
+      <w:r>
+        <w:rPr>
+          <w:rFonts w:ascii="Times New Roman" w:hAnsi="Times New Roman" w:cs="Times New Roman"/>
+          <w:lang w:eastAsia="es-EC"/>
+        </w:rPr>
+        <w:t>/</w:t>
+      </w:r>
+      <w:proofErr w:type="spellStart"/>
+      <w:r>
+        <w:rPr>
+          <w:rFonts w:ascii="Times New Roman" w:hAnsi="Times New Roman" w:cs="Times New Roman"/>
+          <w:lang w:eastAsia="es-EC"/>
+        </w:rPr>
+        <w:t>gestion</w:t>
+      </w:r>
+      <w:proofErr w:type="spellEnd"/>
+      <w:r>
+        <w:rPr>
+          <w:rFonts w:ascii="Times New Roman" w:hAnsi="Times New Roman" w:cs="Times New Roman"/>
+          <w:lang w:eastAsia="es-EC"/>
+        </w:rPr>
+        <w:t>-rescates: rama destinada a los avances relacionados con la gestión de rescates.</w:t>
+      </w:r>
+    </w:p>
+    <w:p>
+      <w:pPr>
+        <w:numPr>
+          <w:ilvl w:val="0"/>
+          <w:numId w:val="23"/>
+        </w:numPr>
+        <w:rPr>
+          <w:rFonts w:ascii="Times New Roman" w:hAnsi="Times New Roman" w:cs="Times New Roman"/>
+          <w:lang w:eastAsia="es-EC"/>
+        </w:rPr>
+      </w:pPr>
+      <w:proofErr w:type="spellStart"/>
+      <w:r>
+        <w:rPr>
+          <w:rFonts w:ascii="Times New Roman" w:hAnsi="Times New Roman" w:cs="Times New Roman"/>
+          <w:lang w:eastAsia="es-EC"/>
+        </w:rPr>
+        <w:t>feature</w:t>
+      </w:r>
+      <w:proofErr w:type="spellEnd"/>
+      <w:r>
+        <w:rPr>
+          <w:rFonts w:ascii="Times New Roman" w:hAnsi="Times New Roman" w:cs="Times New Roman"/>
+          <w:lang w:eastAsia="es-EC"/>
+        </w:rPr>
+        <w:t>/</w:t>
+      </w:r>
+      <w:proofErr w:type="spellStart"/>
+      <w:r>
+        <w:rPr>
+          <w:rFonts w:ascii="Times New Roman" w:hAnsi="Times New Roman" w:cs="Times New Roman"/>
+          <w:lang w:eastAsia="es-EC"/>
+        </w:rPr>
+        <w:t>gestion</w:t>
+      </w:r>
+      <w:proofErr w:type="spellEnd"/>
+      <w:r>
+        <w:rPr>
+          <w:rFonts w:ascii="Times New Roman" w:hAnsi="Times New Roman" w:cs="Times New Roman"/>
+          <w:lang w:eastAsia="es-EC"/>
+        </w:rPr>
+        <w:t>-adopciones: rama destinada a los avances relacionados con la gestión de adopciones.</w:t>
+      </w:r>
+    </w:p>
+    <w:p>
+      <w:pPr>
+        <w:ind w:left="360"/>
+        <w:rPr>
+          <w:rFonts w:ascii="Times New Roman" w:hAnsi="Times New Roman" w:cs="Times New Roman"/>
+          <w:lang w:eastAsia="es-EC"/>
+        </w:rPr>
+      </w:pPr>
+      <w:r>
+        <w:rPr>
+          <w:noProof/>
+        </w:rPr>
+        <w:drawing>
+          <wp:inline distT="0" distB="0" distL="0" distR="0" wp14:anchorId="59D77A97" wp14:editId="6B2BB7D1">
+            <wp:extent cx="5462474" cy="3107410"/>
+            <wp:effectExtent l="0" t="0" r="5080" b="0"/>
+            <wp:docPr id="406143512" name="Imagen 7"/>
+            <wp:cNvGraphicFramePr>
+              <a:graphicFrameLocks xmlns:a="http://schemas.openxmlformats.org/drawingml/2006/main" noChangeAspect="1"/>
+            </wp:cNvGraphicFramePr>
+            <a:graphic xmlns:a="http://schemas.openxmlformats.org/drawingml/2006/main">
+              <a:graphicData uri="http://schemas.openxmlformats.org/drawingml/2006/picture">
+                <pic:pic xmlns:pic="http://schemas.openxmlformats.org/drawingml/2006/picture">
+                  <pic:nvPicPr>
+                    <pic:cNvPr id="0" name="Picture 20"/>
+                    <pic:cNvPicPr>
+                      <a:picLocks noChangeAspect="1" noChangeArrowheads="1"/>
+                    </pic:cNvPicPr>
+                  </pic:nvPicPr>
+                  <pic:blipFill rotWithShape="1">
+                    <a:blip r:embed="rId20" cstate="print">
+                      <a:extLst>
+                        <a:ext uri="{28A0092B-C50C-407E-A947-70E740481C1C}">
+                          <a14:useLocalDpi xmlns:a14="http://schemas.microsoft.com/office/drawing/2010/main" val="0"/>
+                        </a:ext>
+                      </a:extLst>
+                    </a:blip>
+                    <a:srcRect l="-144" t="8927" r="15873" b="5875"/>
+                    <a:stretch>
+                      <a:fillRect/>
+                    </a:stretch>
+                  </pic:blipFill>
+                  <pic:spPr bwMode="auto">
+                    <a:xfrm>
+                      <a:off x="0" y="0"/>
+                      <a:ext cx="5482161" cy="3118609"/>
+                    </a:xfrm>
+                    <a:prstGeom prst="rect">
+                      <a:avLst/>
+                    </a:prstGeom>
+                    <a:noFill/>
+                    <a:ln>
+                      <a:noFill/>
+                    </a:ln>
+                    <a:extLst>
+                      <a:ext uri="{53640926-AAD7-44D8-BBD7-CCE9431645EC}">
+                        <a14:shadowObscured xmlns:a14="http://schemas.microsoft.com/office/drawing/2010/main"/>
+                      </a:ext>
+                    </a:extLst>
+                  </pic:spPr>
+                </pic:pic>
+              </a:graphicData>
+            </a:graphic>
+          </wp:inline>
+        </w:drawing>
+      </w:r>
+    </w:p>
+    <w:p>
+      <w:pPr>
+        <w:rPr>
+          <w:rFonts w:ascii="Times New Roman" w:hAnsi="Times New Roman" w:cs="Times New Roman"/>
+          <w:lang w:eastAsia="es-EC"/>
+        </w:rPr>
+      </w:pPr>
+      <w:r>
+        <w:rPr>
+          <w:rFonts w:ascii="Times New Roman" w:hAnsi="Times New Roman" w:cs="Times New Roman"/>
+          <w:lang w:eastAsia="es-EC"/>
+        </w:rPr>
+        <w:t>Esta estructura permite separar los diferentes tipos de avances y mantener organizada la evolución del proyecto.</w:t>
+      </w:r>
+    </w:p>
+    <w:p>
+      <w:pPr>
+        <w:rPr>
+          <w:rFonts w:ascii="Times New Roman" w:hAnsi="Times New Roman" w:cs="Times New Roman"/>
+          <w:b/>
+          <w:bCs/>
+          <w:lang w:eastAsia="es-EC"/>
+        </w:rPr>
+      </w:pPr>
+      <w:r>
+        <w:rPr>
+          <w:rFonts w:ascii="Times New Roman" w:hAnsi="Times New Roman" w:cs="Times New Roman"/>
+          <w:b/>
+          <w:bCs/>
+          <w:lang w:eastAsia="es-EC"/>
+        </w:rPr>
+        <w:t xml:space="preserve">Aunque las ramas de </w:t>
+      </w:r>
+      <w:proofErr w:type="spellStart"/>
+      <w:r>
+        <w:rPr>
+          <w:rFonts w:ascii="Times New Roman" w:hAnsi="Times New Roman" w:cs="Times New Roman"/>
+          <w:b/>
+          <w:bCs/>
+          <w:lang w:eastAsia="es-EC"/>
+        </w:rPr>
+        <w:t>Gitflow</w:t>
+      </w:r>
+      <w:proofErr w:type="spellEnd"/>
+      <w:r>
+        <w:rPr>
+          <w:rFonts w:ascii="Times New Roman" w:hAnsi="Times New Roman" w:cs="Times New Roman"/>
+          <w:b/>
+          <w:bCs/>
+          <w:lang w:eastAsia="es-EC"/>
+        </w:rPr>
+        <w:t xml:space="preserve"> también pueden crearse y administrarse mediante Git Bash, para este proyecto se realizó la creación inicial de las ramas directamente desde GitHub, utilizando el repositorio del sistema. Posteriormente, Git Bash se utilizó para trabajar con el repositorio local y registrar los avances mediante </w:t>
+      </w:r>
+      <w:proofErr w:type="spellStart"/>
+      <w:r>
+        <w:rPr>
+          <w:rFonts w:ascii="Times New Roman" w:hAnsi="Times New Roman" w:cs="Times New Roman"/>
+          <w:b/>
+          <w:bCs/>
+          <w:lang w:eastAsia="es-EC"/>
+        </w:rPr>
+        <w:t>commits</w:t>
+      </w:r>
+      <w:proofErr w:type="spellEnd"/>
+      <w:r>
+        <w:rPr>
+          <w:rFonts w:ascii="Times New Roman" w:hAnsi="Times New Roman" w:cs="Times New Roman"/>
+          <w:b/>
+          <w:bCs/>
+          <w:lang w:eastAsia="es-EC"/>
+        </w:rPr>
+        <w:t>.</w:t>
+      </w:r>
+    </w:p>
+    <w:p>
+      <w:pPr>
+        <w:rPr>
+          <w:rFonts w:ascii="Times New Roman" w:hAnsi="Times New Roman" w:cs="Times New Roman"/>
+          <w:b/>
+          <w:bCs/>
+          <w:lang w:eastAsia="es-EC"/>
+        </w:rPr>
+      </w:pPr>
+      <w:r>
+        <w:rPr>
+          <w:rFonts w:ascii="Times New Roman" w:hAnsi="Times New Roman" w:cs="Times New Roman"/>
+          <w:b/>
+          <w:bCs/>
+          <w:lang w:eastAsia="es-EC"/>
+        </w:rPr>
+        <w:t>9. REGISTRO DE AVANCES MEDIANTE COMMITS</w:t>
+      </w:r>
+    </w:p>
+    <w:p>
+      <w:pPr>
+        <w:rPr>
+          <w:rFonts w:ascii="Times New Roman" w:hAnsi="Times New Roman" w:cs="Times New Roman"/>
+          <w:lang w:eastAsia="es-EC"/>
+        </w:rPr>
+      </w:pPr>
+      <w:r>
+        <w:rPr>
+          <w:rFonts w:ascii="Times New Roman" w:hAnsi="Times New Roman" w:cs="Times New Roman"/>
+          <w:lang w:eastAsia="es-EC"/>
+        </w:rPr>
+        <w:t xml:space="preserve">El trabajo se desarrollará mediante </w:t>
+      </w:r>
+      <w:proofErr w:type="spellStart"/>
+      <w:r>
+        <w:rPr>
+          <w:rFonts w:ascii="Times New Roman" w:hAnsi="Times New Roman" w:cs="Times New Roman"/>
+          <w:lang w:eastAsia="es-EC"/>
+        </w:rPr>
+        <w:t>commits</w:t>
+      </w:r>
+      <w:proofErr w:type="spellEnd"/>
+      <w:r>
+        <w:rPr>
+          <w:rFonts w:ascii="Times New Roman" w:hAnsi="Times New Roman" w:cs="Times New Roman"/>
+          <w:lang w:eastAsia="es-EC"/>
+        </w:rPr>
+        <w:t xml:space="preserve"> realizados desde Git Bash y posteriormente enviados al repositorio remoto de GitHub mediante </w:t>
+      </w:r>
+      <w:proofErr w:type="spellStart"/>
+      <w:r>
+        <w:rPr>
+          <w:rFonts w:ascii="Times New Roman" w:hAnsi="Times New Roman" w:cs="Times New Roman"/>
+          <w:lang w:eastAsia="es-EC"/>
+        </w:rPr>
+        <w:t>git</w:t>
+      </w:r>
+      <w:proofErr w:type="spellEnd"/>
+      <w:r>
+        <w:rPr>
+          <w:rFonts w:ascii="Times New Roman" w:hAnsi="Times New Roman" w:cs="Times New Roman"/>
+          <w:lang w:eastAsia="es-EC"/>
+        </w:rPr>
+        <w:t xml:space="preserve"> </w:t>
+      </w:r>
+      <w:proofErr w:type="spellStart"/>
+      <w:r>
+        <w:rPr>
+          <w:rFonts w:ascii="Times New Roman" w:hAnsi="Times New Roman" w:cs="Times New Roman"/>
+          <w:lang w:eastAsia="es-EC"/>
+        </w:rPr>
+        <w:t>push</w:t>
+      </w:r>
+      <w:proofErr w:type="spellEnd"/>
+      <w:r>
+        <w:rPr>
+          <w:rFonts w:ascii="Times New Roman" w:hAnsi="Times New Roman" w:cs="Times New Roman"/>
+          <w:lang w:eastAsia="es-EC"/>
+        </w:rPr>
+        <w:t>.</w:t>
+      </w:r>
+    </w:p>
+    <w:p>
+      <w:pPr>
+        <w:rPr>
+          <w:rFonts w:ascii="Times New Roman" w:hAnsi="Times New Roman" w:cs="Times New Roman"/>
+          <w:lang w:eastAsia="es-EC"/>
+        </w:rPr>
+      </w:pPr>
+      <w:r>
+        <w:rPr>
+          <w:rFonts w:ascii="Times New Roman" w:hAnsi="Times New Roman" w:cs="Times New Roman"/>
+          <w:lang w:eastAsia="es-EC"/>
+        </w:rPr>
+        <w:t>Para el informe se documentarán cuatro etapas principales.</w:t>
+      </w:r>
+    </w:p>
+    <w:p>
+      <w:pPr>
+        <w:rPr>
+          <w:rFonts w:ascii="Times New Roman" w:hAnsi="Times New Roman" w:cs="Times New Roman"/>
+          <w:b/>
+          <w:bCs/>
+          <w:lang w:eastAsia="es-EC"/>
+        </w:rPr>
+      </w:pPr>
+      <w:r>
+        <w:rPr>
+          <w:rFonts w:ascii="Times New Roman" w:hAnsi="Times New Roman" w:cs="Times New Roman"/>
+          <w:b/>
+          <w:bCs/>
+          <w:lang w:eastAsia="es-EC"/>
+        </w:rPr>
+        <w:t xml:space="preserve">9.1 Primer </w:t>
+      </w:r>
+      <w:proofErr w:type="spellStart"/>
+      <w:r>
+        <w:rPr>
+          <w:rFonts w:ascii="Times New Roman" w:hAnsi="Times New Roman" w:cs="Times New Roman"/>
+          <w:b/>
+          <w:bCs/>
+          <w:lang w:eastAsia="es-EC"/>
+        </w:rPr>
+        <w:t>commit</w:t>
+      </w:r>
+      <w:proofErr w:type="spellEnd"/>
+      <w:r>
+        <w:rPr>
+          <w:rFonts w:ascii="Times New Roman" w:hAnsi="Times New Roman" w:cs="Times New Roman"/>
+          <w:b/>
+          <w:bCs/>
+          <w:lang w:eastAsia="es-EC"/>
+        </w:rPr>
+        <w:t>: plantilla de Word</w:t>
+      </w:r>
+    </w:p>
+    <w:p>
+      <w:pPr>
+        <w:rPr>
+          <w:rFonts w:ascii="Times New Roman" w:hAnsi="Times New Roman" w:cs="Times New Roman"/>
+          <w:lang w:eastAsia="es-EC"/>
+        </w:rPr>
+      </w:pPr>
+      <w:r>
+        <w:rPr>
+          <w:rFonts w:ascii="Times New Roman" w:hAnsi="Times New Roman" w:cs="Times New Roman"/>
+          <w:lang w:eastAsia="es-EC"/>
+        </w:rPr>
+        <w:t>En la primera etapa se agregó al repositorio la plantilla de Word que será utilizada para elaborar el informe de la actividad.</w:t>
+      </w:r>
+    </w:p>
+    <w:p>
+      <w:pPr>
+        <w:rPr>
+          <w:rFonts w:ascii="Times New Roman" w:hAnsi="Times New Roman" w:cs="Times New Roman"/>
+          <w:lang w:eastAsia="es-EC"/>
+        </w:rPr>
+      </w:pPr>
+      <w:r>
+        <w:rPr>
+          <w:rFonts w:ascii="Times New Roman" w:hAnsi="Times New Roman" w:cs="Times New Roman"/>
+          <w:lang w:eastAsia="es-EC"/>
+        </w:rPr>
+        <w:t>El procedimiento realizado desde Git Bash fue:</w:t>
+      </w:r>
+    </w:p>
+    <w:p>
+      <w:pPr>
+        <w:rPr>
+          <w:rFonts w:ascii="Times New Roman" w:hAnsi="Times New Roman" w:cs="Times New Roman"/>
+          <w:lang w:eastAsia="es-EC"/>
+        </w:rPr>
+      </w:pPr>
+      <w:proofErr w:type="spellStart"/>
+      <w:r>
+        <w:rPr>
+          <w:rFonts w:ascii="Times New Roman" w:hAnsi="Times New Roman" w:cs="Times New Roman"/>
+          <w:lang w:eastAsia="es-EC"/>
+        </w:rPr>
+        <w:t>git</w:t>
+      </w:r>
+      <w:proofErr w:type="spellEnd"/>
+      <w:r>
+        <w:rPr>
+          <w:rFonts w:ascii="Times New Roman" w:hAnsi="Times New Roman" w:cs="Times New Roman"/>
+          <w:lang w:eastAsia="es-EC"/>
+        </w:rPr>
+        <w:t xml:space="preserve"> </w:t>
+      </w:r>
+      <w:proofErr w:type="spellStart"/>
+      <w:proofErr w:type="gramStart"/>
+      <w:r>
+        <w:rPr>
+          <w:rFonts w:ascii="Times New Roman" w:hAnsi="Times New Roman" w:cs="Times New Roman"/>
+          <w:lang w:eastAsia="es-EC"/>
+        </w:rPr>
+        <w:t>add</w:t>
+      </w:r>
+      <w:proofErr w:type="spellEnd"/>
+      <w:r>
+        <w:rPr>
+          <w:rFonts w:ascii="Times New Roman" w:hAnsi="Times New Roman" w:cs="Times New Roman"/>
+          <w:lang w:eastAsia="es-EC"/>
+        </w:rPr>
+        <w:t xml:space="preserve"> .</w:t>
+      </w:r>
+      <w:proofErr w:type="gramEnd"/>
+    </w:p>
+    <w:p>
+      <w:pPr>
+        <w:rPr>
+          <w:rFonts w:ascii="Times New Roman" w:hAnsi="Times New Roman" w:cs="Times New Roman"/>
+          <w:lang w:eastAsia="es-EC"/>
+        </w:rPr>
+      </w:pPr>
+      <w:proofErr w:type="spellStart"/>
+      <w:r>
+        <w:rPr>
+          <w:rFonts w:ascii="Times New Roman" w:hAnsi="Times New Roman" w:cs="Times New Roman"/>
+          <w:lang w:eastAsia="es-EC"/>
+        </w:rPr>
+        <w:t>git</w:t>
+      </w:r>
+      <w:proofErr w:type="spellEnd"/>
+      <w:r>
+        <w:rPr>
+          <w:rFonts w:ascii="Times New Roman" w:hAnsi="Times New Roman" w:cs="Times New Roman"/>
+          <w:lang w:eastAsia="es-EC"/>
+        </w:rPr>
+        <w:t xml:space="preserve"> </w:t>
+      </w:r>
+      <w:proofErr w:type="spellStart"/>
+      <w:r>
+        <w:rPr>
+          <w:rFonts w:ascii="Times New Roman" w:hAnsi="Times New Roman" w:cs="Times New Roman"/>
+          <w:lang w:eastAsia="es-EC"/>
+        </w:rPr>
+        <w:t>commit</w:t>
+      </w:r>
+      <w:proofErr w:type="spellEnd"/>
+      <w:r>
+        <w:rPr>
+          <w:rFonts w:ascii="Times New Roman" w:hAnsi="Times New Roman" w:cs="Times New Roman"/>
+          <w:lang w:eastAsia="es-EC"/>
+        </w:rPr>
+        <w:t xml:space="preserve"> -m "</w:t>
+      </w:r>
+      <w:proofErr w:type="spellStart"/>
+      <w:r>
+        <w:rPr>
+          <w:rFonts w:ascii="Times New Roman" w:hAnsi="Times New Roman" w:cs="Times New Roman"/>
+          <w:lang w:eastAsia="es-EC"/>
+        </w:rPr>
+        <w:t>commit</w:t>
+      </w:r>
+      <w:proofErr w:type="spellEnd"/>
+      <w:r>
+        <w:rPr>
+          <w:rFonts w:ascii="Times New Roman" w:hAnsi="Times New Roman" w:cs="Times New Roman"/>
+          <w:lang w:eastAsia="es-EC"/>
+        </w:rPr>
+        <w:t xml:space="preserve"> inicial en </w:t>
+      </w:r>
+      <w:proofErr w:type="spellStart"/>
+      <w:r>
+        <w:rPr>
+          <w:rFonts w:ascii="Times New Roman" w:hAnsi="Times New Roman" w:cs="Times New Roman"/>
+          <w:lang w:eastAsia="es-EC"/>
+        </w:rPr>
+        <w:t>Gitbash</w:t>
+      </w:r>
+      <w:proofErr w:type="spellEnd"/>
+      <w:r>
+        <w:rPr>
+          <w:rFonts w:ascii="Times New Roman" w:hAnsi="Times New Roman" w:cs="Times New Roman"/>
+          <w:lang w:eastAsia="es-EC"/>
+        </w:rPr>
+        <w:t xml:space="preserve">: se </w:t>
+      </w:r>
+      <w:proofErr w:type="spellStart"/>
+      <w:r>
+        <w:rPr>
+          <w:rFonts w:ascii="Times New Roman" w:hAnsi="Times New Roman" w:cs="Times New Roman"/>
+          <w:lang w:eastAsia="es-EC"/>
+        </w:rPr>
+        <w:t>agrego</w:t>
+      </w:r>
+      <w:proofErr w:type="spellEnd"/>
+      <w:r>
+        <w:rPr>
+          <w:rFonts w:ascii="Times New Roman" w:hAnsi="Times New Roman" w:cs="Times New Roman"/>
+          <w:lang w:eastAsia="es-EC"/>
+        </w:rPr>
+        <w:t xml:space="preserve"> platilla de </w:t>
+      </w:r>
+      <w:proofErr w:type="spellStart"/>
+      <w:r>
+        <w:rPr>
+          <w:rFonts w:ascii="Times New Roman" w:hAnsi="Times New Roman" w:cs="Times New Roman"/>
+          <w:lang w:eastAsia="es-EC"/>
+        </w:rPr>
+        <w:t>word</w:t>
+      </w:r>
+      <w:proofErr w:type="spellEnd"/>
+      <w:r>
+        <w:rPr>
+          <w:rFonts w:ascii="Times New Roman" w:hAnsi="Times New Roman" w:cs="Times New Roman"/>
+          <w:lang w:eastAsia="es-EC"/>
+        </w:rPr>
+        <w:t xml:space="preserve"> para realizar </w:t>
+      </w:r>
+      <w:proofErr w:type="gramStart"/>
+      <w:r>
+        <w:rPr>
+          <w:rFonts w:ascii="Times New Roman" w:hAnsi="Times New Roman" w:cs="Times New Roman"/>
+          <w:lang w:eastAsia="es-EC"/>
+        </w:rPr>
+        <w:t>el informe actividad</w:t>
+      </w:r>
+      <w:proofErr w:type="gramEnd"/>
+      <w:r>
+        <w:rPr>
+          <w:rFonts w:ascii="Times New Roman" w:hAnsi="Times New Roman" w:cs="Times New Roman"/>
+          <w:lang w:eastAsia="es-EC"/>
+        </w:rPr>
+        <w:t xml:space="preserve"> 1"</w:t>
+      </w:r>
+    </w:p>
+    <w:p>
+      <w:pPr>
+        <w:rPr>
+          <w:rFonts w:ascii="Times New Roman" w:hAnsi="Times New Roman" w:cs="Times New Roman"/>
+          <w:lang w:eastAsia="es-EC"/>
+        </w:rPr>
+      </w:pPr>
+      <w:proofErr w:type="spellStart"/>
+      <w:r>
+        <w:rPr>
+          <w:rFonts w:ascii="Times New Roman" w:hAnsi="Times New Roman" w:cs="Times New Roman"/>
+          <w:lang w:eastAsia="es-EC"/>
+        </w:rPr>
+        <w:t>git</w:t>
+      </w:r>
+      <w:proofErr w:type="spellEnd"/>
+      <w:r>
+        <w:rPr>
+          <w:rFonts w:ascii="Times New Roman" w:hAnsi="Times New Roman" w:cs="Times New Roman"/>
+          <w:lang w:eastAsia="es-EC"/>
+        </w:rPr>
+        <w:t xml:space="preserve"> </w:t>
+      </w:r>
+      <w:proofErr w:type="spellStart"/>
+      <w:r>
+        <w:rPr>
+          <w:rFonts w:ascii="Times New Roman" w:hAnsi="Times New Roman" w:cs="Times New Roman"/>
+          <w:lang w:eastAsia="es-EC"/>
+        </w:rPr>
+        <w:t>push</w:t>
+      </w:r>
+      <w:proofErr w:type="spellEnd"/>
+    </w:p>
+    <w:p>
+      <w:pPr>
+        <w:rPr>
+          <w:rFonts w:ascii="Times New Roman" w:hAnsi="Times New Roman" w:cs="Times New Roman"/>
+          <w:lang w:eastAsia="es-EC"/>
+        </w:rPr>
+      </w:pPr>
+      <w:r>
+        <w:rPr>
+          <w:rFonts w:ascii="Times New Roman" w:hAnsi="Times New Roman" w:cs="Times New Roman"/>
+          <w:lang w:eastAsia="es-EC"/>
+        </w:rPr>
+        <w:lastRenderedPageBreak/>
+        <w:drawing>
+          <wp:inline distT="0" distB="0" distL="0" distR="0" wp14:anchorId="7441475F" wp14:editId="2C43764D">
+            <wp:extent cx="5277173" cy="2804779"/>
+            <wp:effectExtent l="0" t="0" r="0" b="0"/>
+            <wp:docPr id="1104271303" name="Imagen 9"/>
+            <wp:cNvGraphicFramePr>
+              <a:graphicFrameLocks xmlns:a="http://schemas.openxmlformats.org/drawingml/2006/main" noChangeAspect="1"/>
+            </wp:cNvGraphicFramePr>
+            <a:graphic xmlns:a="http://schemas.openxmlformats.org/drawingml/2006/main">
+              <a:graphicData uri="http://schemas.openxmlformats.org/drawingml/2006/picture">
+                <pic:pic xmlns:pic="http://schemas.openxmlformats.org/drawingml/2006/picture">
+                  <pic:nvPicPr>
+                    <pic:cNvPr id="0" name="Picture 27"/>
+                    <pic:cNvPicPr>
+                      <a:picLocks noChangeAspect="1" noChangeArrowheads="1"/>
+                    </pic:cNvPicPr>
+                  </pic:nvPicPr>
+                  <pic:blipFill rotWithShape="1">
+                    <a:blip r:embed="rId21">
+                      <a:extLst>
+                        <a:ext uri="{28A0092B-C50C-407E-A947-70E740481C1C}">
+                          <a14:useLocalDpi xmlns:a14="http://schemas.microsoft.com/office/drawing/2010/main" val="0"/>
+                        </a:ext>
+                      </a:extLst>
+                    </a:blip>
+                    <a:srcRect r="45182" b="48210"/>
+                    <a:stretch>
+                      <a:fillRect/>
+                    </a:stretch>
+                  </pic:blipFill>
+                  <pic:spPr bwMode="auto">
+                    <a:xfrm>
+                      <a:off x="0" y="0"/>
+                      <a:ext cx="5292219" cy="2812776"/>
+                    </a:xfrm>
+                    <a:prstGeom prst="rect">
+                      <a:avLst/>
+                    </a:prstGeom>
+                    <a:noFill/>
+                    <a:ln>
+                      <a:noFill/>
+                    </a:ln>
+                    <a:extLst>
+                      <a:ext uri="{53640926-AAD7-44D8-BBD7-CCE9431645EC}">
+                        <a14:shadowObscured xmlns:a14="http://schemas.microsoft.com/office/drawing/2010/main"/>
+                      </a:ext>
+                    </a:extLst>
+                  </pic:spPr>
+                </pic:pic>
+              </a:graphicData>
+            </a:graphic>
+          </wp:inline>
+        </w:drawing>
+      </w:r>
+    </w:p>
+    <w:p>
+      <w:pPr>
+        <w:rPr>
+          <w:rFonts w:ascii="Times New Roman" w:hAnsi="Times New Roman" w:cs="Times New Roman"/>
+          <w:b/>
+          <w:bCs/>
+          <w:lang w:eastAsia="es-EC"/>
+        </w:rPr>
+      </w:pPr>
+      <w:r>
+        <w:rPr>
+          <w:rFonts w:ascii="Times New Roman" w:hAnsi="Times New Roman" w:cs="Times New Roman"/>
+          <w:b/>
+          <w:bCs/>
+          <w:lang w:eastAsia="es-EC"/>
+        </w:rPr>
+        <w:t xml:space="preserve">El </w:t>
+      </w:r>
+      <w:proofErr w:type="spellStart"/>
+      <w:r>
+        <w:rPr>
+          <w:rFonts w:ascii="Times New Roman" w:hAnsi="Times New Roman" w:cs="Times New Roman"/>
+          <w:b/>
+          <w:bCs/>
+          <w:lang w:eastAsia="es-EC"/>
+        </w:rPr>
+        <w:t>commit</w:t>
+      </w:r>
+      <w:proofErr w:type="spellEnd"/>
+      <w:r>
+        <w:rPr>
+          <w:rFonts w:ascii="Times New Roman" w:hAnsi="Times New Roman" w:cs="Times New Roman"/>
+          <w:b/>
+          <w:bCs/>
+          <w:lang w:eastAsia="es-EC"/>
+        </w:rPr>
+        <w:t xml:space="preserve"> generado fue:</w:t>
+      </w:r>
+    </w:p>
+    <w:p>
+      <w:pPr>
+        <w:rPr>
+          <w:rFonts w:ascii="Times New Roman" w:hAnsi="Times New Roman" w:cs="Times New Roman"/>
+          <w:lang w:eastAsia="es-EC"/>
+        </w:rPr>
+      </w:pPr>
+      <w:proofErr w:type="spellStart"/>
+      <w:r>
+        <w:rPr>
+          <w:rFonts w:ascii="Times New Roman" w:hAnsi="Times New Roman" w:cs="Times New Roman"/>
+          <w:lang w:eastAsia="es-EC"/>
+        </w:rPr>
+        <w:t>eeddbaa</w:t>
+      </w:r>
+      <w:proofErr w:type="spellEnd"/>
+    </w:p>
+    <w:p>
+      <w:pPr>
+        <w:rPr>
+          <w:rFonts w:ascii="Times New Roman" w:hAnsi="Times New Roman" w:cs="Times New Roman"/>
+          <w:lang w:eastAsia="es-EC"/>
+        </w:rPr>
+      </w:pPr>
+      <w:r>
+        <w:rPr>
+          <w:rFonts w:ascii="Times New Roman" w:hAnsi="Times New Roman" w:cs="Times New Roman"/>
+          <w:lang w:eastAsia="es-EC"/>
+        </w:rPr>
+        <w:t>con el mensaje:</w:t>
+      </w:r>
+    </w:p>
+    <w:p>
+      <w:pPr>
+        <w:rPr>
+          <w:rFonts w:ascii="Times New Roman" w:hAnsi="Times New Roman" w:cs="Times New Roman"/>
+          <w:lang w:eastAsia="es-EC"/>
+        </w:rPr>
+      </w:pPr>
+      <w:proofErr w:type="spellStart"/>
+      <w:r>
+        <w:rPr>
+          <w:rFonts w:ascii="Times New Roman" w:hAnsi="Times New Roman" w:cs="Times New Roman"/>
+          <w:lang w:eastAsia="es-EC"/>
+        </w:rPr>
+        <w:t>commit</w:t>
+      </w:r>
+      <w:proofErr w:type="spellEnd"/>
+      <w:r>
+        <w:rPr>
+          <w:rFonts w:ascii="Times New Roman" w:hAnsi="Times New Roman" w:cs="Times New Roman"/>
+          <w:lang w:eastAsia="es-EC"/>
+        </w:rPr>
+        <w:t xml:space="preserve"> inicial en </w:t>
+      </w:r>
+      <w:proofErr w:type="spellStart"/>
+      <w:r>
+        <w:rPr>
+          <w:rFonts w:ascii="Times New Roman" w:hAnsi="Times New Roman" w:cs="Times New Roman"/>
+          <w:lang w:eastAsia="es-EC"/>
+        </w:rPr>
+        <w:t>Gitbash</w:t>
+      </w:r>
+      <w:proofErr w:type="spellEnd"/>
+      <w:r>
+        <w:rPr>
+          <w:rFonts w:ascii="Times New Roman" w:hAnsi="Times New Roman" w:cs="Times New Roman"/>
+          <w:lang w:eastAsia="es-EC"/>
+        </w:rPr>
+        <w:t xml:space="preserve">: se </w:t>
+      </w:r>
+      <w:proofErr w:type="spellStart"/>
+      <w:r>
+        <w:rPr>
+          <w:rFonts w:ascii="Times New Roman" w:hAnsi="Times New Roman" w:cs="Times New Roman"/>
+          <w:lang w:eastAsia="es-EC"/>
+        </w:rPr>
+        <w:t>agrego</w:t>
+      </w:r>
+      <w:proofErr w:type="spellEnd"/>
+      <w:r>
+        <w:rPr>
+          <w:rFonts w:ascii="Times New Roman" w:hAnsi="Times New Roman" w:cs="Times New Roman"/>
+          <w:lang w:eastAsia="es-EC"/>
+        </w:rPr>
+        <w:t xml:space="preserve"> platilla de </w:t>
+      </w:r>
+      <w:proofErr w:type="spellStart"/>
+      <w:r>
+        <w:rPr>
+          <w:rFonts w:ascii="Times New Roman" w:hAnsi="Times New Roman" w:cs="Times New Roman"/>
+          <w:lang w:eastAsia="es-EC"/>
+        </w:rPr>
+        <w:t>word</w:t>
+      </w:r>
+      <w:proofErr w:type="spellEnd"/>
+      <w:r>
+        <w:rPr>
+          <w:rFonts w:ascii="Times New Roman" w:hAnsi="Times New Roman" w:cs="Times New Roman"/>
+          <w:lang w:eastAsia="es-EC"/>
+        </w:rPr>
+        <w:t xml:space="preserve"> para realizar </w:t>
+      </w:r>
+      <w:proofErr w:type="gramStart"/>
+      <w:r>
+        <w:rPr>
+          <w:rFonts w:ascii="Times New Roman" w:hAnsi="Times New Roman" w:cs="Times New Roman"/>
+          <w:lang w:eastAsia="es-EC"/>
+        </w:rPr>
+        <w:t>el informe actividad</w:t>
+      </w:r>
+      <w:proofErr w:type="gramEnd"/>
+      <w:r>
+        <w:rPr>
+          <w:rFonts w:ascii="Times New Roman" w:hAnsi="Times New Roman" w:cs="Times New Roman"/>
+          <w:lang w:eastAsia="es-EC"/>
+        </w:rPr>
+        <w:t xml:space="preserve"> 1</w:t>
+      </w:r>
+    </w:p>
+    <w:p>
+      <w:pPr>
+        <w:rPr>
+          <w:rFonts w:ascii="Times New Roman" w:hAnsi="Times New Roman" w:cs="Times New Roman"/>
+          <w:lang w:eastAsia="es-EC"/>
+        </w:rPr>
+      </w:pPr>
+      <w:r>
+        <w:rPr>
+          <w:rFonts w:ascii="Times New Roman" w:hAnsi="Times New Roman" w:cs="Times New Roman"/>
+          <w:lang w:eastAsia="es-EC"/>
+        </w:rPr>
+        <w:drawing>
+          <wp:inline distT="0" distB="0" distL="0" distR="0" wp14:anchorId="3432BC7F" wp14:editId="177BFAC7">
+            <wp:extent cx="5920976" cy="1239864"/>
+            <wp:effectExtent l="0" t="0" r="3810" b="0"/>
+            <wp:docPr id="1634281455" name="Imagen 1"/>
+            <wp:cNvGraphicFramePr>
+              <a:graphicFrameLocks xmlns:a="http://schemas.openxmlformats.org/drawingml/2006/main" noChangeAspect="1"/>
+            </wp:cNvGraphicFramePr>
+            <a:graphic xmlns:a="http://schemas.openxmlformats.org/drawingml/2006/main">
+              <a:graphicData uri="http://schemas.openxmlformats.org/drawingml/2006/picture">
+                <pic:pic xmlns:pic="http://schemas.openxmlformats.org/drawingml/2006/picture">
+                  <pic:nvPicPr>
+                    <pic:cNvPr id="1634281455" name=""/>
+                    <pic:cNvPicPr/>
+                  </pic:nvPicPr>
+                  <pic:blipFill>
+                    <a:blip r:embed="rId22"/>
+                    <a:stretch>
+                      <a:fillRect/>
+                    </a:stretch>
+                  </pic:blipFill>
+                  <pic:spPr>
+                    <a:xfrm>
+                      <a:off x="0" y="0"/>
+                      <a:ext cx="5956081" cy="1247215"/>
+                    </a:xfrm>
+                    <a:prstGeom prst="rect">
+                      <a:avLst/>
+                    </a:prstGeom>
+                  </pic:spPr>
+                </pic:pic>
+              </a:graphicData>
+            </a:graphic>
+          </wp:inline>
+        </w:drawing>
+      </w:r>
+    </w:p>
+    <w:p>
+      <w:pPr>
+        <w:rPr>
+          <w:rFonts w:ascii="Times New Roman" w:hAnsi="Times New Roman" w:cs="Times New Roman"/>
+          <w:b/>
+          <w:bCs/>
+          <w:lang w:eastAsia="es-EC"/>
+        </w:rPr>
+      </w:pPr>
+      <w:r>
+        <w:rPr>
+          <w:rFonts w:ascii="Times New Roman" w:hAnsi="Times New Roman" w:cs="Times New Roman"/>
+          <w:b/>
+          <w:bCs/>
+          <w:lang w:eastAsia="es-EC"/>
+        </w:rPr>
+        <w:t xml:space="preserve">9.2 Segundo </w:t>
+      </w:r>
+      <w:proofErr w:type="spellStart"/>
+      <w:r>
+        <w:rPr>
+          <w:rFonts w:ascii="Times New Roman" w:hAnsi="Times New Roman" w:cs="Times New Roman"/>
+          <w:b/>
+          <w:bCs/>
+          <w:lang w:eastAsia="es-EC"/>
+        </w:rPr>
+        <w:t>commit</w:t>
+      </w:r>
+      <w:proofErr w:type="spellEnd"/>
+      <w:r>
+        <w:rPr>
+          <w:rFonts w:ascii="Times New Roman" w:hAnsi="Times New Roman" w:cs="Times New Roman"/>
+          <w:b/>
+          <w:bCs/>
+          <w:lang w:eastAsia="es-EC"/>
+        </w:rPr>
+        <w:t>: plantilla editada</w:t>
+      </w:r>
+    </w:p>
+    <w:p>
+      <w:pPr>
+        <w:rPr>
+          <w:rFonts w:ascii="Times New Roman" w:hAnsi="Times New Roman" w:cs="Times New Roman"/>
+          <w:b/>
+          <w:bCs/>
+          <w:lang w:eastAsia="es-EC"/>
+        </w:rPr>
+      </w:pPr>
+    </w:p>
+    <w:p>
+      <w:pPr>
+        <w:rPr>
+          <w:rFonts w:ascii="Times New Roman" w:hAnsi="Times New Roman" w:cs="Times New Roman"/>
+          <w:b/>
+          <w:bCs/>
+          <w:lang w:eastAsia="es-EC"/>
+        </w:rPr>
+      </w:pPr>
+    </w:p>
+    <w:p>
+      <w:pPr>
+        <w:rPr>
+          <w:rFonts w:ascii="Times New Roman" w:hAnsi="Times New Roman" w:cs="Times New Roman"/>
+          <w:lang w:eastAsia="es-EC"/>
+        </w:rPr>
+      </w:pPr>
+    </w:p>
+    <w:p>
+      <w:pPr>
+        <w:rPr>
+          <w:rFonts w:ascii="Times New Roman" w:hAnsi="Times New Roman" w:cs="Times New Roman"/>
+          <w:lang w:eastAsia="es-EC"/>
+        </w:rPr>
+      </w:pPr>
+    </w:p>
+    <w:p>
+      <w:pPr>
+        <w:rPr>
+          <w:rFonts w:ascii="Times New Roman" w:hAnsi="Times New Roman" w:cs="Times New Roman"/>
+          <w:lang w:eastAsia="es-EC"/>
+        </w:rPr>
+      </w:pPr>
+    </w:p>
+    <w:p>
+      <w:pPr>
+        <w:rPr>
+          <w:rFonts w:ascii="Times New Roman" w:hAnsi="Times New Roman" w:cs="Times New Roman"/>
+          <w:lang w:eastAsia="es-EC"/>
+        </w:rPr>
+      </w:pPr>
+    </w:p>
+    <w:p>
+      <w:pPr>
+        <w:rPr>
+          <w:rFonts w:ascii="Times New Roman" w:hAnsi="Times New Roman" w:cs="Times New Roman"/>
+          <w:lang w:eastAsia="es-EC"/>
+        </w:rPr>
+      </w:pPr>
+    </w:p>
+    <w:p>
+      <w:pPr>
+        <w:rPr>
+          <w:rFonts w:ascii="Times New Roman" w:hAnsi="Times New Roman" w:cs="Times New Roman"/>
+          <w:lang w:eastAsia="es-EC"/>
+        </w:rPr>
+      </w:pPr>
+    </w:p>
+    <w:p>
+      <w:pPr>
+        <w:rPr>
+          <w:rFonts w:ascii="Times New Roman" w:hAnsi="Times New Roman" w:cs="Times New Roman"/>
+          <w:lang w:eastAsia="es-EC"/>
+        </w:rPr>
+      </w:pPr>
+    </w:p>
+    <w:p>
+      <w:pPr>
+        <w:rPr>
+          <w:rFonts w:ascii="Times New Roman" w:hAnsi="Times New Roman" w:cs="Times New Roman"/>
+          <w:lang w:eastAsia="es-EC"/>
+        </w:rPr>
+      </w:pPr>
+    </w:p>
+    <w:p>
+      <w:pPr>
+        <w:rPr>
+          <w:rFonts w:ascii="Times New Roman" w:hAnsi="Times New Roman" w:cs="Times New Roman"/>
+          <w:lang w:eastAsia="es-EC"/>
+        </w:rPr>
+      </w:pPr>
+    </w:p>
+    <w:p>
+      <w:pPr>
+        <w:rPr>
+          <w:rFonts w:ascii="Times New Roman" w:hAnsi="Times New Roman" w:cs="Times New Roman"/>
+          <w:lang w:eastAsia="es-EC"/>
+        </w:rPr>
+      </w:pPr>
+    </w:p>
+    <w:p>
+      <w:pPr>
+        <w:rPr>
+          <w:rFonts w:ascii="Times New Roman" w:hAnsi="Times New Roman" w:cs="Times New Roman"/>
+          <w:lang w:eastAsia="es-EC"/>
+        </w:rPr>
+      </w:pPr>
+    </w:p>
+    <w:p>
+      <w:pPr>
+        <w:rPr>
+          <w:rFonts w:ascii="Times New Roman" w:hAnsi="Times New Roman" w:cs="Times New Roman"/>
+          <w:lang w:eastAsia="es-EC"/>
+        </w:rPr>
+      </w:pPr>
+    </w:p>
+    <w:p>
+      <w:pPr>
+        <w:rPr>
+          <w:rFonts w:ascii="Times New Roman" w:hAnsi="Times New Roman" w:cs="Times New Roman"/>
+          <w:lang w:eastAsia="es-EC"/>
+        </w:rPr>
+      </w:pPr>
+    </w:p>
+    <w:p>
+      <w:pPr>
+        <w:rPr>
+          <w:rFonts w:ascii="Times New Roman" w:hAnsi="Times New Roman" w:cs="Times New Roman"/>
+          <w:lang w:eastAsia="es-EC"/>
+        </w:rPr>
+      </w:pPr>
+    </w:p>
+    <w:p>
+      <w:pPr>
+        <w:rPr>
+          <w:rFonts w:ascii="Times New Roman" w:hAnsi="Times New Roman" w:cs="Times New Roman"/>
+          <w:lang w:eastAsia="es-EC"/>
+        </w:rPr>
+      </w:pPr>
+    </w:p>
+    <w:p>
+      <w:pPr>
+        <w:rPr>
+          <w:rFonts w:ascii="Times New Roman" w:hAnsi="Times New Roman" w:cs="Times New Roman"/>
+          <w:lang w:eastAsia="es-EC"/>
+        </w:rPr>
+      </w:pPr>
+    </w:p>
+    <w:p>
+      <w:pPr>
+        <w:rPr>
+          <w:rFonts w:ascii="Times New Roman" w:hAnsi="Times New Roman" w:cs="Times New Roman"/>
+          <w:lang w:eastAsia="es-EC"/>
+        </w:rPr>
+      </w:pPr>
+    </w:p>
+    <w:p>
+      <w:pPr>
+        <w:rPr>
+          <w:rFonts w:ascii="Times New Roman" w:hAnsi="Times New Roman" w:cs="Times New Roman"/>
+          <w:lang w:eastAsia="es-EC"/>
+        </w:rPr>
+      </w:pPr>
+    </w:p>
+    <w:p>
+      <w:pPr>
+        <w:rPr>
+          <w:rFonts w:ascii="Times New Roman" w:hAnsi="Times New Roman" w:cs="Times New Roman"/>
+          <w:lang w:eastAsia="es-EC"/>
+        </w:rPr>
+      </w:pPr>
+    </w:p>
+    <w:p>
+      <w:pPr>
+        <w:rPr>
+          <w:rFonts w:ascii="Times New Roman" w:hAnsi="Times New Roman" w:cs="Times New Roman"/>
+          <w:lang w:eastAsia="es-EC"/>
+        </w:rPr>
+      </w:pPr>
+    </w:p>
+    <w:p>
+      <w:pPr>
+        <w:rPr>
+          <w:rFonts w:ascii="Times New Roman" w:hAnsi="Times New Roman" w:cs="Times New Roman"/>
+          <w:lang w:eastAsia="es-EC"/>
+        </w:rPr>
+      </w:pPr>
+    </w:p>
+    <w:p>
+      <w:pPr>
+        <w:rPr>
+          <w:rFonts w:ascii="Times New Roman" w:hAnsi="Times New Roman" w:cs="Times New Roman"/>
+          <w:lang w:eastAsia="es-EC"/>
+        </w:rPr>
+      </w:pPr>
+    </w:p>
+    <w:p>
+      <w:pPr>
+        <w:rPr>
+          <w:rFonts w:ascii="Times New Roman" w:hAnsi="Times New Roman" w:cs="Times New Roman"/>
+          <w:lang w:eastAsia="es-EC"/>
+        </w:rPr>
+      </w:pPr>
+    </w:p>
+    <w:p>
+      <w:pPr>
+        <w:rPr>
+          <w:rFonts w:ascii="Times New Roman" w:hAnsi="Times New Roman" w:cs="Times New Roman"/>
+          <w:lang w:eastAsia="es-EC"/>
+        </w:rPr>
+      </w:pPr>
+    </w:p>
+    <w:p>
+      <w:pPr>
+        <w:rPr>
+          <w:rFonts w:ascii="Times New Roman" w:hAnsi="Times New Roman" w:cs="Times New Roman"/>
+          <w:lang w:eastAsia="es-EC"/>
+        </w:rPr>
+      </w:pPr>
+    </w:p>
+    <w:p>
+      <w:pPr>
+        <w:rPr>
+          <w:rFonts w:ascii="Times New Roman" w:hAnsi="Times New Roman" w:cs="Times New Roman"/>
+          <w:lang w:eastAsia="es-EC"/>
+        </w:rPr>
+      </w:pPr>
+    </w:p>
+    <w:p>
+      <w:pPr>
+        <w:rPr>
+          <w:rFonts w:ascii="Times New Roman" w:hAnsi="Times New Roman" w:cs="Times New Roman"/>
+          <w:lang w:eastAsia="es-EC"/>
+        </w:rPr>
+      </w:pPr>
+    </w:p>
+    <w:p>
+      <w:pPr>
+        <w:rPr>
+          <w:rFonts w:ascii="Times New Roman" w:hAnsi="Times New Roman" w:cs="Times New Roman"/>
+          <w:lang w:eastAsia="es-EC"/>
+        </w:rPr>
+      </w:pPr>
+    </w:p>
+    <w:p>
+      <w:pPr>
+        <w:rPr>
+          <w:rFonts w:ascii="Times New Roman" w:hAnsi="Times New Roman" w:cs="Times New Roman"/>
+          <w:b/>
+          <w:bCs/>
+          <w:lang w:eastAsia="es-EC"/>
+        </w:rPr>
+      </w:pPr>
+      <w:r>
+        <w:rPr>
+          <w:rFonts w:ascii="Times New Roman" w:hAnsi="Times New Roman" w:cs="Times New Roman"/>
+          <w:b/>
+          <w:bCs/>
+          <w:lang w:eastAsia="es-EC"/>
+        </w:rPr>
+        <w:pict w14:anchorId="67470AD2">
+          <v:rect id="_x0000_i1042" style="width:0;height:1.5pt" o:hralign="center" o:hrstd="t" o:hr="t" fillcolor="#a0a0a0" stroked="f"/>
+        </w:pict>
+      </w:r>
+    </w:p>
+    <w:p>
+      <w:pPr>
+        <w:rPr>
+          <w:rFonts w:ascii="Times New Roman" w:hAnsi="Times New Roman" w:cs="Times New Roman"/>
+          <w:b/>
+          <w:bCs/>
+          <w:lang w:eastAsia="es-EC"/>
+        </w:rPr>
+      </w:pPr>
+    </w:p>
+    <w:p>
+      <w:pPr>
+        <w:rPr>
+          <w:rFonts w:ascii="Times New Roman" w:hAnsi="Times New Roman" w:cs="Times New Roman"/>
+          <w:b/>
+          <w:bCs/>
+          <w:lang w:eastAsia="es-EC"/>
+        </w:rPr>
+      </w:pPr>
+    </w:p>
+    <w:p>
+      <w:pPr>
+        <w:rPr>
+          <w:rFonts w:ascii="Times New Roman" w:hAnsi="Times New Roman" w:cs="Times New Roman"/>
+          <w:b/>
+          <w:bCs/>
+          <w:lang w:eastAsia="es-EC"/>
+        </w:rPr>
+      </w:pPr>
+    </w:p>
+    <w:p>
+      <w:pPr>
+        <w:rPr>
+          <w:rFonts w:ascii="Times New Roman" w:hAnsi="Times New Roman" w:cs="Times New Roman"/>
+          <w:b/>
+          <w:bCs/>
+          <w:lang w:eastAsia="es-EC"/>
+        </w:rPr>
+      </w:pPr>
+    </w:p>
+    <w:p>
+      <w:pPr>
+        <w:pStyle w:val="Sinespaciado"/>
+        <w:spacing w:line="360" w:lineRule="auto"/>
+        <w:jc w:val="both"/>
         <w:rPr>
           <w:rFonts w:ascii="Arial" w:hAnsi="Arial" w:cs="Arial"/>
           <w:b/>
           <w:bCs/>
           <w:lang w:eastAsia="es-EC"/>
         </w:rPr>
-        <w:lastRenderedPageBreak/>
+      </w:pPr>
+    </w:p>
+    <w:p>
+      <w:pPr>
+        <w:pStyle w:val="Sinespaciado"/>
+        <w:spacing w:line="360" w:lineRule="auto"/>
+        <w:jc w:val="both"/>
+        <w:rPr>
+          <w:rFonts w:ascii="Arial" w:hAnsi="Arial" w:cs="Arial"/>
+          <w:b/>
+          <w:bCs/>
+          <w:lang w:eastAsia="es-EC"/>
+        </w:rPr>
+      </w:pPr>
+    </w:p>
+    <w:p>
+      <w:pPr>
+        <w:pStyle w:val="Sinespaciado"/>
+        <w:spacing w:line="360" w:lineRule="auto"/>
+        <w:jc w:val="both"/>
+        <w:rPr>
+          <w:rFonts w:ascii="Arial" w:hAnsi="Arial" w:cs="Arial"/>
+          <w:b/>
+          <w:bCs/>
+          <w:lang w:eastAsia="es-EC"/>
+        </w:rPr>
+      </w:pPr>
+    </w:p>
+    <w:p>
+      <w:pPr>
+        <w:pStyle w:val="Sinespaciado"/>
+        <w:spacing w:line="360" w:lineRule="auto"/>
+        <w:jc w:val="both"/>
+        <w:rPr>
+          <w:rFonts w:ascii="Arial" w:hAnsi="Arial" w:cs="Arial"/>
+          <w:b/>
+          <w:bCs/>
+          <w:lang w:eastAsia="es-EC"/>
+        </w:rPr>
+      </w:pPr>
+    </w:p>
+    <w:p>
+      <w:pPr>
+        <w:pStyle w:val="Sinespaciado"/>
+        <w:spacing w:line="360" w:lineRule="auto"/>
+        <w:jc w:val="both"/>
+        <w:rPr>
+          <w:rFonts w:ascii="Arial" w:hAnsi="Arial" w:cs="Arial"/>
+          <w:b/>
+          <w:bCs/>
+          <w:lang w:eastAsia="es-EC"/>
+        </w:rPr>
+      </w:pPr>
+    </w:p>
+    <w:p>
+      <w:pPr>
+        <w:pStyle w:val="Sinespaciado"/>
+        <w:spacing w:line="360" w:lineRule="auto"/>
+        <w:jc w:val="both"/>
+        <w:rPr>
+          <w:rFonts w:ascii="Arial" w:hAnsi="Arial" w:cs="Arial"/>
+          <w:b/>
+          <w:bCs/>
+          <w:lang w:eastAsia="es-EC"/>
+        </w:rPr>
+      </w:pPr>
+    </w:p>
+    <w:p>
+      <w:pPr>
+        <w:pStyle w:val="Sinespaciado"/>
+        <w:spacing w:line="360" w:lineRule="auto"/>
+        <w:jc w:val="both"/>
+        <w:rPr>
+          <w:rFonts w:ascii="Arial" w:hAnsi="Arial" w:cs="Arial"/>
+          <w:b/>
+          <w:bCs/>
+          <w:lang w:eastAsia="es-EC"/>
+        </w:rPr>
+      </w:pPr>
+    </w:p>
+    <w:p>
+      <w:pPr>
+        <w:pStyle w:val="Sinespaciado"/>
+        <w:spacing w:line="360" w:lineRule="auto"/>
+        <w:jc w:val="both"/>
+        <w:rPr>
+          <w:rFonts w:ascii="Arial" w:hAnsi="Arial" w:cs="Arial"/>
+          <w:b/>
+          <w:bCs/>
+          <w:lang w:eastAsia="es-EC"/>
+        </w:rPr>
+      </w:pPr>
+    </w:p>
+    <w:p>
+      <w:pPr>
+        <w:pStyle w:val="Sinespaciado"/>
+        <w:spacing w:line="360" w:lineRule="auto"/>
+        <w:jc w:val="both"/>
+        <w:rPr>
+          <w:rFonts w:ascii="Arial" w:hAnsi="Arial" w:cs="Arial"/>
+          <w:b/>
+          <w:bCs/>
+          <w:lang w:eastAsia="es-EC"/>
+        </w:rPr>
+      </w:pPr>
+    </w:p>
+    <w:p>
+      <w:pPr>
+        <w:pStyle w:val="Sinespaciado"/>
+        <w:spacing w:line="360" w:lineRule="auto"/>
+        <w:jc w:val="both"/>
+        <w:rPr>
+          <w:rFonts w:ascii="Arial" w:hAnsi="Arial" w:cs="Arial"/>
+          <w:b/>
+          <w:bCs/>
+          <w:lang w:eastAsia="es-EC"/>
+        </w:rPr>
+      </w:pPr>
+    </w:p>
+    <w:p>
+      <w:pPr>
+        <w:pStyle w:val="Sinespaciado"/>
+        <w:spacing w:line="360" w:lineRule="auto"/>
+        <w:jc w:val="both"/>
+        <w:rPr>
+          <w:rFonts w:ascii="Arial" w:hAnsi="Arial" w:cs="Arial"/>
+          <w:b/>
+          <w:bCs/>
+          <w:lang w:eastAsia="es-EC"/>
+        </w:rPr>
+      </w:pPr>
+    </w:p>
+    <w:p>
+      <w:pPr>
+        <w:pStyle w:val="Sinespaciado"/>
+        <w:spacing w:line="360" w:lineRule="auto"/>
+        <w:jc w:val="both"/>
+        <w:rPr>
+          <w:rFonts w:ascii="Arial" w:hAnsi="Arial" w:cs="Arial"/>
+          <w:b/>
+          <w:bCs/>
+          <w:lang w:eastAsia="es-EC"/>
+        </w:rPr>
+      </w:pPr>
+    </w:p>
+    <w:p>
+      <w:pPr>
+        <w:pStyle w:val="Sinespaciado"/>
+        <w:spacing w:line="360" w:lineRule="auto"/>
+        <w:jc w:val="both"/>
+        <w:rPr>
+          <w:rFonts w:ascii="Arial" w:hAnsi="Arial" w:cs="Arial"/>
+          <w:b/>
+          <w:bCs/>
+          <w:lang w:eastAsia="es-EC"/>
+        </w:rPr>
+      </w:pPr>
+    </w:p>
+    <w:p>
+      <w:pPr>
+        <w:pStyle w:val="Sinespaciado"/>
+        <w:spacing w:line="360" w:lineRule="auto"/>
+        <w:jc w:val="both"/>
+        <w:rPr>
+          <w:rFonts w:ascii="Arial" w:hAnsi="Arial" w:cs="Arial"/>
+          <w:b/>
+          <w:bCs/>
+          <w:lang w:eastAsia="es-EC"/>
+        </w:rPr>
+      </w:pPr>
+    </w:p>
+    <w:p>
+      <w:pPr>
+        <w:pStyle w:val="Sinespaciado"/>
+        <w:spacing w:line="360" w:lineRule="auto"/>
+        <w:jc w:val="both"/>
+        <w:rPr>
+          <w:rFonts w:ascii="Arial" w:hAnsi="Arial" w:cs="Arial"/>
+          <w:b/>
+          <w:bCs/>
+          <w:lang w:eastAsia="es-EC"/>
+        </w:rPr>
+      </w:pPr>
+    </w:p>
+    <w:p>
+      <w:pPr>
+        <w:pStyle w:val="Sinespaciado"/>
+        <w:spacing w:line="360" w:lineRule="auto"/>
+        <w:jc w:val="both"/>
+        <w:rPr>
+          <w:rFonts w:ascii="Arial" w:hAnsi="Arial" w:cs="Arial"/>
+          <w:b/>
+          <w:bCs/>
+          <w:lang w:eastAsia="es-EC"/>
+        </w:rPr>
+      </w:pPr>
+    </w:p>
+    <w:p>
+      <w:pPr>
+        <w:pStyle w:val="Sinespaciado"/>
+        <w:spacing w:line="360" w:lineRule="auto"/>
+        <w:jc w:val="both"/>
+        <w:rPr>
+          <w:rFonts w:ascii="Arial" w:hAnsi="Arial" w:cs="Arial"/>
+          <w:b/>
+          <w:bCs/>
+          <w:lang w:eastAsia="es-EC"/>
+        </w:rPr>
+      </w:pPr>
+    </w:p>
+    <w:p>
+      <w:pPr>
+        <w:pStyle w:val="Sinespaciado"/>
+        <w:spacing w:line="360" w:lineRule="auto"/>
+        <w:jc w:val="both"/>
+        <w:rPr>
+          <w:rFonts w:ascii="Arial" w:hAnsi="Arial" w:cs="Arial"/>
+          <w:b/>
+          <w:bCs/>
+          <w:lang w:eastAsia="es-EC"/>
+        </w:rPr>
+      </w:pPr>
+    </w:p>
+    <w:p>
+      <w:pPr>
+        <w:pStyle w:val="Sinespaciado"/>
+        <w:spacing w:line="360" w:lineRule="auto"/>
+        <w:jc w:val="both"/>
+        <w:rPr>
+          <w:rFonts w:ascii="Arial" w:hAnsi="Arial" w:cs="Arial"/>
+          <w:b/>
+          <w:bCs/>
+          <w:lang w:eastAsia="es-EC"/>
+        </w:rPr>
+      </w:pPr>
+    </w:p>
+    <w:p>
+      <w:pPr>
+        <w:pStyle w:val="Sinespaciado"/>
+        <w:spacing w:line="360" w:lineRule="auto"/>
+        <w:jc w:val="both"/>
+        <w:rPr>
+          <w:rFonts w:ascii="Arial" w:hAnsi="Arial" w:cs="Arial"/>
+          <w:b/>
+          <w:bCs/>
+          <w:lang w:eastAsia="es-EC"/>
+        </w:rPr>
+      </w:pPr>
+      <w:r>
+        <w:rPr>
+          <w:rFonts w:ascii="Arial" w:hAnsi="Arial" w:cs="Arial"/>
+          <w:b/>
+          <w:bCs/>
+          <w:lang w:eastAsia="es-EC"/>
+        </w:rPr>
         <w:t>Evidencias</w:t>
       </w:r>
     </w:p>
@@ -1507,7 +4417,7 @@
       </w:r>
     </w:p>
     <w:sectPr>
-      <w:headerReference w:type="first" r:id="rId14"/>
+      <w:headerReference w:type="first" r:id="rId23"/>
       <w:pgSz w:w="11906" w:h="16838"/>
       <w:pgMar w:top="1417" w:right="1701" w:bottom="1417" w:left="1701" w:header="708" w:footer="708" w:gutter="0"/>
       <w:pgNumType w:start="1"/>
@@ -2379,7 +5289,7 @@
         <v:path o:extrusionok="f" gradientshapeok="t" o:connecttype="rect"/>
         <o:lock v:ext="edit" aspectratio="t"/>
       </v:shapetype>
-      <v:shape id="_x0000_i1025" type="#_x0000_t75" style="width:11.4pt;height:11.4pt" o:bullet="t">
+      <v:shape id="_x0000_i1025" type="#_x0000_t75" style="width:11.6pt;height:11.6pt" o:bullet="t">
         <v:imagedata r:id="rId1" o:title="mso3E28"/>
       </v:shape>
     </w:pict>
@@ -3109,6 +6019,155 @@
     </w:lvl>
   </w:abstractNum>
   <w:abstractNum w:abstractNumId="6" w15:restartNumberingAfterBreak="0">
+    <w:nsid w:val="405115E7"/>
+    <w:multiLevelType w:val="multilevel"/>
+    <w:tmpl w:val="EB7EEF40"/>
+    <w:lvl w:ilvl="0">
+      <w:start w:val="1"/>
+      <w:numFmt w:val="bullet"/>
+      <w:lvlText w:val=""/>
+      <w:lvlJc w:val="left"/>
+      <w:pPr>
+        <w:tabs>
+          <w:tab w:val="num" w:pos="720"/>
+        </w:tabs>
+        <w:ind w:left="720" w:hanging="360"/>
+      </w:pPr>
+      <w:rPr>
+        <w:rFonts w:ascii="Symbol" w:hAnsi="Symbol" w:hint="default"/>
+        <w:sz w:val="20"/>
+      </w:rPr>
+    </w:lvl>
+    <w:lvl w:ilvl="1" w:tentative="1">
+      <w:start w:val="1"/>
+      <w:numFmt w:val="bullet"/>
+      <w:lvlText w:val="o"/>
+      <w:lvlJc w:val="left"/>
+      <w:pPr>
+        <w:tabs>
+          <w:tab w:val="num" w:pos="1440"/>
+        </w:tabs>
+        <w:ind w:left="1440" w:hanging="360"/>
+      </w:pPr>
+      <w:rPr>
+        <w:rFonts w:ascii="Courier New" w:hAnsi="Courier New" w:hint="default"/>
+        <w:sz w:val="20"/>
+      </w:rPr>
+    </w:lvl>
+    <w:lvl w:ilvl="2" w:tentative="1">
+      <w:start w:val="1"/>
+      <w:numFmt w:val="bullet"/>
+      <w:lvlText w:val=""/>
+      <w:lvlJc w:val="left"/>
+      <w:pPr>
+        <w:tabs>
+          <w:tab w:val="num" w:pos="2160"/>
+        </w:tabs>
+        <w:ind w:left="2160" w:hanging="360"/>
+      </w:pPr>
+      <w:rPr>
+        <w:rFonts w:ascii="Wingdings" w:hAnsi="Wingdings" w:hint="default"/>
+        <w:sz w:val="20"/>
+      </w:rPr>
+    </w:lvl>
+    <w:lvl w:ilvl="3" w:tentative="1">
+      <w:start w:val="1"/>
+      <w:numFmt w:val="bullet"/>
+      <w:lvlText w:val=""/>
+      <w:lvlJc w:val="left"/>
+      <w:pPr>
+        <w:tabs>
+          <w:tab w:val="num" w:pos="2880"/>
+        </w:tabs>
+        <w:ind w:left="2880" w:hanging="360"/>
+      </w:pPr>
+      <w:rPr>
+        <w:rFonts w:ascii="Wingdings" w:hAnsi="Wingdings" w:hint="default"/>
+        <w:sz w:val="20"/>
+      </w:rPr>
+    </w:lvl>
+    <w:lvl w:ilvl="4" w:tentative="1">
+      <w:start w:val="1"/>
+      <w:numFmt w:val="bullet"/>
+      <w:lvlText w:val=""/>
+      <w:lvlJc w:val="left"/>
+      <w:pPr>
+        <w:tabs>
+          <w:tab w:val="num" w:pos="3600"/>
+        </w:tabs>
+        <w:ind w:left="3600" w:hanging="360"/>
+      </w:pPr>
+      <w:rPr>
+        <w:rFonts w:ascii="Wingdings" w:hAnsi="Wingdings" w:hint="default"/>
+        <w:sz w:val="20"/>
+      </w:rPr>
+    </w:lvl>
+    <w:lvl w:ilvl="5" w:tentative="1">
+      <w:start w:val="1"/>
+      <w:numFmt w:val="bullet"/>
+      <w:lvlText w:val=""/>
+      <w:lvlJc w:val="left"/>
+      <w:pPr>
+        <w:tabs>
+          <w:tab w:val="num" w:pos="4320"/>
+        </w:tabs>
+        <w:ind w:left="4320" w:hanging="360"/>
+      </w:pPr>
+      <w:rPr>
+        <w:rFonts w:ascii="Wingdings" w:hAnsi="Wingdings" w:hint="default"/>
+        <w:sz w:val="20"/>
+      </w:rPr>
+    </w:lvl>
+    <w:lvl w:ilvl="6" w:tentative="1">
+      <w:start w:val="1"/>
+      <w:numFmt w:val="bullet"/>
+      <w:lvlText w:val=""/>
+      <w:lvlJc w:val="left"/>
+      <w:pPr>
+        <w:tabs>
+          <w:tab w:val="num" w:pos="5040"/>
+        </w:tabs>
+        <w:ind w:left="5040" w:hanging="360"/>
+      </w:pPr>
+      <w:rPr>
+        <w:rFonts w:ascii="Wingdings" w:hAnsi="Wingdings" w:hint="default"/>
+        <w:sz w:val="20"/>
+      </w:rPr>
+    </w:lvl>
+    <w:lvl w:ilvl="7" w:tentative="1">
+      <w:start w:val="1"/>
+      <w:numFmt w:val="bullet"/>
+      <w:lvlText w:val=""/>
+      <w:lvlJc w:val="left"/>
+      <w:pPr>
+        <w:tabs>
+          <w:tab w:val="num" w:pos="5760"/>
+        </w:tabs>
+        <w:ind w:left="5760" w:hanging="360"/>
+      </w:pPr>
+      <w:rPr>
+        <w:rFonts w:ascii="Wingdings" w:hAnsi="Wingdings" w:hint="default"/>
+        <w:sz w:val="20"/>
+      </w:rPr>
+    </w:lvl>
+    <w:lvl w:ilvl="8" w:tentative="1">
+      <w:start w:val="1"/>
+      <w:numFmt w:val="bullet"/>
+      <w:lvlText w:val=""/>
+      <w:lvlJc w:val="left"/>
+      <w:pPr>
+        <w:tabs>
+          <w:tab w:val="num" w:pos="6480"/>
+        </w:tabs>
+        <w:ind w:left="6480" w:hanging="360"/>
+      </w:pPr>
+      <w:rPr>
+        <w:rFonts w:ascii="Wingdings" w:hAnsi="Wingdings" w:hint="default"/>
+        <w:sz w:val="20"/>
+      </w:rPr>
+    </w:lvl>
+  </w:abstractNum>
+  <w:abstractNum w:abstractNumId="7" w15:restartNumberingAfterBreak="0">
     <w:nsid w:val="40DD1A90"/>
     <w:multiLevelType w:val="multilevel"/>
     <w:tmpl w:val="6E5C174A"/>
@@ -3221,7 +6280,7 @@
       </w:rPr>
     </w:lvl>
   </w:abstractNum>
-  <w:abstractNum w:abstractNumId="7" w15:restartNumberingAfterBreak="0">
+  <w:abstractNum w:abstractNumId="8" w15:restartNumberingAfterBreak="0">
     <w:nsid w:val="43722CF5"/>
     <w:multiLevelType w:val="hybridMultilevel"/>
     <w:tmpl w:val="7CCAC0E6"/>
@@ -3307,7 +6366,7 @@
       </w:pPr>
     </w:lvl>
   </w:abstractNum>
-  <w:abstractNum w:abstractNumId="8" w15:restartNumberingAfterBreak="0">
+  <w:abstractNum w:abstractNumId="9" w15:restartNumberingAfterBreak="0">
     <w:nsid w:val="4D4940A8"/>
     <w:multiLevelType w:val="hybridMultilevel"/>
     <w:tmpl w:val="4FEC69F0"/>
@@ -3421,7 +6480,7 @@
       </w:rPr>
     </w:lvl>
   </w:abstractNum>
-  <w:abstractNum w:abstractNumId="9" w15:restartNumberingAfterBreak="0">
+  <w:abstractNum w:abstractNumId="10" w15:restartNumberingAfterBreak="0">
     <w:nsid w:val="4F397A1C"/>
     <w:multiLevelType w:val="multilevel"/>
     <w:tmpl w:val="CCDA827E"/>
@@ -3570,7 +6629,7 @@
       </w:rPr>
     </w:lvl>
   </w:abstractNum>
-  <w:abstractNum w:abstractNumId="10" w15:restartNumberingAfterBreak="0">
+  <w:abstractNum w:abstractNumId="11" w15:restartNumberingAfterBreak="0">
     <w:nsid w:val="54174C12"/>
     <w:multiLevelType w:val="multilevel"/>
     <w:tmpl w:val="15B62650"/>
@@ -3701,7 +6760,120 @@
       </w:rPr>
     </w:lvl>
   </w:abstractNum>
-  <w:abstractNum w:abstractNumId="11" w15:restartNumberingAfterBreak="0">
+  <w:abstractNum w:abstractNumId="12" w15:restartNumberingAfterBreak="0">
+    <w:nsid w:val="541E3E43"/>
+    <w:multiLevelType w:val="hybridMultilevel"/>
+    <w:tmpl w:val="A476F06A"/>
+    <w:lvl w:ilvl="0" w:tplc="300A0001">
+      <w:start w:val="1"/>
+      <w:numFmt w:val="bullet"/>
+      <w:lvlText w:val=""/>
+      <w:lvlJc w:val="left"/>
+      <w:pPr>
+        <w:ind w:left="720" w:hanging="360"/>
+      </w:pPr>
+      <w:rPr>
+        <w:rFonts w:ascii="Symbol" w:hAnsi="Symbol" w:hint="default"/>
+      </w:rPr>
+    </w:lvl>
+    <w:lvl w:ilvl="1" w:tplc="300A0003" w:tentative="1">
+      <w:start w:val="1"/>
+      <w:numFmt w:val="bullet"/>
+      <w:lvlText w:val="o"/>
+      <w:lvlJc w:val="left"/>
+      <w:pPr>
+        <w:ind w:left="1440" w:hanging="360"/>
+      </w:pPr>
+      <w:rPr>
+        <w:rFonts w:ascii="Courier New" w:hAnsi="Courier New" w:cs="Courier New" w:hint="default"/>
+      </w:rPr>
+    </w:lvl>
+    <w:lvl w:ilvl="2" w:tplc="300A0005" w:tentative="1">
+      <w:start w:val="1"/>
+      <w:numFmt w:val="bullet"/>
+      <w:lvlText w:val=""/>
+      <w:lvlJc w:val="left"/>
+      <w:pPr>
+        <w:ind w:left="2160" w:hanging="360"/>
+      </w:pPr>
+      <w:rPr>
+        <w:rFonts w:ascii="Wingdings" w:hAnsi="Wingdings" w:hint="default"/>
+      </w:rPr>
+    </w:lvl>
+    <w:lvl w:ilvl="3" w:tplc="300A0001" w:tentative="1">
+      <w:start w:val="1"/>
+      <w:numFmt w:val="bullet"/>
+      <w:lvlText w:val=""/>
+      <w:lvlJc w:val="left"/>
+      <w:pPr>
+        <w:ind w:left="2880" w:hanging="360"/>
+      </w:pPr>
+      <w:rPr>
+        <w:rFonts w:ascii="Symbol" w:hAnsi="Symbol" w:hint="default"/>
+      </w:rPr>
+    </w:lvl>
+    <w:lvl w:ilvl="4" w:tplc="300A0003" w:tentative="1">
+      <w:start w:val="1"/>
+      <w:numFmt w:val="bullet"/>
+      <w:lvlText w:val="o"/>
+      <w:lvlJc w:val="left"/>
+      <w:pPr>
+        <w:ind w:left="3600" w:hanging="360"/>
+      </w:pPr>
+      <w:rPr>
+        <w:rFonts w:ascii="Courier New" w:hAnsi="Courier New" w:cs="Courier New" w:hint="default"/>
+      </w:rPr>
+    </w:lvl>
+    <w:lvl w:ilvl="5" w:tplc="300A0005" w:tentative="1">
+      <w:start w:val="1"/>
+      <w:numFmt w:val="bullet"/>
+      <w:lvlText w:val=""/>
+      <w:lvlJc w:val="left"/>
+      <w:pPr>
+        <w:ind w:left="4320" w:hanging="360"/>
+      </w:pPr>
+      <w:rPr>
+        <w:rFonts w:ascii="Wingdings" w:hAnsi="Wingdings" w:hint="default"/>
+      </w:rPr>
+    </w:lvl>
+    <w:lvl w:ilvl="6" w:tplc="300A0001" w:tentative="1">
+      <w:start w:val="1"/>
+      <w:numFmt w:val="bullet"/>
+      <w:lvlText w:val=""/>
+      <w:lvlJc w:val="left"/>
+      <w:pPr>
+        <w:ind w:left="5040" w:hanging="360"/>
+      </w:pPr>
+      <w:rPr>
+        <w:rFonts w:ascii="Symbol" w:hAnsi="Symbol" w:hint="default"/>
+      </w:rPr>
+    </w:lvl>
+    <w:lvl w:ilvl="7" w:tplc="300A0003" w:tentative="1">
+      <w:start w:val="1"/>
+      <w:numFmt w:val="bullet"/>
+      <w:lvlText w:val="o"/>
+      <w:lvlJc w:val="left"/>
+      <w:pPr>
+        <w:ind w:left="5760" w:hanging="360"/>
+      </w:pPr>
+      <w:rPr>
+        <w:rFonts w:ascii="Courier New" w:hAnsi="Courier New" w:cs="Courier New" w:hint="default"/>
+      </w:rPr>
+    </w:lvl>
+    <w:lvl w:ilvl="8" w:tplc="300A0005" w:tentative="1">
+      <w:start w:val="1"/>
+      <w:numFmt w:val="bullet"/>
+      <w:lvlText w:val=""/>
+      <w:lvlJc w:val="left"/>
+      <w:pPr>
+        <w:ind w:left="6480" w:hanging="360"/>
+      </w:pPr>
+      <w:rPr>
+        <w:rFonts w:ascii="Wingdings" w:hAnsi="Wingdings" w:hint="default"/>
+      </w:rPr>
+    </w:lvl>
+  </w:abstractNum>
+  <w:abstractNum w:abstractNumId="13" w15:restartNumberingAfterBreak="0">
     <w:nsid w:val="54517D06"/>
     <w:multiLevelType w:val="hybridMultilevel"/>
     <w:tmpl w:val="3DB0EB80"/>
@@ -3813,7 +6985,7 @@
       </w:rPr>
     </w:lvl>
   </w:abstractNum>
-  <w:abstractNum w:abstractNumId="12" w15:restartNumberingAfterBreak="0">
+  <w:abstractNum w:abstractNumId="14" w15:restartNumberingAfterBreak="0">
     <w:nsid w:val="68E15795"/>
     <w:multiLevelType w:val="hybridMultilevel"/>
     <w:tmpl w:val="8FE616A0"/>
@@ -3926,7 +7098,7 @@
       </w:rPr>
     </w:lvl>
   </w:abstractNum>
-  <w:abstractNum w:abstractNumId="13" w15:restartNumberingAfterBreak="0">
+  <w:abstractNum w:abstractNumId="15" w15:restartNumberingAfterBreak="0">
     <w:nsid w:val="6AFC07D3"/>
     <w:multiLevelType w:val="multilevel"/>
     <w:tmpl w:val="B3426C00"/>
@@ -4039,7 +7211,7 @@
       </w:rPr>
     </w:lvl>
   </w:abstractNum>
-  <w:abstractNum w:abstractNumId="14" w15:restartNumberingAfterBreak="0">
+  <w:abstractNum w:abstractNumId="16" w15:restartNumberingAfterBreak="0">
     <w:nsid w:val="6B7B1E92"/>
     <w:multiLevelType w:val="multilevel"/>
     <w:tmpl w:val="21BA233E"/>
@@ -4170,7 +7342,7 @@
       </w:rPr>
     </w:lvl>
   </w:abstractNum>
-  <w:abstractNum w:abstractNumId="15" w15:restartNumberingAfterBreak="0">
+  <w:abstractNum w:abstractNumId="17" w15:restartNumberingAfterBreak="0">
     <w:nsid w:val="6FA144D3"/>
     <w:multiLevelType w:val="multilevel"/>
     <w:tmpl w:val="98CEB7D6"/>
@@ -4291,7 +7463,7 @@
       </w:rPr>
     </w:lvl>
   </w:abstractNum>
-  <w:abstractNum w:abstractNumId="16" w15:restartNumberingAfterBreak="0">
+  <w:abstractNum w:abstractNumId="18" w15:restartNumberingAfterBreak="0">
     <w:nsid w:val="738344F2"/>
     <w:multiLevelType w:val="hybridMultilevel"/>
     <w:tmpl w:val="C4E037F2"/>
@@ -4406,7 +7578,7 @@
       </w:rPr>
     </w:lvl>
   </w:abstractNum>
-  <w:abstractNum w:abstractNumId="17" w15:restartNumberingAfterBreak="0">
+  <w:abstractNum w:abstractNumId="19" w15:restartNumberingAfterBreak="0">
     <w:nsid w:val="74B1685F"/>
     <w:multiLevelType w:val="hybridMultilevel"/>
     <w:tmpl w:val="943E89B2"/>
@@ -4519,7 +7691,7 @@
       </w:rPr>
     </w:lvl>
   </w:abstractNum>
-  <w:abstractNum w:abstractNumId="18" w15:restartNumberingAfterBreak="0">
+  <w:abstractNum w:abstractNumId="20" w15:restartNumberingAfterBreak="0">
     <w:nsid w:val="75DB1EAD"/>
     <w:multiLevelType w:val="multilevel"/>
     <w:tmpl w:val="F2B0D608"/>
@@ -4632,7 +7804,7 @@
       </w:rPr>
     </w:lvl>
   </w:abstractNum>
-  <w:abstractNum w:abstractNumId="19" w15:restartNumberingAfterBreak="0">
+  <w:abstractNum w:abstractNumId="21" w15:restartNumberingAfterBreak="0">
     <w:nsid w:val="77694BC3"/>
     <w:multiLevelType w:val="hybridMultilevel"/>
     <w:tmpl w:val="8D0A3582"/>
@@ -4745,7 +7917,7 @@
       </w:rPr>
     </w:lvl>
   </w:abstractNum>
-  <w:abstractNum w:abstractNumId="20" w15:restartNumberingAfterBreak="0">
+  <w:abstractNum w:abstractNumId="22" w15:restartNumberingAfterBreak="0">
     <w:nsid w:val="7CE94054"/>
     <w:multiLevelType w:val="multilevel"/>
     <w:tmpl w:val="A4D4C1F2"/>
@@ -4860,31 +8032,31 @@
     </w:lvl>
   </w:abstractNum>
   <w:num w:numId="1" w16cid:durableId="1688293536">
-    <w:abstractNumId w:val="6"/>
+    <w:abstractNumId w:val="7"/>
   </w:num>
   <w:num w:numId="2" w16cid:durableId="1960333347">
+    <w:abstractNumId w:val="18"/>
+  </w:num>
+  <w:num w:numId="3" w16cid:durableId="775832724">
+    <w:abstractNumId w:val="17"/>
+  </w:num>
+  <w:num w:numId="4" w16cid:durableId="1758014337">
+    <w:abstractNumId w:val="15"/>
+  </w:num>
+  <w:num w:numId="5" w16cid:durableId="2060394031">
+    <w:abstractNumId w:val="22"/>
+  </w:num>
+  <w:num w:numId="6" w16cid:durableId="1383091774">
+    <w:abstractNumId w:val="11"/>
+  </w:num>
+  <w:num w:numId="7" w16cid:durableId="1086195695">
     <w:abstractNumId w:val="16"/>
   </w:num>
-  <w:num w:numId="3" w16cid:durableId="775832724">
-    <w:abstractNumId w:val="15"/>
-  </w:num>
-  <w:num w:numId="4" w16cid:durableId="1758014337">
-    <w:abstractNumId w:val="13"/>
-  </w:num>
-  <w:num w:numId="5" w16cid:durableId="2060394031">
+  <w:num w:numId="8" w16cid:durableId="346755141">
     <w:abstractNumId w:val="20"/>
   </w:num>
-  <w:num w:numId="6" w16cid:durableId="1383091774">
-    <w:abstractNumId w:val="10"/>
-  </w:num>
-  <w:num w:numId="7" w16cid:durableId="1086195695">
-    <w:abstractNumId w:val="14"/>
-  </w:num>
-  <w:num w:numId="8" w16cid:durableId="346755141">
-    <w:abstractNumId w:val="18"/>
-  </w:num>
   <w:num w:numId="9" w16cid:durableId="373849631">
-    <w:abstractNumId w:val="19"/>
+    <w:abstractNumId w:val="21"/>
   </w:num>
   <w:num w:numId="10" w16cid:durableId="231741497">
     <w:abstractNumId w:val="1"/>
@@ -4893,34 +8065,40 @@
     <w:abstractNumId w:val="3"/>
   </w:num>
   <w:num w:numId="12" w16cid:durableId="216628335">
-    <w:abstractNumId w:val="11"/>
+    <w:abstractNumId w:val="13"/>
   </w:num>
   <w:num w:numId="13" w16cid:durableId="1391075146">
     <w:abstractNumId w:val="5"/>
   </w:num>
   <w:num w:numId="14" w16cid:durableId="819540947">
-    <w:abstractNumId w:val="8"/>
+    <w:abstractNumId w:val="9"/>
   </w:num>
   <w:num w:numId="15" w16cid:durableId="745344283">
     <w:abstractNumId w:val="0"/>
   </w:num>
   <w:num w:numId="16" w16cid:durableId="1083919667">
-    <w:abstractNumId w:val="17"/>
+    <w:abstractNumId w:val="19"/>
   </w:num>
   <w:num w:numId="17" w16cid:durableId="1545096875">
-    <w:abstractNumId w:val="12"/>
+    <w:abstractNumId w:val="14"/>
   </w:num>
   <w:num w:numId="18" w16cid:durableId="1263564817">
     <w:abstractNumId w:val="2"/>
   </w:num>
   <w:num w:numId="19" w16cid:durableId="1845586834">
-    <w:abstractNumId w:val="9"/>
+    <w:abstractNumId w:val="10"/>
   </w:num>
   <w:num w:numId="20" w16cid:durableId="1491092731">
     <w:abstractNumId w:val="4"/>
   </w:num>
   <w:num w:numId="21" w16cid:durableId="1128548832">
-    <w:abstractNumId w:val="7"/>
+    <w:abstractNumId w:val="8"/>
+  </w:num>
+  <w:num w:numId="22" w16cid:durableId="194463967">
+    <w:abstractNumId w:val="12"/>
+  </w:num>
+  <w:num w:numId="23" w16cid:durableId="1973945393">
+    <w:abstractNumId w:val="6"/>
   </w:num>
 </w:numbering>
 </file>

</xml_diff>

<commit_message>
tercer commit en bash: se finaliza el trabajo de la actividad en la plantilla y se realizan ultimos detalles para convertir en pdf
</commit_message>
<xml_diff>
--- a/Actividad_n1_Miguel_Salazar_Reina.docx
+++ b/Actividad_n1_Miguel_Salazar_Reina.docx
@@ -1862,7 +1862,7 @@
         </w:rPr>
         <w:lastRenderedPageBreak/>
         <w:drawing>
-          <wp:inline distT="0" distB="0" distL="0" distR="0" wp14:anchorId="4706287D" wp14:editId="2EA5AE4D">
+          <wp:inline distT="0" distB="0" distL="0" distR="0" wp14:anchorId="4706287D" wp14:editId="59A24EC5">
             <wp:extent cx="5514063" cy="3962400"/>
             <wp:effectExtent l="0" t="0" r="0" b="0"/>
             <wp:docPr id="295975701" name="Imagen 2"/>
@@ -2170,7 +2170,7 @@
           <w:noProof/>
         </w:rPr>
         <w:drawing>
-          <wp:inline distT="0" distB="0" distL="0" distR="0" wp14:anchorId="62EF2DF1" wp14:editId="22381D38">
+          <wp:inline distT="0" distB="0" distL="0" distR="0" wp14:anchorId="62EF2DF1" wp14:editId="6928B485">
             <wp:extent cx="4991100" cy="2204720"/>
             <wp:effectExtent l="0" t="0" r="0" b="5080"/>
             <wp:docPr id="1499597852" name="Imagen 4"/>
@@ -2328,7 +2328,7 @@
           <w:noProof/>
         </w:rPr>
         <w:drawing>
-          <wp:inline distT="0" distB="0" distL="0" distR="0" wp14:anchorId="12B75CC7" wp14:editId="3980EE06">
+          <wp:inline distT="0" distB="0" distL="0" distR="0" wp14:anchorId="12B75CC7" wp14:editId="57EAE38E">
             <wp:extent cx="4719234" cy="2585487"/>
             <wp:effectExtent l="0" t="0" r="5715" b="5715"/>
             <wp:docPr id="2142752960" name="Imagen 5"/>
@@ -3401,6 +3401,7 @@
       <w:r>
         <w:rPr>
           <w:rFonts w:ascii="Times New Roman" w:hAnsi="Times New Roman" w:cs="Times New Roman"/>
+          <w:noProof/>
           <w:lang w:eastAsia="es-EC"/>
         </w:rPr>
         <w:lastRenderedPageBreak/>
@@ -3628,6 +3629,7 @@
       <w:r>
         <w:rPr>
           <w:rFonts w:ascii="Times New Roman" w:hAnsi="Times New Roman" w:cs="Times New Roman"/>
+          <w:noProof/>
           <w:lang w:eastAsia="es-EC"/>
         </w:rPr>
         <w:drawing>
@@ -3710,6 +3712,622 @@
       <w:pPr>
         <w:rPr>
           <w:rFonts w:ascii="Times New Roman" w:hAnsi="Times New Roman" w:cs="Times New Roman"/>
+          <w:lang w:eastAsia="es-EC"/>
+        </w:rPr>
+      </w:pPr>
+      <w:r>
+        <w:rPr>
+          <w:rFonts w:ascii="Times New Roman" w:hAnsi="Times New Roman" w:cs="Times New Roman"/>
+          <w:lang w:eastAsia="es-EC"/>
+        </w:rPr>
+        <w:t>En la segunda etapa se realizarán las modificaciones correspondientes a la plantilla inicial, incorporando el contenido desarrollado para la actividad.</w:t>
+      </w:r>
+    </w:p>
+    <w:p>
+      <w:pPr>
+        <w:rPr>
+          <w:rFonts w:ascii="Times New Roman" w:hAnsi="Times New Roman" w:cs="Times New Roman"/>
+          <w:lang w:eastAsia="es-EC"/>
+        </w:rPr>
+      </w:pPr>
+      <w:r>
+        <w:rPr>
+          <w:rFonts w:ascii="Times New Roman" w:hAnsi="Times New Roman" w:cs="Times New Roman"/>
+          <w:lang w:eastAsia="es-EC"/>
+        </w:rPr>
+        <w:t>Una vez realizados los cambios, se utilizará nuevamente el flujo:</w:t>
+      </w:r>
+    </w:p>
+    <w:p>
+      <w:pPr>
+        <w:rPr>
+          <w:rFonts w:ascii="Times New Roman" w:hAnsi="Times New Roman" w:cs="Times New Roman"/>
+          <w:lang w:eastAsia="es-EC"/>
+        </w:rPr>
+      </w:pPr>
+      <w:proofErr w:type="spellStart"/>
+      <w:r>
+        <w:rPr>
+          <w:rFonts w:ascii="Times New Roman" w:hAnsi="Times New Roman" w:cs="Times New Roman"/>
+          <w:lang w:eastAsia="es-EC"/>
+        </w:rPr>
+        <w:t>git</w:t>
+      </w:r>
+      <w:proofErr w:type="spellEnd"/>
+      <w:r>
+        <w:rPr>
+          <w:rFonts w:ascii="Times New Roman" w:hAnsi="Times New Roman" w:cs="Times New Roman"/>
+          <w:lang w:eastAsia="es-EC"/>
+        </w:rPr>
+        <w:t xml:space="preserve"> </w:t>
+      </w:r>
+      <w:proofErr w:type="spellStart"/>
+      <w:proofErr w:type="gramStart"/>
+      <w:r>
+        <w:rPr>
+          <w:rFonts w:ascii="Times New Roman" w:hAnsi="Times New Roman" w:cs="Times New Roman"/>
+          <w:lang w:eastAsia="es-EC"/>
+        </w:rPr>
+        <w:t>add</w:t>
+      </w:r>
+      <w:proofErr w:type="spellEnd"/>
+      <w:r>
+        <w:rPr>
+          <w:rFonts w:ascii="Times New Roman" w:hAnsi="Times New Roman" w:cs="Times New Roman"/>
+          <w:lang w:eastAsia="es-EC"/>
+        </w:rPr>
+        <w:t xml:space="preserve"> .</w:t>
+      </w:r>
+      <w:proofErr w:type="gramEnd"/>
+    </w:p>
+    <w:p>
+      <w:pPr>
+        <w:rPr>
+          <w:rFonts w:ascii="Times New Roman" w:hAnsi="Times New Roman" w:cs="Times New Roman"/>
+          <w:lang w:eastAsia="es-EC"/>
+        </w:rPr>
+      </w:pPr>
+      <w:proofErr w:type="spellStart"/>
+      <w:r>
+        <w:rPr>
+          <w:rFonts w:ascii="Times New Roman" w:hAnsi="Times New Roman" w:cs="Times New Roman"/>
+          <w:lang w:eastAsia="es-EC"/>
+        </w:rPr>
+        <w:t>git</w:t>
+      </w:r>
+      <w:proofErr w:type="spellEnd"/>
+      <w:r>
+        <w:rPr>
+          <w:rFonts w:ascii="Times New Roman" w:hAnsi="Times New Roman" w:cs="Times New Roman"/>
+          <w:lang w:eastAsia="es-EC"/>
+        </w:rPr>
+        <w:t xml:space="preserve"> </w:t>
+      </w:r>
+      <w:proofErr w:type="spellStart"/>
+      <w:r>
+        <w:rPr>
+          <w:rFonts w:ascii="Times New Roman" w:hAnsi="Times New Roman" w:cs="Times New Roman"/>
+          <w:lang w:eastAsia="es-EC"/>
+        </w:rPr>
+        <w:t>commit</w:t>
+      </w:r>
+      <w:proofErr w:type="spellEnd"/>
+      <w:r>
+        <w:rPr>
+          <w:rFonts w:ascii="Times New Roman" w:hAnsi="Times New Roman" w:cs="Times New Roman"/>
+          <w:lang w:eastAsia="es-EC"/>
+        </w:rPr>
+        <w:t xml:space="preserve"> -m "</w:t>
+      </w:r>
+      <w:proofErr w:type="spellStart"/>
+      <w:r>
+        <w:rPr>
+          <w:rFonts w:ascii="Times New Roman" w:hAnsi="Times New Roman" w:cs="Times New Roman"/>
+          <w:lang w:eastAsia="es-EC"/>
+        </w:rPr>
+        <w:t>commit</w:t>
+      </w:r>
+      <w:proofErr w:type="spellEnd"/>
+      <w:r>
+        <w:rPr>
+          <w:rFonts w:ascii="Times New Roman" w:hAnsi="Times New Roman" w:cs="Times New Roman"/>
+          <w:lang w:eastAsia="es-EC"/>
+        </w:rPr>
+        <w:t xml:space="preserve"> segundo en </w:t>
+      </w:r>
+      <w:proofErr w:type="spellStart"/>
+      <w:r>
+        <w:rPr>
+          <w:rFonts w:ascii="Times New Roman" w:hAnsi="Times New Roman" w:cs="Times New Roman"/>
+          <w:lang w:eastAsia="es-EC"/>
+        </w:rPr>
+        <w:t>gitbash</w:t>
+      </w:r>
+      <w:proofErr w:type="spellEnd"/>
+      <w:r>
+        <w:rPr>
+          <w:rFonts w:ascii="Times New Roman" w:hAnsi="Times New Roman" w:cs="Times New Roman"/>
+          <w:lang w:eastAsia="es-EC"/>
+        </w:rPr>
+        <w:t>: Se edita la platilla para el informe y darle estructura"</w:t>
+      </w:r>
+    </w:p>
+    <w:p>
+      <w:pPr>
+        <w:rPr>
+          <w:rFonts w:ascii="Times New Roman" w:hAnsi="Times New Roman" w:cs="Times New Roman"/>
+          <w:lang w:eastAsia="es-EC"/>
+        </w:rPr>
+      </w:pPr>
+      <w:proofErr w:type="spellStart"/>
+      <w:r>
+        <w:rPr>
+          <w:rFonts w:ascii="Times New Roman" w:hAnsi="Times New Roman" w:cs="Times New Roman"/>
+          <w:lang w:eastAsia="es-EC"/>
+        </w:rPr>
+        <w:t>git</w:t>
+      </w:r>
+      <w:proofErr w:type="spellEnd"/>
+      <w:r>
+        <w:rPr>
+          <w:rFonts w:ascii="Times New Roman" w:hAnsi="Times New Roman" w:cs="Times New Roman"/>
+          <w:lang w:eastAsia="es-EC"/>
+        </w:rPr>
+        <w:t xml:space="preserve"> </w:t>
+      </w:r>
+      <w:proofErr w:type="spellStart"/>
+      <w:r>
+        <w:rPr>
+          <w:rFonts w:ascii="Times New Roman" w:hAnsi="Times New Roman" w:cs="Times New Roman"/>
+          <w:lang w:eastAsia="es-EC"/>
+        </w:rPr>
+        <w:t>push</w:t>
+      </w:r>
+      <w:proofErr w:type="spellEnd"/>
+    </w:p>
+    <w:p>
+      <w:pPr>
+        <w:rPr>
+          <w:rFonts w:ascii="Times New Roman" w:hAnsi="Times New Roman" w:cs="Times New Roman"/>
+          <w:b/>
+          <w:bCs/>
+          <w:lang w:eastAsia="es-EC"/>
+        </w:rPr>
+      </w:pPr>
+      <w:r>
+        <w:rPr>
+          <w:noProof/>
+        </w:rPr>
+        <w:lastRenderedPageBreak/>
+        <w:drawing>
+          <wp:inline distT="0" distB="0" distL="0" distR="0" wp14:anchorId="179FC28C" wp14:editId="611CA04B">
+            <wp:extent cx="5385435" cy="3417376"/>
+            <wp:effectExtent l="0" t="0" r="5715" b="0"/>
+            <wp:docPr id="1207539855" name="Imagen 2"/>
+            <wp:cNvGraphicFramePr>
+              <a:graphicFrameLocks xmlns:a="http://schemas.openxmlformats.org/drawingml/2006/main" noChangeAspect="1"/>
+            </wp:cNvGraphicFramePr>
+            <a:graphic xmlns:a="http://schemas.openxmlformats.org/drawingml/2006/main">
+              <a:graphicData uri="http://schemas.openxmlformats.org/drawingml/2006/picture">
+                <pic:pic xmlns:pic="http://schemas.openxmlformats.org/drawingml/2006/picture">
+                  <pic:nvPicPr>
+                    <pic:cNvPr id="0" name="Picture 3"/>
+                    <pic:cNvPicPr>
+                      <a:picLocks noChangeAspect="1" noChangeArrowheads="1"/>
+                    </pic:cNvPicPr>
+                  </pic:nvPicPr>
+                  <pic:blipFill rotWithShape="1">
+                    <a:blip r:embed="rId23">
+                      <a:extLst>
+                        <a:ext uri="{28A0092B-C50C-407E-A947-70E740481C1C}">
+                          <a14:useLocalDpi xmlns:a14="http://schemas.microsoft.com/office/drawing/2010/main" val="0"/>
+                        </a:ext>
+                      </a:extLst>
+                    </a:blip>
+                    <a:srcRect r="46617" b="31641"/>
+                    <a:stretch>
+                      <a:fillRect/>
+                    </a:stretch>
+                  </pic:blipFill>
+                  <pic:spPr bwMode="auto">
+                    <a:xfrm>
+                      <a:off x="0" y="0"/>
+                      <a:ext cx="5395938" cy="3424041"/>
+                    </a:xfrm>
+                    <a:prstGeom prst="rect">
+                      <a:avLst/>
+                    </a:prstGeom>
+                    <a:noFill/>
+                    <a:ln>
+                      <a:noFill/>
+                    </a:ln>
+                    <a:extLst>
+                      <a:ext uri="{53640926-AAD7-44D8-BBD7-CCE9431645EC}">
+                        <a14:shadowObscured xmlns:a14="http://schemas.microsoft.com/office/drawing/2010/main"/>
+                      </a:ext>
+                    </a:extLst>
+                  </pic:spPr>
+                </pic:pic>
+              </a:graphicData>
+            </a:graphic>
+          </wp:inline>
+        </w:drawing>
+      </w:r>
+    </w:p>
+    <w:p>
+      <w:pPr>
+        <w:rPr>
+          <w:rFonts w:ascii="Times New Roman" w:hAnsi="Times New Roman" w:cs="Times New Roman"/>
+          <w:b/>
+          <w:bCs/>
+          <w:lang w:eastAsia="es-EC"/>
+        </w:rPr>
+      </w:pPr>
+      <w:r>
+        <w:rPr>
+          <w:rFonts w:ascii="Times New Roman" w:hAnsi="Times New Roman" w:cs="Times New Roman"/>
+          <w:b/>
+          <w:bCs/>
+          <w:lang w:eastAsia="es-EC"/>
+        </w:rPr>
+        <w:drawing>
+          <wp:inline distT="0" distB="0" distL="0" distR="0" wp14:anchorId="655B6B2F" wp14:editId="67281FD4">
+            <wp:extent cx="5400040" cy="1160145"/>
+            <wp:effectExtent l="0" t="0" r="0" b="1905"/>
+            <wp:docPr id="6322214" name="Imagen 1"/>
+            <wp:cNvGraphicFramePr>
+              <a:graphicFrameLocks xmlns:a="http://schemas.openxmlformats.org/drawingml/2006/main" noChangeAspect="1"/>
+            </wp:cNvGraphicFramePr>
+            <a:graphic xmlns:a="http://schemas.openxmlformats.org/drawingml/2006/main">
+              <a:graphicData uri="http://schemas.openxmlformats.org/drawingml/2006/picture">
+                <pic:pic xmlns:pic="http://schemas.openxmlformats.org/drawingml/2006/picture">
+                  <pic:nvPicPr>
+                    <pic:cNvPr id="6322214" name=""/>
+                    <pic:cNvPicPr/>
+                  </pic:nvPicPr>
+                  <pic:blipFill>
+                    <a:blip r:embed="rId24"/>
+                    <a:stretch>
+                      <a:fillRect/>
+                    </a:stretch>
+                  </pic:blipFill>
+                  <pic:spPr>
+                    <a:xfrm>
+                      <a:off x="0" y="0"/>
+                      <a:ext cx="5400040" cy="1160145"/>
+                    </a:xfrm>
+                    <a:prstGeom prst="rect">
+                      <a:avLst/>
+                    </a:prstGeom>
+                  </pic:spPr>
+                </pic:pic>
+              </a:graphicData>
+            </a:graphic>
+          </wp:inline>
+        </w:drawing>
+      </w:r>
+    </w:p>
+    <w:p>
+      <w:pPr>
+        <w:rPr>
+          <w:rFonts w:ascii="Times New Roman" w:hAnsi="Times New Roman" w:cs="Times New Roman"/>
+          <w:b/>
+          <w:bCs/>
+          <w:lang w:eastAsia="es-EC"/>
+        </w:rPr>
+      </w:pPr>
+      <w:r>
+        <w:rPr>
+          <w:rFonts w:ascii="Times New Roman" w:hAnsi="Times New Roman" w:cs="Times New Roman"/>
+          <w:b/>
+          <w:bCs/>
+          <w:lang w:eastAsia="es-EC"/>
+        </w:rPr>
+        <w:t xml:space="preserve">9.3 Tercer </w:t>
+      </w:r>
+      <w:proofErr w:type="spellStart"/>
+      <w:r>
+        <w:rPr>
+          <w:rFonts w:ascii="Times New Roman" w:hAnsi="Times New Roman" w:cs="Times New Roman"/>
+          <w:b/>
+          <w:bCs/>
+          <w:lang w:eastAsia="es-EC"/>
+        </w:rPr>
+        <w:t>commit</w:t>
+      </w:r>
+      <w:proofErr w:type="spellEnd"/>
+      <w:r>
+        <w:rPr>
+          <w:rFonts w:ascii="Times New Roman" w:hAnsi="Times New Roman" w:cs="Times New Roman"/>
+          <w:b/>
+          <w:bCs/>
+          <w:lang w:eastAsia="es-EC"/>
+        </w:rPr>
+        <w:t>: trabajo finalizado</w:t>
+      </w:r>
+    </w:p>
+    <w:p>
+      <w:pPr>
+        <w:rPr>
+          <w:rFonts w:ascii="Times New Roman" w:hAnsi="Times New Roman" w:cs="Times New Roman"/>
+          <w:b/>
+          <w:bCs/>
+          <w:lang w:eastAsia="es-EC"/>
+        </w:rPr>
+      </w:pPr>
+      <w:r>
+        <w:rPr>
+          <w:rFonts w:ascii="Times New Roman" w:hAnsi="Times New Roman" w:cs="Times New Roman"/>
+          <w:b/>
+          <w:bCs/>
+          <w:lang w:eastAsia="es-EC"/>
+        </w:rPr>
+        <w:t>En la tercera etapa se registrará la finalización del contenido principal de la actividad.</w:t>
+      </w:r>
+    </w:p>
+    <w:p>
+      <w:pPr>
+        <w:rPr>
+          <w:rFonts w:ascii="Times New Roman" w:hAnsi="Times New Roman" w:cs="Times New Roman"/>
+          <w:b/>
+          <w:bCs/>
+          <w:lang w:eastAsia="es-EC"/>
+        </w:rPr>
+      </w:pPr>
+      <w:r>
+        <w:rPr>
+          <w:rFonts w:ascii="Times New Roman" w:hAnsi="Times New Roman" w:cs="Times New Roman"/>
+          <w:b/>
+          <w:bCs/>
+          <w:lang w:eastAsia="es-EC"/>
+        </w:rPr>
+        <w:t>Después de verificar el informe, se ejecutará:</w:t>
+      </w:r>
+    </w:p>
+    <w:p>
+      <w:pPr>
+        <w:rPr>
+          <w:rFonts w:ascii="Times New Roman" w:hAnsi="Times New Roman" w:cs="Times New Roman"/>
+          <w:b/>
+          <w:bCs/>
+          <w:lang w:eastAsia="es-EC"/>
+        </w:rPr>
+      </w:pPr>
+      <w:proofErr w:type="spellStart"/>
+      <w:r>
+        <w:rPr>
+          <w:rFonts w:ascii="Times New Roman" w:hAnsi="Times New Roman" w:cs="Times New Roman"/>
+          <w:b/>
+          <w:bCs/>
+          <w:lang w:eastAsia="es-EC"/>
+        </w:rPr>
+        <w:t>git</w:t>
+      </w:r>
+      <w:proofErr w:type="spellEnd"/>
+      <w:r>
+        <w:rPr>
+          <w:rFonts w:ascii="Times New Roman" w:hAnsi="Times New Roman" w:cs="Times New Roman"/>
+          <w:b/>
+          <w:bCs/>
+          <w:lang w:eastAsia="es-EC"/>
+        </w:rPr>
+        <w:t xml:space="preserve"> </w:t>
+      </w:r>
+      <w:proofErr w:type="spellStart"/>
+      <w:proofErr w:type="gramStart"/>
+      <w:r>
+        <w:rPr>
+          <w:rFonts w:ascii="Times New Roman" w:hAnsi="Times New Roman" w:cs="Times New Roman"/>
+          <w:b/>
+          <w:bCs/>
+          <w:lang w:eastAsia="es-EC"/>
+        </w:rPr>
+        <w:t>add</w:t>
+      </w:r>
+      <w:proofErr w:type="spellEnd"/>
+      <w:r>
+        <w:rPr>
+          <w:rFonts w:ascii="Times New Roman" w:hAnsi="Times New Roman" w:cs="Times New Roman"/>
+          <w:b/>
+          <w:bCs/>
+          <w:lang w:eastAsia="es-EC"/>
+        </w:rPr>
+        <w:t xml:space="preserve"> .</w:t>
+      </w:r>
+      <w:proofErr w:type="gramEnd"/>
+    </w:p>
+    <w:p>
+      <w:pPr>
+        <w:rPr>
+          <w:rFonts w:ascii="Times New Roman" w:hAnsi="Times New Roman" w:cs="Times New Roman"/>
+          <w:b/>
+          <w:bCs/>
+          <w:lang w:eastAsia="es-EC"/>
+        </w:rPr>
+      </w:pPr>
+      <w:proofErr w:type="spellStart"/>
+      <w:r>
+        <w:rPr>
+          <w:rFonts w:ascii="Times New Roman" w:hAnsi="Times New Roman" w:cs="Times New Roman"/>
+          <w:b/>
+          <w:bCs/>
+          <w:lang w:eastAsia="es-EC"/>
+        </w:rPr>
+        <w:t>git</w:t>
+      </w:r>
+      <w:proofErr w:type="spellEnd"/>
+      <w:r>
+        <w:rPr>
+          <w:rFonts w:ascii="Times New Roman" w:hAnsi="Times New Roman" w:cs="Times New Roman"/>
+          <w:b/>
+          <w:bCs/>
+          <w:lang w:eastAsia="es-EC"/>
+        </w:rPr>
+        <w:t xml:space="preserve"> </w:t>
+      </w:r>
+      <w:proofErr w:type="spellStart"/>
+      <w:r>
+        <w:rPr>
+          <w:rFonts w:ascii="Times New Roman" w:hAnsi="Times New Roman" w:cs="Times New Roman"/>
+          <w:b/>
+          <w:bCs/>
+          <w:lang w:eastAsia="es-EC"/>
+        </w:rPr>
+        <w:t>commit</w:t>
+      </w:r>
+      <w:proofErr w:type="spellEnd"/>
+      <w:r>
+        <w:rPr>
+          <w:rFonts w:ascii="Times New Roman" w:hAnsi="Times New Roman" w:cs="Times New Roman"/>
+          <w:b/>
+          <w:bCs/>
+          <w:lang w:eastAsia="es-EC"/>
+        </w:rPr>
+        <w:t xml:space="preserve"> -m "</w:t>
+      </w:r>
+      <w:r>
+        <w:rPr>
+          <w:rFonts w:ascii="Times New Roman" w:hAnsi="Times New Roman" w:cs="Times New Roman"/>
+          <w:b/>
+          <w:bCs/>
+          <w:lang w:eastAsia="es-EC"/>
+        </w:rPr>
+        <w:t xml:space="preserve">tercer </w:t>
+      </w:r>
+      <w:proofErr w:type="spellStart"/>
+      <w:r>
+        <w:rPr>
+          <w:rFonts w:ascii="Times New Roman" w:hAnsi="Times New Roman" w:cs="Times New Roman"/>
+          <w:b/>
+          <w:bCs/>
+          <w:lang w:eastAsia="es-EC"/>
+        </w:rPr>
+        <w:t>commit</w:t>
+      </w:r>
+      <w:proofErr w:type="spellEnd"/>
+      <w:r>
+        <w:rPr>
+          <w:rFonts w:ascii="Times New Roman" w:hAnsi="Times New Roman" w:cs="Times New Roman"/>
+          <w:b/>
+          <w:bCs/>
+          <w:lang w:eastAsia="es-EC"/>
+        </w:rPr>
+        <w:t xml:space="preserve">: </w:t>
+      </w:r>
+      <w:r>
+        <w:rPr>
+          <w:rFonts w:ascii="Times New Roman" w:hAnsi="Times New Roman" w:cs="Times New Roman"/>
+          <w:b/>
+          <w:bCs/>
+          <w:lang w:eastAsia="es-EC"/>
+        </w:rPr>
+        <w:t xml:space="preserve">se </w:t>
+      </w:r>
+      <w:proofErr w:type="spellStart"/>
+      <w:r>
+        <w:rPr>
+          <w:rFonts w:ascii="Times New Roman" w:hAnsi="Times New Roman" w:cs="Times New Roman"/>
+          <w:b/>
+          <w:bCs/>
+          <w:lang w:eastAsia="es-EC"/>
+        </w:rPr>
+        <w:t>finalizo</w:t>
+      </w:r>
+      <w:proofErr w:type="spellEnd"/>
+      <w:r>
+        <w:rPr>
+          <w:rFonts w:ascii="Times New Roman" w:hAnsi="Times New Roman" w:cs="Times New Roman"/>
+          <w:b/>
+          <w:bCs/>
+          <w:lang w:eastAsia="es-EC"/>
+        </w:rPr>
+        <w:t xml:space="preserve"> el trabajo de la actividad</w:t>
+      </w:r>
+      <w:r>
+        <w:rPr>
+          <w:rFonts w:ascii="Times New Roman" w:hAnsi="Times New Roman" w:cs="Times New Roman"/>
+          <w:b/>
+          <w:bCs/>
+          <w:lang w:eastAsia="es-EC"/>
+        </w:rPr>
+        <w:t xml:space="preserve">, revisando y dando últimos detalles para convertir en </w:t>
+      </w:r>
+      <w:proofErr w:type="spellStart"/>
+      <w:r>
+        <w:rPr>
+          <w:rFonts w:ascii="Times New Roman" w:hAnsi="Times New Roman" w:cs="Times New Roman"/>
+          <w:b/>
+          <w:bCs/>
+          <w:lang w:eastAsia="es-EC"/>
+        </w:rPr>
+        <w:t>pdf</w:t>
+      </w:r>
+      <w:proofErr w:type="spellEnd"/>
+      <w:r>
+        <w:rPr>
+          <w:rFonts w:ascii="Times New Roman" w:hAnsi="Times New Roman" w:cs="Times New Roman"/>
+          <w:b/>
+          <w:bCs/>
+          <w:lang w:eastAsia="es-EC"/>
+        </w:rPr>
+        <w:t>"</w:t>
+      </w:r>
+    </w:p>
+    <w:p>
+      <w:pPr>
+        <w:rPr>
+          <w:rFonts w:ascii="Times New Roman" w:hAnsi="Times New Roman" w:cs="Times New Roman"/>
+          <w:b/>
+          <w:bCs/>
+          <w:lang w:eastAsia="es-EC"/>
+        </w:rPr>
+      </w:pPr>
+      <w:proofErr w:type="spellStart"/>
+      <w:r>
+        <w:rPr>
+          <w:rFonts w:ascii="Times New Roman" w:hAnsi="Times New Roman" w:cs="Times New Roman"/>
+          <w:b/>
+          <w:bCs/>
+          <w:lang w:eastAsia="es-EC"/>
+        </w:rPr>
+        <w:t>git</w:t>
+      </w:r>
+      <w:proofErr w:type="spellEnd"/>
+      <w:r>
+        <w:rPr>
+          <w:rFonts w:ascii="Times New Roman" w:hAnsi="Times New Roman" w:cs="Times New Roman"/>
+          <w:b/>
+          <w:bCs/>
+          <w:lang w:eastAsia="es-EC"/>
+        </w:rPr>
+        <w:t xml:space="preserve"> </w:t>
+      </w:r>
+      <w:proofErr w:type="spellStart"/>
+      <w:r>
+        <w:rPr>
+          <w:rFonts w:ascii="Times New Roman" w:hAnsi="Times New Roman" w:cs="Times New Roman"/>
+          <w:b/>
+          <w:bCs/>
+          <w:lang w:eastAsia="es-EC"/>
+        </w:rPr>
+        <w:t>push</w:t>
+      </w:r>
+      <w:proofErr w:type="spellEnd"/>
+    </w:p>
+    <w:p>
+      <w:pPr>
+        <w:rPr>
+          <w:rFonts w:ascii="Times New Roman" w:hAnsi="Times New Roman" w:cs="Times New Roman"/>
+          <w:b/>
+          <w:bCs/>
+          <w:lang w:eastAsia="es-EC"/>
+        </w:rPr>
+      </w:pPr>
+    </w:p>
+    <w:p>
+      <w:pPr>
+        <w:rPr>
+          <w:rFonts w:ascii="Times New Roman" w:hAnsi="Times New Roman" w:cs="Times New Roman"/>
           <w:b/>
           <w:bCs/>
           <w:lang w:eastAsia="es-EC"/>
@@ -3967,7 +4585,7 @@
           <w:lang w:eastAsia="es-EC"/>
         </w:rPr>
         <w:pict w14:anchorId="67470AD2">
-          <v:rect id="_x0000_i1042" style="width:0;height:1.5pt" o:hralign="center" o:hrstd="t" o:hr="t" fillcolor="#a0a0a0" stroked="f"/>
+          <v:rect id="_x0000_i1026" style="width:0;height:1.5pt" o:hralign="center" o:hrstd="t" o:hr="t" fillcolor="#a0a0a0" stroked="f"/>
         </w:pict>
       </w:r>
     </w:p>
@@ -4417,7 +5035,7 @@
       </w:r>
     </w:p>
     <w:sectPr>
-      <w:headerReference w:type="first" r:id="rId23"/>
+      <w:headerReference w:type="first" r:id="rId25"/>
       <w:pgSz w:w="11906" w:h="16838"/>
       <w:pgMar w:top="1417" w:right="1701" w:bottom="1417" w:left="1701" w:header="708" w:footer="708" w:gutter="0"/>
       <w:pgNumType w:start="1"/>

</xml_diff>

<commit_message>
commit pdf: Se realiza la carga del archivo PDF al repositorio de GitHub, con el propósito de completar y evidenciar el cumplimiento de la Actividad 1
</commit_message>
<xml_diff>
--- a/Actividad_n1_Miguel_Salazar_Reina.docx
+++ b/Actividad_n1_Miguel_Salazar_Reina.docx
@@ -1076,7 +1076,7 @@
     <w:p>
       <w:pPr>
         <w:pStyle w:val="Sinespaciado"/>
-        <w:spacing w:line="360" w:lineRule="auto"/>
+        <w:spacing w:line="276" w:lineRule="auto"/>
         <w:jc w:val="both"/>
         <w:rPr>
           <w:rFonts w:ascii="Times New Roman" w:hAnsi="Times New Roman" w:cs="Times New Roman"/>
@@ -1098,7 +1098,7 @@
     <w:p>
       <w:pPr>
         <w:pStyle w:val="Sinespaciado"/>
-        <w:spacing w:line="360" w:lineRule="auto"/>
+        <w:spacing w:line="276" w:lineRule="auto"/>
         <w:jc w:val="both"/>
         <w:rPr>
           <w:rFonts w:ascii="Times New Roman" w:hAnsi="Times New Roman" w:cs="Times New Roman"/>
@@ -1120,7 +1120,7 @@
     <w:p>
       <w:pPr>
         <w:pStyle w:val="Sinespaciado"/>
-        <w:spacing w:line="360" w:lineRule="auto"/>
+        <w:spacing w:line="276" w:lineRule="auto"/>
         <w:jc w:val="both"/>
         <w:rPr>
           <w:rFonts w:ascii="Times New Roman" w:hAnsi="Times New Roman" w:cs="Times New Roman"/>
@@ -1152,7 +1152,7 @@
     <w:p>
       <w:pPr>
         <w:pStyle w:val="Sinespaciado"/>
-        <w:spacing w:line="360" w:lineRule="auto"/>
+        <w:spacing w:line="276" w:lineRule="auto"/>
         <w:jc w:val="both"/>
         <w:rPr>
           <w:rFonts w:ascii="Times New Roman" w:hAnsi="Times New Roman" w:cs="Times New Roman"/>
@@ -1186,7 +1186,7 @@
     <w:p>
       <w:pPr>
         <w:pStyle w:val="Sinespaciado"/>
-        <w:spacing w:line="360" w:lineRule="auto"/>
+        <w:spacing w:line="276" w:lineRule="auto"/>
         <w:jc w:val="both"/>
         <w:rPr>
           <w:rFonts w:ascii="Times New Roman" w:hAnsi="Times New Roman" w:cs="Times New Roman"/>
@@ -1220,7 +1220,7 @@
     <w:p>
       <w:pPr>
         <w:pStyle w:val="Sinespaciado"/>
-        <w:spacing w:line="360" w:lineRule="auto"/>
+        <w:spacing w:line="276" w:lineRule="auto"/>
         <w:jc w:val="both"/>
         <w:rPr>
           <w:rFonts w:ascii="Times New Roman" w:hAnsi="Times New Roman" w:cs="Times New Roman"/>
@@ -1318,7 +1318,7 @@
     <w:p>
       <w:pPr>
         <w:pStyle w:val="Sinespaciado"/>
-        <w:spacing w:line="360" w:lineRule="auto"/>
+        <w:spacing w:line="276" w:lineRule="auto"/>
         <w:jc w:val="both"/>
         <w:rPr>
           <w:rFonts w:ascii="Times New Roman" w:hAnsi="Times New Roman" w:cs="Times New Roman"/>
@@ -1328,140 +1328,229 @@
     </w:p>
     <w:p>
       <w:pPr>
+        <w:rPr>
+          <w:rFonts w:ascii="Times New Roman" w:hAnsi="Times New Roman" w:cs="Times New Roman"/>
+          <w:b/>
+          <w:bCs/>
+          <w:lang w:val="en-US" w:eastAsia="es-EC"/>
+        </w:rPr>
+      </w:pPr>
+      <w:r>
+        <w:rPr>
+          <w:rFonts w:ascii="Times New Roman" w:hAnsi="Times New Roman" w:cs="Times New Roman"/>
+          <w:b/>
+          <w:bCs/>
+          <w:lang w:val="en-US" w:eastAsia="es-EC"/>
+        </w:rPr>
+        <w:t>LINK LUCIDCHART:</w:t>
+      </w:r>
+    </w:p>
+    <w:p>
+      <w:pPr>
+        <w:rPr>
+          <w:rFonts w:ascii="Times New Roman" w:hAnsi="Times New Roman" w:cs="Times New Roman"/>
+          <w:lang w:val="en-US" w:eastAsia="es-EC"/>
+        </w:rPr>
+      </w:pPr>
+      <w:hyperlink r:id="rId14" w:history="1">
+        <w:r>
+          <w:rPr>
+            <w:rStyle w:val="Hipervnculo"/>
+            <w:rFonts w:ascii="Times New Roman" w:hAnsi="Times New Roman" w:cs="Times New Roman"/>
+            <w:lang w:val="en-US" w:eastAsia="es-EC"/>
+          </w:rPr>
+          <w:t>https://lucid.app/lucidchart/726b9791-22a9-4a39-8086-3683ccb42373/edit?viewport_loc=-572%2C-205%2C2494%2C1298%2C0_0&amp;invitationId=inv_4147f79e-8783-48f0-b615-7e0fef234a3c</w:t>
+        </w:r>
+      </w:hyperlink>
+      <w:r>
+        <w:rPr>
+          <w:rFonts w:ascii="Times New Roman" w:hAnsi="Times New Roman" w:cs="Times New Roman"/>
+          <w:lang w:val="en-US" w:eastAsia="es-EC"/>
+        </w:rPr>
+        <w:t xml:space="preserve"> </w:t>
+      </w:r>
+    </w:p>
+    <w:p>
+      <w:pPr>
+        <w:rPr>
+          <w:rFonts w:ascii="Times New Roman" w:hAnsi="Times New Roman" w:cs="Times New Roman"/>
+          <w:b/>
+          <w:bCs/>
+          <w:lang w:val="en-US" w:eastAsia="es-EC"/>
+        </w:rPr>
+      </w:pPr>
+      <w:r>
+        <w:rPr>
+          <w:rFonts w:ascii="Times New Roman" w:hAnsi="Times New Roman" w:cs="Times New Roman"/>
+          <w:b/>
+          <w:bCs/>
+          <w:lang w:val="en-US" w:eastAsia="es-EC"/>
+        </w:rPr>
+        <w:t>LINK GITHUB:</w:t>
+      </w:r>
+    </w:p>
+    <w:p>
+      <w:pPr>
+        <w:rPr>
+          <w:rFonts w:ascii="Times New Roman" w:hAnsi="Times New Roman" w:cs="Times New Roman"/>
+          <w:lang w:val="en-US" w:eastAsia="es-EC"/>
+        </w:rPr>
+      </w:pPr>
+      <w:hyperlink r:id="rId15" w:history="1">
+        <w:r>
+          <w:rPr>
+            <w:rStyle w:val="Hipervnculo"/>
+            <w:rFonts w:ascii="Times New Roman" w:hAnsi="Times New Roman" w:cs="Times New Roman"/>
+            <w:lang w:val="en-US" w:eastAsia="es-EC"/>
+          </w:rPr>
+          <w:t>https://github.com/miguel7utm/sistema-rescate-adopcion-animal</w:t>
+        </w:r>
+      </w:hyperlink>
+      <w:r>
+        <w:rPr>
+          <w:rFonts w:ascii="Times New Roman" w:hAnsi="Times New Roman" w:cs="Times New Roman"/>
+          <w:lang w:val="en-US" w:eastAsia="es-EC"/>
+        </w:rPr>
+        <w:t xml:space="preserve"> </w:t>
+      </w:r>
+    </w:p>
+    <w:p>
+      <w:pPr>
         <w:pStyle w:val="Sinespaciado"/>
-        <w:spacing w:line="360" w:lineRule="auto"/>
+        <w:spacing w:line="276" w:lineRule="auto"/>
         <w:jc w:val="both"/>
         <w:rPr>
           <w:rFonts w:ascii="Times New Roman" w:hAnsi="Times New Roman" w:cs="Times New Roman"/>
-          <w:lang w:eastAsia="es-EC"/>
+          <w:lang w:val="en-US" w:eastAsia="es-EC"/>
         </w:rPr>
       </w:pPr>
     </w:p>
     <w:p>
       <w:pPr>
         <w:pStyle w:val="Sinespaciado"/>
-        <w:spacing w:line="360" w:lineRule="auto"/>
+        <w:spacing w:line="276" w:lineRule="auto"/>
         <w:jc w:val="both"/>
         <w:rPr>
           <w:rFonts w:ascii="Times New Roman" w:hAnsi="Times New Roman" w:cs="Times New Roman"/>
-          <w:lang w:eastAsia="es-EC"/>
+          <w:lang w:val="en-US" w:eastAsia="es-EC"/>
         </w:rPr>
       </w:pPr>
     </w:p>
     <w:p>
       <w:pPr>
         <w:pStyle w:val="Sinespaciado"/>
-        <w:spacing w:line="360" w:lineRule="auto"/>
+        <w:spacing w:line="276" w:lineRule="auto"/>
         <w:jc w:val="both"/>
         <w:rPr>
           <w:rFonts w:ascii="Times New Roman" w:hAnsi="Times New Roman" w:cs="Times New Roman"/>
-          <w:lang w:eastAsia="es-EC"/>
+          <w:lang w:val="en-US" w:eastAsia="es-EC"/>
         </w:rPr>
       </w:pPr>
     </w:p>
     <w:p>
       <w:pPr>
         <w:pStyle w:val="Sinespaciado"/>
-        <w:spacing w:line="360" w:lineRule="auto"/>
+        <w:spacing w:line="276" w:lineRule="auto"/>
         <w:jc w:val="both"/>
         <w:rPr>
           <w:rFonts w:ascii="Times New Roman" w:hAnsi="Times New Roman" w:cs="Times New Roman"/>
-          <w:lang w:eastAsia="es-EC"/>
+          <w:lang w:val="en-US" w:eastAsia="es-EC"/>
         </w:rPr>
       </w:pPr>
     </w:p>
     <w:p>
       <w:pPr>
         <w:pStyle w:val="Sinespaciado"/>
-        <w:spacing w:line="360" w:lineRule="auto"/>
+        <w:spacing w:line="276" w:lineRule="auto"/>
         <w:jc w:val="both"/>
         <w:rPr>
           <w:rFonts w:ascii="Times New Roman" w:hAnsi="Times New Roman" w:cs="Times New Roman"/>
-          <w:lang w:eastAsia="es-EC"/>
+          <w:lang w:val="en-US" w:eastAsia="es-EC"/>
         </w:rPr>
       </w:pPr>
     </w:p>
     <w:p>
       <w:pPr>
         <w:pStyle w:val="Sinespaciado"/>
-        <w:spacing w:line="360" w:lineRule="auto"/>
+        <w:spacing w:line="276" w:lineRule="auto"/>
         <w:jc w:val="both"/>
         <w:rPr>
           <w:rFonts w:ascii="Times New Roman" w:hAnsi="Times New Roman" w:cs="Times New Roman"/>
-          <w:lang w:eastAsia="es-EC"/>
+          <w:lang w:val="en-US" w:eastAsia="es-EC"/>
         </w:rPr>
       </w:pPr>
     </w:p>
     <w:p>
       <w:pPr>
         <w:pStyle w:val="Sinespaciado"/>
-        <w:spacing w:line="360" w:lineRule="auto"/>
+        <w:spacing w:line="276" w:lineRule="auto"/>
         <w:jc w:val="both"/>
         <w:rPr>
           <w:rFonts w:ascii="Times New Roman" w:hAnsi="Times New Roman" w:cs="Times New Roman"/>
-          <w:lang w:eastAsia="es-EC"/>
+          <w:lang w:val="en-US" w:eastAsia="es-EC"/>
         </w:rPr>
       </w:pPr>
     </w:p>
     <w:p>
       <w:pPr>
         <w:pStyle w:val="Sinespaciado"/>
-        <w:spacing w:line="360" w:lineRule="auto"/>
+        <w:spacing w:line="276" w:lineRule="auto"/>
         <w:jc w:val="both"/>
         <w:rPr>
           <w:rFonts w:ascii="Times New Roman" w:hAnsi="Times New Roman" w:cs="Times New Roman"/>
-          <w:lang w:eastAsia="es-EC"/>
+          <w:lang w:val="en-US" w:eastAsia="es-EC"/>
         </w:rPr>
       </w:pPr>
     </w:p>
     <w:p>
       <w:pPr>
         <w:pStyle w:val="Sinespaciado"/>
-        <w:spacing w:line="360" w:lineRule="auto"/>
+        <w:spacing w:line="276" w:lineRule="auto"/>
         <w:jc w:val="both"/>
         <w:rPr>
           <w:rFonts w:ascii="Times New Roman" w:hAnsi="Times New Roman" w:cs="Times New Roman"/>
-          <w:lang w:eastAsia="es-EC"/>
+          <w:lang w:val="en-US" w:eastAsia="es-EC"/>
         </w:rPr>
       </w:pPr>
     </w:p>
     <w:p>
       <w:pPr>
         <w:pStyle w:val="Sinespaciado"/>
-        <w:spacing w:line="360" w:lineRule="auto"/>
+        <w:spacing w:line="276" w:lineRule="auto"/>
         <w:jc w:val="both"/>
         <w:rPr>
           <w:rFonts w:ascii="Times New Roman" w:hAnsi="Times New Roman" w:cs="Times New Roman"/>
-          <w:lang w:eastAsia="es-EC"/>
+          <w:lang w:val="en-US" w:eastAsia="es-EC"/>
         </w:rPr>
       </w:pPr>
     </w:p>
     <w:p>
       <w:pPr>
         <w:pStyle w:val="Sinespaciado"/>
-        <w:spacing w:line="360" w:lineRule="auto"/>
+        <w:spacing w:line="276" w:lineRule="auto"/>
         <w:jc w:val="both"/>
         <w:rPr>
           <w:rFonts w:ascii="Times New Roman" w:hAnsi="Times New Roman" w:cs="Times New Roman"/>
-          <w:lang w:eastAsia="es-EC"/>
+          <w:lang w:val="en-US" w:eastAsia="es-EC"/>
         </w:rPr>
       </w:pPr>
     </w:p>
     <w:p>
       <w:pPr>
         <w:pStyle w:val="Sinespaciado"/>
-        <w:spacing w:line="360" w:lineRule="auto"/>
+        <w:spacing w:line="276" w:lineRule="auto"/>
         <w:jc w:val="both"/>
         <w:rPr>
           <w:rFonts w:ascii="Times New Roman" w:hAnsi="Times New Roman" w:cs="Times New Roman"/>
           <w:b/>
           <w:bCs/>
-          <w:lang w:eastAsia="es-EC"/>
-        </w:rPr>
-      </w:pPr>
-    </w:p>
-    <w:p>
-      <w:pPr>
+          <w:lang w:val="en-US" w:eastAsia="es-EC"/>
+        </w:rPr>
+      </w:pPr>
+    </w:p>
+    <w:p>
+      <w:pPr>
+        <w:spacing w:line="276" w:lineRule="auto"/>
         <w:rPr>
           <w:rFonts w:ascii="Times New Roman" w:hAnsi="Times New Roman" w:cs="Times New Roman"/>
           <w:b/>
@@ -1474,7 +1563,7 @@
           <w:rFonts w:ascii="Arial" w:hAnsi="Arial" w:cs="Arial"/>
           <w:b/>
           <w:bCs/>
-          <w:lang w:eastAsia="es-EC"/>
+          <w:lang w:val="en-US" w:eastAsia="es-EC"/>
         </w:rPr>
         <w:br w:type="page"/>
       </w:r>
@@ -1491,6 +1580,7 @@
     </w:p>
     <w:p>
       <w:pPr>
+        <w:spacing w:line="276" w:lineRule="auto"/>
         <w:rPr>
           <w:rFonts w:ascii="Times New Roman" w:hAnsi="Times New Roman" w:cs="Times New Roman"/>
           <w:b/>
@@ -1510,6 +1600,7 @@
     </w:p>
     <w:p>
       <w:pPr>
+        <w:spacing w:line="276" w:lineRule="auto"/>
         <w:rPr>
           <w:rFonts w:ascii="Times New Roman" w:hAnsi="Times New Roman" w:cs="Times New Roman"/>
           <w:lang w:eastAsia="es-EC"/>
@@ -1546,6 +1637,7 @@
           <w:ilvl w:val="0"/>
           <w:numId w:val="22"/>
         </w:numPr>
+        <w:spacing w:line="276" w:lineRule="auto"/>
         <w:rPr>
           <w:rFonts w:ascii="Times New Roman" w:hAnsi="Times New Roman" w:cs="Times New Roman"/>
           <w:lang w:eastAsia="es-EC"/>
@@ -1566,6 +1658,7 @@
           <w:ilvl w:val="0"/>
           <w:numId w:val="22"/>
         </w:numPr>
+        <w:spacing w:line="276" w:lineRule="auto"/>
         <w:rPr>
           <w:rFonts w:ascii="Times New Roman" w:hAnsi="Times New Roman" w:cs="Times New Roman"/>
           <w:lang w:eastAsia="es-EC"/>
@@ -1586,6 +1679,7 @@
           <w:ilvl w:val="0"/>
           <w:numId w:val="22"/>
         </w:numPr>
+        <w:spacing w:line="276" w:lineRule="auto"/>
         <w:rPr>
           <w:rFonts w:ascii="Times New Roman" w:hAnsi="Times New Roman" w:cs="Times New Roman"/>
           <w:lang w:eastAsia="es-EC"/>
@@ -1622,6 +1716,7 @@
           <w:ilvl w:val="0"/>
           <w:numId w:val="22"/>
         </w:numPr>
+        <w:spacing w:line="276" w:lineRule="auto"/>
         <w:rPr>
           <w:rFonts w:ascii="Times New Roman" w:hAnsi="Times New Roman" w:cs="Times New Roman"/>
           <w:lang w:eastAsia="es-EC"/>
@@ -1642,6 +1737,7 @@
           <w:ilvl w:val="0"/>
           <w:numId w:val="22"/>
         </w:numPr>
+        <w:spacing w:line="276" w:lineRule="auto"/>
         <w:rPr>
           <w:rFonts w:ascii="Times New Roman" w:hAnsi="Times New Roman" w:cs="Times New Roman"/>
           <w:lang w:eastAsia="es-EC"/>
@@ -1678,6 +1774,7 @@
           <w:ilvl w:val="0"/>
           <w:numId w:val="22"/>
         </w:numPr>
+        <w:spacing w:line="276" w:lineRule="auto"/>
         <w:rPr>
           <w:rFonts w:ascii="Times New Roman" w:hAnsi="Times New Roman" w:cs="Times New Roman"/>
           <w:lang w:eastAsia="es-EC"/>
@@ -1709,6 +1806,7 @@
     </w:p>
     <w:p>
       <w:pPr>
+        <w:spacing w:line="276" w:lineRule="auto"/>
         <w:rPr>
           <w:rFonts w:ascii="Times New Roman" w:hAnsi="Times New Roman" w:cs="Times New Roman"/>
           <w:b/>
@@ -1728,6 +1826,7 @@
     </w:p>
     <w:p>
       <w:pPr>
+        <w:spacing w:line="276" w:lineRule="auto"/>
         <w:rPr>
           <w:rFonts w:ascii="Times New Roman" w:hAnsi="Times New Roman" w:cs="Times New Roman"/>
           <w:lang w:eastAsia="es-EC"/>
@@ -1743,6 +1842,7 @@
     </w:p>
     <w:p>
       <w:pPr>
+        <w:spacing w:line="276" w:lineRule="auto"/>
         <w:rPr>
           <w:rFonts w:ascii="Times New Roman" w:hAnsi="Times New Roman" w:cs="Times New Roman"/>
           <w:lang w:eastAsia="es-EC"/>
@@ -1772,21 +1872,37 @@
     </w:p>
     <w:p>
       <w:pPr>
-        <w:rPr>
-          <w:rFonts w:ascii="Times New Roman" w:hAnsi="Times New Roman" w:cs="Times New Roman"/>
-          <w:lang w:eastAsia="es-EC"/>
-        </w:rPr>
-      </w:pPr>
-      <w:r>
-        <w:rPr>
-          <w:rFonts w:ascii="Times New Roman" w:hAnsi="Times New Roman" w:cs="Times New Roman"/>
-          <w:lang w:eastAsia="es-EC"/>
-        </w:rPr>
-        <w:t>Además, el sistema contempla la participación de voluntarios y veterinarios. Los voluntarios pueden colaborar en actividades relacionadas con el rescate y seguimiento, mientras que los veterinarios pueden registrar y gestionar información relacionada con la atención de los animales.</w:t>
-      </w:r>
-    </w:p>
-    <w:p>
-      <w:pPr>
+        <w:spacing w:line="276" w:lineRule="auto"/>
+        <w:rPr>
+          <w:rFonts w:ascii="Times New Roman" w:hAnsi="Times New Roman" w:cs="Times New Roman"/>
+          <w:lang w:eastAsia="es-EC"/>
+        </w:rPr>
+      </w:pPr>
+      <w:r>
+        <w:rPr>
+          <w:rFonts w:ascii="Times New Roman" w:hAnsi="Times New Roman" w:cs="Times New Roman"/>
+          <w:lang w:eastAsia="es-EC"/>
+        </w:rPr>
+        <w:t>Además, el sistema contempla la participación de voluntarios y veterinarios</w:t>
+      </w:r>
+      <w:r>
+        <w:rPr>
+          <w:rFonts w:ascii="Times New Roman" w:hAnsi="Times New Roman" w:cs="Times New Roman"/>
+          <w:lang w:eastAsia="es-EC"/>
+        </w:rPr>
+        <w:t>, l</w:t>
+      </w:r>
+      <w:r>
+        <w:rPr>
+          <w:rFonts w:ascii="Times New Roman" w:hAnsi="Times New Roman" w:cs="Times New Roman"/>
+          <w:lang w:eastAsia="es-EC"/>
+        </w:rPr>
+        <w:t>os voluntarios pueden colaborar en actividades relacionadas con el rescate y seguimiento, mientras que los veterinarios pueden registrar y gestionar información relacionada con la atención de los animales.</w:t>
+      </w:r>
+    </w:p>
+    <w:p>
+      <w:pPr>
+        <w:spacing w:line="276" w:lineRule="auto"/>
         <w:rPr>
           <w:rFonts w:ascii="Times New Roman" w:hAnsi="Times New Roman" w:cs="Times New Roman"/>
           <w:lang w:eastAsia="es-EC"/>
@@ -1802,6 +1918,7 @@
     </w:p>
     <w:p>
       <w:pPr>
+        <w:spacing w:line="276" w:lineRule="auto"/>
         <w:rPr>
           <w:rFonts w:ascii="Times New Roman" w:hAnsi="Times New Roman" w:cs="Times New Roman"/>
           <w:b/>
@@ -1821,6 +1938,7 @@
     </w:p>
     <w:p>
       <w:pPr>
+        <w:spacing w:line="276" w:lineRule="auto"/>
         <w:rPr>
           <w:rFonts w:ascii="Times New Roman" w:hAnsi="Times New Roman" w:cs="Times New Roman"/>
           <w:lang w:eastAsia="es-EC"/>
@@ -1836,6 +1954,7 @@
     </w:p>
     <w:p>
       <w:pPr>
+        <w:spacing w:line="276" w:lineRule="auto"/>
         <w:rPr>
           <w:rFonts w:ascii="Times New Roman" w:hAnsi="Times New Roman" w:cs="Times New Roman"/>
           <w:lang w:eastAsia="es-EC"/>
@@ -1851,6 +1970,7 @@
     </w:p>
     <w:p>
       <w:pPr>
+        <w:spacing w:line="276" w:lineRule="auto"/>
         <w:rPr>
           <w:rFonts w:ascii="Times New Roman" w:hAnsi="Times New Roman" w:cs="Times New Roman"/>
           <w:lang w:eastAsia="es-EC"/>
@@ -1862,7 +1982,7 @@
         </w:rPr>
         <w:lastRenderedPageBreak/>
         <w:drawing>
-          <wp:inline distT="0" distB="0" distL="0" distR="0" wp14:anchorId="4706287D" wp14:editId="59A24EC5">
+          <wp:inline distT="0" distB="0" distL="0" distR="0" wp14:anchorId="4706287D" wp14:editId="0D9C7C7D">
             <wp:extent cx="5514063" cy="3962400"/>
             <wp:effectExtent l="0" t="0" r="0" b="0"/>
             <wp:docPr id="295975701" name="Imagen 2"/>
@@ -1879,7 +1999,7 @@
                     </pic:cNvPicPr>
                   </pic:nvPicPr>
                   <pic:blipFill rotWithShape="1">
-                    <a:blip r:embed="rId14" cstate="print">
+                    <a:blip r:embed="rId16" cstate="print">
                       <a:extLst>
                         <a:ext uri="{28A0092B-C50C-407E-A947-70E740481C1C}">
                           <a14:useLocalDpi xmlns:a14="http://schemas.microsoft.com/office/drawing/2010/main" val="0"/>
@@ -1918,6 +2038,7 @@
     </w:p>
     <w:p>
       <w:pPr>
+        <w:spacing w:line="276" w:lineRule="auto"/>
         <w:rPr>
           <w:rFonts w:ascii="Times New Roman" w:hAnsi="Times New Roman" w:cs="Times New Roman"/>
           <w:lang w:eastAsia="es-EC"/>
@@ -1933,6 +2054,7 @@
     </w:p>
     <w:p>
       <w:pPr>
+        <w:spacing w:line="276" w:lineRule="auto"/>
         <w:rPr>
           <w:rFonts w:ascii="Times New Roman" w:hAnsi="Times New Roman" w:cs="Times New Roman"/>
           <w:b/>
@@ -1952,21 +2074,37 @@
     </w:p>
     <w:p>
       <w:pPr>
-        <w:rPr>
-          <w:rFonts w:ascii="Times New Roman" w:hAnsi="Times New Roman" w:cs="Times New Roman"/>
-          <w:lang w:eastAsia="es-EC"/>
-        </w:rPr>
-      </w:pPr>
-      <w:r>
-        <w:rPr>
-          <w:rFonts w:ascii="Times New Roman" w:hAnsi="Times New Roman" w:cs="Times New Roman"/>
-          <w:lang w:eastAsia="es-EC"/>
-        </w:rPr>
-        <w:t>El diagrama de clases representa la estructura estática propuesta para el sistema. En él se identifican las principales clases, atributos, métodos y relaciones necesarias para representar la información y comportamiento del sistema.</w:t>
-      </w:r>
-    </w:p>
-    <w:p>
-      <w:pPr>
+        <w:spacing w:line="276" w:lineRule="auto"/>
+        <w:rPr>
+          <w:rFonts w:ascii="Times New Roman" w:hAnsi="Times New Roman" w:cs="Times New Roman"/>
+          <w:lang w:eastAsia="es-EC"/>
+        </w:rPr>
+      </w:pPr>
+      <w:r>
+        <w:rPr>
+          <w:rFonts w:ascii="Times New Roman" w:hAnsi="Times New Roman" w:cs="Times New Roman"/>
+          <w:lang w:eastAsia="es-EC"/>
+        </w:rPr>
+        <w:t>El diagrama de clases representa la estructura estática propuesta para el sistema</w:t>
+      </w:r>
+      <w:r>
+        <w:rPr>
+          <w:rFonts w:ascii="Times New Roman" w:hAnsi="Times New Roman" w:cs="Times New Roman"/>
+          <w:lang w:eastAsia="es-EC"/>
+        </w:rPr>
+        <w:t>, e</w:t>
+      </w:r>
+      <w:r>
+        <w:rPr>
+          <w:rFonts w:ascii="Times New Roman" w:hAnsi="Times New Roman" w:cs="Times New Roman"/>
+          <w:lang w:eastAsia="es-EC"/>
+        </w:rPr>
+        <w:t>n él se identifican las principales clases, atributos, métodos y relaciones necesarias para representar la información y comportamiento del sistema.</w:t>
+      </w:r>
+    </w:p>
+    <w:p>
+      <w:pPr>
+        <w:spacing w:line="276" w:lineRule="auto"/>
         <w:rPr>
           <w:rFonts w:ascii="Times New Roman" w:hAnsi="Times New Roman" w:cs="Times New Roman"/>
           <w:lang w:eastAsia="es-EC"/>
@@ -1982,6 +2120,7 @@
     </w:p>
     <w:p>
       <w:pPr>
+        <w:spacing w:line="276" w:lineRule="auto"/>
         <w:rPr>
           <w:rFonts w:ascii="Times New Roman" w:hAnsi="Times New Roman" w:cs="Times New Roman"/>
           <w:lang w:eastAsia="es-EC"/>
@@ -1997,6 +2136,7 @@
     </w:p>
     <w:p>
       <w:pPr>
+        <w:spacing w:line="276" w:lineRule="auto"/>
         <w:rPr>
           <w:rFonts w:ascii="Times New Roman" w:hAnsi="Times New Roman" w:cs="Times New Roman"/>
           <w:b/>
@@ -2027,7 +2167,7 @@
                     </pic:cNvPicPr>
                   </pic:nvPicPr>
                   <pic:blipFill>
-                    <a:blip r:embed="rId15" cstate="print">
+                    <a:blip r:embed="rId17" cstate="print">
                       <a:extLst>
                         <a:ext uri="{28A0092B-C50C-407E-A947-70E740481C1C}">
                           <a14:useLocalDpi xmlns:a14="http://schemas.microsoft.com/office/drawing/2010/main" val="0"/>
@@ -2061,6 +2201,7 @@
     </w:p>
     <w:p>
       <w:pPr>
+        <w:spacing w:line="276" w:lineRule="auto"/>
         <w:rPr>
           <w:rFonts w:ascii="Times New Roman" w:hAnsi="Times New Roman" w:cs="Times New Roman"/>
           <w:b/>
@@ -2080,6 +2221,7 @@
     </w:p>
     <w:p>
       <w:pPr>
+        <w:spacing w:line="276" w:lineRule="auto"/>
         <w:rPr>
           <w:rFonts w:ascii="Times New Roman" w:hAnsi="Times New Roman" w:cs="Times New Roman"/>
           <w:lang w:eastAsia="es-EC"/>
@@ -2106,11 +2248,26 @@
           <w:rFonts w:ascii="Times New Roman" w:hAnsi="Times New Roman" w:cs="Times New Roman"/>
           <w:lang w:eastAsia="es-EC"/>
         </w:rPr>
-        <w:t xml:space="preserve"> y Factory. Cada uno representa una alternativa para solucionar una necesidad específica dentro de la arquitectura propuesta.</w:t>
-      </w:r>
-    </w:p>
-    <w:p>
-      <w:pPr>
+        <w:t xml:space="preserve"> y Factory</w:t>
+      </w:r>
+      <w:r>
+        <w:rPr>
+          <w:rFonts w:ascii="Times New Roman" w:hAnsi="Times New Roman" w:cs="Times New Roman"/>
+          <w:lang w:eastAsia="es-EC"/>
+        </w:rPr>
+        <w:t>, c</w:t>
+      </w:r>
+      <w:r>
+        <w:rPr>
+          <w:rFonts w:ascii="Times New Roman" w:hAnsi="Times New Roman" w:cs="Times New Roman"/>
+          <w:lang w:eastAsia="es-EC"/>
+        </w:rPr>
+        <w:t>ada uno representa una alternativa para solucionar una necesidad específica dentro de la arquitectura propuesta.</w:t>
+      </w:r>
+    </w:p>
+    <w:p>
+      <w:pPr>
+        <w:spacing w:line="276" w:lineRule="auto"/>
         <w:rPr>
           <w:rFonts w:ascii="Times New Roman" w:hAnsi="Times New Roman" w:cs="Times New Roman"/>
           <w:b/>
@@ -2130,6 +2287,7 @@
     </w:p>
     <w:p>
       <w:pPr>
+        <w:spacing w:line="276" w:lineRule="auto"/>
         <w:rPr>
           <w:rFonts w:ascii="Times New Roman" w:hAnsi="Times New Roman" w:cs="Times New Roman"/>
           <w:lang w:eastAsia="es-EC"/>
@@ -2145,6 +2303,7 @@
     </w:p>
     <w:p>
       <w:pPr>
+        <w:spacing w:line="276" w:lineRule="auto"/>
         <w:rPr>
           <w:rFonts w:ascii="Times New Roman" w:hAnsi="Times New Roman" w:cs="Times New Roman"/>
           <w:lang w:eastAsia="es-EC"/>
@@ -2160,6 +2319,7 @@
     </w:p>
     <w:p>
       <w:pPr>
+        <w:spacing w:line="276" w:lineRule="auto"/>
         <w:rPr>
           <w:rFonts w:ascii="Times New Roman" w:hAnsi="Times New Roman" w:cs="Times New Roman"/>
           <w:lang w:eastAsia="es-EC"/>
@@ -2169,8 +2329,9 @@
         <w:rPr>
           <w:noProof/>
         </w:rPr>
+        <w:lastRenderedPageBreak/>
         <w:drawing>
-          <wp:inline distT="0" distB="0" distL="0" distR="0" wp14:anchorId="62EF2DF1" wp14:editId="6928B485">
+          <wp:inline distT="0" distB="0" distL="0" distR="0" wp14:anchorId="62EF2DF1" wp14:editId="7A3991D4">
             <wp:extent cx="4991100" cy="2204720"/>
             <wp:effectExtent l="0" t="0" r="0" b="5080"/>
             <wp:docPr id="1499597852" name="Imagen 4"/>
@@ -2187,7 +2348,7 @@
                     </pic:cNvPicPr>
                   </pic:nvPicPr>
                   <pic:blipFill rotWithShape="1">
-                    <a:blip r:embed="rId16" cstate="print">
+                    <a:blip r:embed="rId18" cstate="print">
                       <a:extLst>
                         <a:ext uri="{28A0092B-C50C-407E-A947-70E740481C1C}">
                           <a14:useLocalDpi xmlns:a14="http://schemas.microsoft.com/office/drawing/2010/main" val="0"/>
@@ -2226,22 +2387,23 @@
     </w:p>
     <w:p>
       <w:pPr>
-        <w:rPr>
-          <w:rFonts w:ascii="Times New Roman" w:hAnsi="Times New Roman" w:cs="Times New Roman"/>
-          <w:lang w:eastAsia="es-EC"/>
-        </w:rPr>
-      </w:pPr>
-      <w:r>
-        <w:rPr>
-          <w:rFonts w:ascii="Times New Roman" w:hAnsi="Times New Roman" w:cs="Times New Roman"/>
-          <w:lang w:eastAsia="es-EC"/>
-        </w:rPr>
-        <w:lastRenderedPageBreak/>
+        <w:spacing w:line="276" w:lineRule="auto"/>
+        <w:rPr>
+          <w:rFonts w:ascii="Times New Roman" w:hAnsi="Times New Roman" w:cs="Times New Roman"/>
+          <w:lang w:eastAsia="es-EC"/>
+        </w:rPr>
+      </w:pPr>
+      <w:r>
+        <w:rPr>
+          <w:rFonts w:ascii="Times New Roman" w:hAnsi="Times New Roman" w:cs="Times New Roman"/>
+          <w:lang w:eastAsia="es-EC"/>
+        </w:rPr>
         <w:t>La representación permite observar cómo se plantea el uso de una instancia única dentro de la arquitectura propuesta</w:t>
       </w:r>
     </w:p>
     <w:p>
       <w:pPr>
+        <w:spacing w:line="276" w:lineRule="auto"/>
         <w:rPr>
           <w:rFonts w:ascii="Times New Roman" w:hAnsi="Times New Roman" w:cs="Times New Roman"/>
           <w:b/>
@@ -2272,6 +2434,7 @@
     </w:p>
     <w:p>
       <w:pPr>
+        <w:spacing w:line="276" w:lineRule="auto"/>
         <w:rPr>
           <w:rFonts w:ascii="Times New Roman" w:hAnsi="Times New Roman" w:cs="Times New Roman"/>
           <w:lang w:eastAsia="es-EC"/>
@@ -2303,6 +2466,7 @@
     </w:p>
     <w:p>
       <w:pPr>
+        <w:spacing w:line="276" w:lineRule="auto"/>
         <w:rPr>
           <w:rFonts w:ascii="Times New Roman" w:hAnsi="Times New Roman" w:cs="Times New Roman"/>
           <w:lang w:eastAsia="es-EC"/>
@@ -2318,6 +2482,7 @@
     </w:p>
     <w:p>
       <w:pPr>
+        <w:spacing w:line="276" w:lineRule="auto"/>
         <w:rPr>
           <w:rFonts w:ascii="Times New Roman" w:hAnsi="Times New Roman" w:cs="Times New Roman"/>
           <w:lang w:eastAsia="es-EC"/>
@@ -2328,7 +2493,7 @@
           <w:noProof/>
         </w:rPr>
         <w:drawing>
-          <wp:inline distT="0" distB="0" distL="0" distR="0" wp14:anchorId="12B75CC7" wp14:editId="57EAE38E">
+          <wp:inline distT="0" distB="0" distL="0" distR="0" wp14:anchorId="12B75CC7" wp14:editId="0B2DE1BC">
             <wp:extent cx="4719234" cy="2585487"/>
             <wp:effectExtent l="0" t="0" r="5715" b="5715"/>
             <wp:docPr id="2142752960" name="Imagen 5"/>
@@ -2345,7 +2510,7 @@
                     </pic:cNvPicPr>
                   </pic:nvPicPr>
                   <pic:blipFill rotWithShape="1">
-                    <a:blip r:embed="rId17" cstate="print">
+                    <a:blip r:embed="rId19" cstate="print">
                       <a:extLst>
                         <a:ext uri="{28A0092B-C50C-407E-A947-70E740481C1C}">
                           <a14:useLocalDpi xmlns:a14="http://schemas.microsoft.com/office/drawing/2010/main" val="0"/>
@@ -2384,6 +2549,7 @@
     </w:p>
     <w:p>
       <w:pPr>
+        <w:spacing w:line="276" w:lineRule="auto"/>
         <w:rPr>
           <w:rFonts w:ascii="Times New Roman" w:hAnsi="Times New Roman" w:cs="Times New Roman"/>
           <w:lang w:eastAsia="es-EC"/>
@@ -2399,6 +2565,7 @@
     </w:p>
     <w:p>
       <w:pPr>
+        <w:spacing w:line="276" w:lineRule="auto"/>
         <w:rPr>
           <w:rFonts w:ascii="Times New Roman" w:hAnsi="Times New Roman" w:cs="Times New Roman"/>
           <w:b/>
@@ -2418,6 +2585,7 @@
     </w:p>
     <w:p>
       <w:pPr>
+        <w:spacing w:line="276" w:lineRule="auto"/>
         <w:rPr>
           <w:rFonts w:ascii="Times New Roman" w:hAnsi="Times New Roman" w:cs="Times New Roman"/>
           <w:lang w:eastAsia="es-EC"/>
@@ -2433,6 +2601,7 @@
     </w:p>
     <w:p>
       <w:pPr>
+        <w:spacing w:line="276" w:lineRule="auto"/>
         <w:rPr>
           <w:rFonts w:ascii="Times New Roman" w:hAnsi="Times New Roman" w:cs="Times New Roman"/>
           <w:lang w:eastAsia="es-EC"/>
@@ -2448,6 +2617,7 @@
     </w:p>
     <w:p>
       <w:pPr>
+        <w:spacing w:line="276" w:lineRule="auto"/>
         <w:rPr>
           <w:rFonts w:ascii="Times New Roman" w:hAnsi="Times New Roman" w:cs="Times New Roman"/>
           <w:lang w:eastAsia="es-EC"/>
@@ -2457,6 +2627,7 @@
         <w:rPr>
           <w:noProof/>
         </w:rPr>
+        <w:lastRenderedPageBreak/>
         <w:drawing>
           <wp:inline distT="0" distB="0" distL="0" distR="0" wp14:anchorId="23DE5DC1" wp14:editId="6BCA01F2">
             <wp:extent cx="5518889" cy="1929539"/>
@@ -2475,7 +2646,7 @@
                     </pic:cNvPicPr>
                   </pic:nvPicPr>
                   <pic:blipFill rotWithShape="1">
-                    <a:blip r:embed="rId18">
+                    <a:blip r:embed="rId20">
                       <a:extLst>
                         <a:ext uri="{28A0092B-C50C-407E-A947-70E740481C1C}">
                           <a14:useLocalDpi xmlns:a14="http://schemas.microsoft.com/office/drawing/2010/main" val="0"/>
@@ -2514,6 +2685,7 @@
     </w:p>
     <w:p>
       <w:pPr>
+        <w:spacing w:line="276" w:lineRule="auto"/>
         <w:rPr>
           <w:rFonts w:ascii="Times New Roman" w:hAnsi="Times New Roman" w:cs="Times New Roman"/>
           <w:lang w:eastAsia="es-EC"/>
@@ -2529,26 +2701,27 @@
     </w:p>
     <w:p>
       <w:pPr>
-        <w:rPr>
-          <w:rFonts w:ascii="Times New Roman" w:hAnsi="Times New Roman" w:cs="Times New Roman"/>
-          <w:b/>
-          <w:bCs/>
-          <w:lang w:eastAsia="es-EC"/>
-        </w:rPr>
-      </w:pPr>
-      <w:r>
-        <w:rPr>
-          <w:rFonts w:ascii="Times New Roman" w:hAnsi="Times New Roman" w:cs="Times New Roman"/>
-          <w:b/>
-          <w:bCs/>
-          <w:lang w:eastAsia="es-EC"/>
-        </w:rPr>
-        <w:lastRenderedPageBreak/>
+        <w:spacing w:line="276" w:lineRule="auto"/>
+        <w:rPr>
+          <w:rFonts w:ascii="Times New Roman" w:hAnsi="Times New Roman" w:cs="Times New Roman"/>
+          <w:b/>
+          <w:bCs/>
+          <w:lang w:eastAsia="es-EC"/>
+        </w:rPr>
+      </w:pPr>
+      <w:r>
+        <w:rPr>
+          <w:rFonts w:ascii="Times New Roman" w:hAnsi="Times New Roman" w:cs="Times New Roman"/>
+          <w:b/>
+          <w:bCs/>
+          <w:lang w:eastAsia="es-EC"/>
+        </w:rPr>
         <w:t>7. ARQUITECTURA GENERAL DEL SISTEMA</w:t>
       </w:r>
     </w:p>
     <w:p>
       <w:pPr>
+        <w:spacing w:line="276" w:lineRule="auto"/>
         <w:rPr>
           <w:rFonts w:ascii="Times New Roman" w:hAnsi="Times New Roman" w:cs="Times New Roman"/>
           <w:lang w:eastAsia="es-EC"/>
@@ -2564,6 +2737,7 @@
     </w:p>
     <w:p>
       <w:pPr>
+        <w:spacing w:line="276" w:lineRule="auto"/>
         <w:rPr>
           <w:rFonts w:ascii="Times New Roman" w:hAnsi="Times New Roman" w:cs="Times New Roman"/>
           <w:lang w:eastAsia="es-EC"/>
@@ -2579,6 +2753,7 @@
     </w:p>
     <w:p>
       <w:pPr>
+        <w:spacing w:line="276" w:lineRule="auto"/>
         <w:rPr>
           <w:rFonts w:ascii="Times New Roman" w:hAnsi="Times New Roman" w:cs="Times New Roman"/>
           <w:lang w:eastAsia="es-EC"/>
@@ -2594,6 +2769,7 @@
     </w:p>
     <w:p>
       <w:pPr>
+        <w:spacing w:line="276" w:lineRule="auto"/>
         <w:rPr>
           <w:rFonts w:ascii="Times New Roman" w:hAnsi="Times New Roman" w:cs="Times New Roman"/>
           <w:lang w:eastAsia="es-EC"/>
@@ -2619,7 +2795,7 @@
                     <pic:cNvPicPr/>
                   </pic:nvPicPr>
                   <pic:blipFill rotWithShape="1">
-                    <a:blip r:embed="rId19"/>
+                    <a:blip r:embed="rId21"/>
                     <a:srcRect l="22157" t="15042" r="18576" b="23474"/>
                     <a:stretch>
                       <a:fillRect/>
@@ -2651,21 +2827,24 @@
     </w:p>
     <w:p>
       <w:pPr>
-        <w:rPr>
-          <w:rFonts w:ascii="Times New Roman" w:hAnsi="Times New Roman" w:cs="Times New Roman"/>
-          <w:lang w:eastAsia="es-EC"/>
-        </w:rPr>
-      </w:pPr>
-      <w:r>
-        <w:rPr>
-          <w:rFonts w:ascii="Times New Roman" w:hAnsi="Times New Roman" w:cs="Times New Roman"/>
-          <w:lang w:eastAsia="es-EC"/>
-        </w:rPr>
+        <w:spacing w:line="276" w:lineRule="auto"/>
+        <w:rPr>
+          <w:rFonts w:ascii="Times New Roman" w:hAnsi="Times New Roman" w:cs="Times New Roman"/>
+          <w:lang w:eastAsia="es-EC"/>
+        </w:rPr>
+      </w:pPr>
+      <w:r>
+        <w:rPr>
+          <w:rFonts w:ascii="Times New Roman" w:hAnsi="Times New Roman" w:cs="Times New Roman"/>
+          <w:lang w:eastAsia="es-EC"/>
+        </w:rPr>
+        <w:lastRenderedPageBreak/>
         <w:t>La arquitectura propuesta representa de manera general cómo se relacionan los componentes del sistema y el mecanismo utilizado para gestionar las diferentes versiones del proyecto.</w:t>
       </w:r>
     </w:p>
     <w:p>
       <w:pPr>
+        <w:spacing w:line="276" w:lineRule="auto"/>
         <w:rPr>
           <w:rFonts w:ascii="Times New Roman" w:hAnsi="Times New Roman" w:cs="Times New Roman"/>
           <w:b/>
@@ -2685,6 +2864,7 @@
     </w:p>
     <w:p>
       <w:pPr>
+        <w:spacing w:line="276" w:lineRule="auto"/>
         <w:rPr>
           <w:rFonts w:ascii="Times New Roman" w:hAnsi="Times New Roman" w:cs="Times New Roman"/>
           <w:lang w:eastAsia="es-EC"/>
@@ -2700,6 +2880,7 @@
     </w:p>
     <w:p>
       <w:pPr>
+        <w:spacing w:line="276" w:lineRule="auto"/>
         <w:rPr>
           <w:rFonts w:ascii="Times New Roman" w:hAnsi="Times New Roman" w:cs="Times New Roman"/>
           <w:lang w:eastAsia="es-EC"/>
@@ -2715,6 +2896,7 @@
     </w:p>
     <w:p>
       <w:pPr>
+        <w:spacing w:line="276" w:lineRule="auto"/>
         <w:rPr>
           <w:rFonts w:ascii="Times New Roman" w:hAnsi="Times New Roman" w:cs="Times New Roman"/>
           <w:lang w:eastAsia="es-EC"/>
@@ -2750,6 +2932,7 @@
           <w:ilvl w:val="0"/>
           <w:numId w:val="23"/>
         </w:numPr>
+        <w:spacing w:line="276" w:lineRule="auto"/>
         <w:rPr>
           <w:rFonts w:ascii="Times New Roman" w:hAnsi="Times New Roman" w:cs="Times New Roman"/>
           <w:lang w:eastAsia="es-EC"/>
@@ -2778,6 +2961,7 @@
           <w:ilvl w:val="0"/>
           <w:numId w:val="23"/>
         </w:numPr>
+        <w:spacing w:line="276" w:lineRule="auto"/>
         <w:rPr>
           <w:rFonts w:ascii="Times New Roman" w:hAnsi="Times New Roman" w:cs="Times New Roman"/>
           <w:lang w:eastAsia="es-EC"/>
@@ -2806,6 +2990,7 @@
           <w:ilvl w:val="0"/>
           <w:numId w:val="23"/>
         </w:numPr>
+        <w:spacing w:line="276" w:lineRule="auto"/>
         <w:rPr>
           <w:rFonts w:ascii="Times New Roman" w:hAnsi="Times New Roman" w:cs="Times New Roman"/>
           <w:lang w:eastAsia="es-EC"/>
@@ -2817,7 +3002,6 @@
           <w:rFonts w:ascii="Times New Roman" w:hAnsi="Times New Roman" w:cs="Times New Roman"/>
           <w:lang w:eastAsia="es-EC"/>
         </w:rPr>
-        <w:lastRenderedPageBreak/>
         <w:t>feature</w:t>
       </w:r>
       <w:proofErr w:type="spellEnd"/>
@@ -2851,6 +3035,7 @@
           <w:ilvl w:val="0"/>
           <w:numId w:val="23"/>
         </w:numPr>
+        <w:spacing w:line="276" w:lineRule="auto"/>
         <w:rPr>
           <w:rFonts w:ascii="Times New Roman" w:hAnsi="Times New Roman" w:cs="Times New Roman"/>
           <w:lang w:eastAsia="es-EC"/>
@@ -2891,6 +3076,7 @@
     </w:p>
     <w:p>
       <w:pPr>
+        <w:spacing w:line="276" w:lineRule="auto"/>
         <w:ind w:left="360"/>
         <w:rPr>
           <w:rFonts w:ascii="Times New Roman" w:hAnsi="Times New Roman" w:cs="Times New Roman"/>
@@ -2919,7 +3105,7 @@
                     </pic:cNvPicPr>
                   </pic:nvPicPr>
                   <pic:blipFill rotWithShape="1">
-                    <a:blip r:embed="rId20" cstate="print">
+                    <a:blip r:embed="rId22" cstate="print">
                       <a:extLst>
                         <a:ext uri="{28A0092B-C50C-407E-A947-70E740481C1C}">
                           <a14:useLocalDpi xmlns:a14="http://schemas.microsoft.com/office/drawing/2010/main" val="0"/>
@@ -2958,6 +3144,7 @@
     </w:p>
     <w:p>
       <w:pPr>
+        <w:spacing w:line="276" w:lineRule="auto"/>
         <w:rPr>
           <w:rFonts w:ascii="Times New Roman" w:hAnsi="Times New Roman" w:cs="Times New Roman"/>
           <w:lang w:eastAsia="es-EC"/>
@@ -2973,18 +3160,15 @@
     </w:p>
     <w:p>
       <w:pPr>
-        <w:rPr>
-          <w:rFonts w:ascii="Times New Roman" w:hAnsi="Times New Roman" w:cs="Times New Roman"/>
-          <w:b/>
-          <w:bCs/>
-          <w:lang w:eastAsia="es-EC"/>
-        </w:rPr>
-      </w:pPr>
-      <w:r>
-        <w:rPr>
-          <w:rFonts w:ascii="Times New Roman" w:hAnsi="Times New Roman" w:cs="Times New Roman"/>
-          <w:b/>
-          <w:bCs/>
+        <w:spacing w:line="276" w:lineRule="auto"/>
+        <w:rPr>
+          <w:rFonts w:ascii="Times New Roman" w:hAnsi="Times New Roman" w:cs="Times New Roman"/>
+          <w:lang w:eastAsia="es-EC"/>
+        </w:rPr>
+      </w:pPr>
+      <w:r>
+        <w:rPr>
+          <w:rFonts w:ascii="Times New Roman" w:hAnsi="Times New Roman" w:cs="Times New Roman"/>
           <w:lang w:eastAsia="es-EC"/>
         </w:rPr>
         <w:t xml:space="preserve">Aunque las ramas de </w:t>
@@ -2993,8 +3177,6 @@
       <w:r>
         <w:rPr>
           <w:rFonts w:ascii="Times New Roman" w:hAnsi="Times New Roman" w:cs="Times New Roman"/>
-          <w:b/>
-          <w:bCs/>
           <w:lang w:eastAsia="es-EC"/>
         </w:rPr>
         <w:t>Gitflow</w:t>
@@ -3003,18 +3185,28 @@
       <w:r>
         <w:rPr>
           <w:rFonts w:ascii="Times New Roman" w:hAnsi="Times New Roman" w:cs="Times New Roman"/>
-          <w:b/>
-          <w:bCs/>
-          <w:lang w:eastAsia="es-EC"/>
-        </w:rPr>
-        <w:t xml:space="preserve"> también pueden crearse y administrarse mediante Git Bash, para este proyecto se realizó la creación inicial de las ramas directamente desde GitHub, utilizando el repositorio del sistema. Posteriormente, Git Bash se utilizó para trabajar con el repositorio local y registrar los avances mediante </w:t>
+          <w:lang w:eastAsia="es-EC"/>
+        </w:rPr>
+        <w:t xml:space="preserve"> también pueden crearse y administrarse mediante Git Bash, para este proyecto se realizó la creación inicial de las ramas directamente desde GitHub, utilizando el repositorio del sistema</w:t>
+      </w:r>
+      <w:r>
+        <w:rPr>
+          <w:rFonts w:ascii="Times New Roman" w:hAnsi="Times New Roman" w:cs="Times New Roman"/>
+          <w:lang w:eastAsia="es-EC"/>
+        </w:rPr>
+        <w:t>, p</w:t>
+      </w:r>
+      <w:r>
+        <w:rPr>
+          <w:rFonts w:ascii="Times New Roman" w:hAnsi="Times New Roman" w:cs="Times New Roman"/>
+          <w:lang w:eastAsia="es-EC"/>
+        </w:rPr>
+        <w:t xml:space="preserve">osteriormente, Git Bash se utilizó para trabajar con el repositorio local y registrar los avances mediante </w:t>
       </w:r>
       <w:proofErr w:type="spellStart"/>
       <w:r>
         <w:rPr>
           <w:rFonts w:ascii="Times New Roman" w:hAnsi="Times New Roman" w:cs="Times New Roman"/>
-          <w:b/>
-          <w:bCs/>
           <w:lang w:eastAsia="es-EC"/>
         </w:rPr>
         <w:t>commits</w:t>
@@ -3023,8 +3215,6 @@
       <w:r>
         <w:rPr>
           <w:rFonts w:ascii="Times New Roman" w:hAnsi="Times New Roman" w:cs="Times New Roman"/>
-          <w:b/>
-          <w:bCs/>
           <w:lang w:eastAsia="es-EC"/>
         </w:rPr>
         <w:t>.</w:t>
@@ -3032,6 +3222,7 @@
     </w:p>
     <w:p>
       <w:pPr>
+        <w:spacing w:line="276" w:lineRule="auto"/>
         <w:rPr>
           <w:rFonts w:ascii="Times New Roman" w:hAnsi="Times New Roman" w:cs="Times New Roman"/>
           <w:b/>
@@ -3051,16 +3242,18 @@
     </w:p>
     <w:p>
       <w:pPr>
-        <w:rPr>
-          <w:rFonts w:ascii="Times New Roman" w:hAnsi="Times New Roman" w:cs="Times New Roman"/>
-          <w:lang w:eastAsia="es-EC"/>
-        </w:rPr>
-      </w:pPr>
-      <w:r>
-        <w:rPr>
-          <w:rFonts w:ascii="Times New Roman" w:hAnsi="Times New Roman" w:cs="Times New Roman"/>
-          <w:lang w:eastAsia="es-EC"/>
-        </w:rPr>
+        <w:spacing w:line="276" w:lineRule="auto"/>
+        <w:rPr>
+          <w:rFonts w:ascii="Times New Roman" w:hAnsi="Times New Roman" w:cs="Times New Roman"/>
+          <w:lang w:eastAsia="es-EC"/>
+        </w:rPr>
+      </w:pPr>
+      <w:r>
+        <w:rPr>
+          <w:rFonts w:ascii="Times New Roman" w:hAnsi="Times New Roman" w:cs="Times New Roman"/>
+          <w:lang w:eastAsia="es-EC"/>
+        </w:rPr>
+        <w:lastRenderedPageBreak/>
         <w:t xml:space="preserve">El trabajo se desarrollará mediante </w:t>
       </w:r>
       <w:proofErr w:type="spellStart"/>
@@ -3114,6 +3307,7 @@
     </w:p>
     <w:p>
       <w:pPr>
+        <w:spacing w:line="276" w:lineRule="auto"/>
         <w:rPr>
           <w:rFonts w:ascii="Times New Roman" w:hAnsi="Times New Roman" w:cs="Times New Roman"/>
           <w:lang w:eastAsia="es-EC"/>
@@ -3129,6 +3323,7 @@
     </w:p>
     <w:p>
       <w:pPr>
+        <w:spacing w:line="276" w:lineRule="auto"/>
         <w:rPr>
           <w:rFonts w:ascii="Times New Roman" w:hAnsi="Times New Roman" w:cs="Times New Roman"/>
           <w:b/>
@@ -3168,6 +3363,7 @@
     </w:p>
     <w:p>
       <w:pPr>
+        <w:spacing w:line="276" w:lineRule="auto"/>
         <w:rPr>
           <w:rFonts w:ascii="Times New Roman" w:hAnsi="Times New Roman" w:cs="Times New Roman"/>
           <w:lang w:eastAsia="es-EC"/>
@@ -3183,6 +3379,7 @@
     </w:p>
     <w:p>
       <w:pPr>
+        <w:spacing w:line="276" w:lineRule="auto"/>
         <w:rPr>
           <w:rFonts w:ascii="Times New Roman" w:hAnsi="Times New Roman" w:cs="Times New Roman"/>
           <w:lang w:eastAsia="es-EC"/>
@@ -3198,6 +3395,7 @@
     </w:p>
     <w:p>
       <w:pPr>
+        <w:spacing w:line="276" w:lineRule="auto"/>
         <w:rPr>
           <w:rFonts w:ascii="Times New Roman" w:hAnsi="Times New Roman" w:cs="Times New Roman"/>
           <w:lang w:eastAsia="es-EC"/>
@@ -3240,6 +3438,7 @@
     </w:p>
     <w:p>
       <w:pPr>
+        <w:spacing w:line="276" w:lineRule="auto"/>
         <w:rPr>
           <w:rFonts w:ascii="Times New Roman" w:hAnsi="Times New Roman" w:cs="Times New Roman"/>
           <w:lang w:eastAsia="es-EC"/>
@@ -3360,6 +3559,7 @@
     </w:p>
     <w:p>
       <w:pPr>
+        <w:spacing w:line="276" w:lineRule="auto"/>
         <w:rPr>
           <w:rFonts w:ascii="Times New Roman" w:hAnsi="Times New Roman" w:cs="Times New Roman"/>
           <w:lang w:eastAsia="es-EC"/>
@@ -3393,6 +3593,7 @@
     </w:p>
     <w:p>
       <w:pPr>
+        <w:spacing w:line="276" w:lineRule="auto"/>
         <w:rPr>
           <w:rFonts w:ascii="Times New Roman" w:hAnsi="Times New Roman" w:cs="Times New Roman"/>
           <w:lang w:eastAsia="es-EC"/>
@@ -3404,7 +3605,6 @@
           <w:noProof/>
           <w:lang w:eastAsia="es-EC"/>
         </w:rPr>
-        <w:lastRenderedPageBreak/>
         <w:drawing>
           <wp:inline distT="0" distB="0" distL="0" distR="0" wp14:anchorId="7441475F" wp14:editId="2C43764D">
             <wp:extent cx="5277173" cy="2804779"/>
@@ -3423,7 +3623,7 @@
                     </pic:cNvPicPr>
                   </pic:nvPicPr>
                   <pic:blipFill rotWithShape="1">
-                    <a:blip r:embed="rId21">
+                    <a:blip r:embed="rId23">
                       <a:extLst>
                         <a:ext uri="{28A0092B-C50C-407E-A947-70E740481C1C}">
                           <a14:useLocalDpi xmlns:a14="http://schemas.microsoft.com/office/drawing/2010/main" val="0"/>
@@ -3462,6 +3662,7 @@
     </w:p>
     <w:p>
       <w:pPr>
+        <w:spacing w:line="276" w:lineRule="auto"/>
         <w:rPr>
           <w:rFonts w:ascii="Times New Roman" w:hAnsi="Times New Roman" w:cs="Times New Roman"/>
           <w:b/>
@@ -3501,6 +3702,7 @@
     </w:p>
     <w:p>
       <w:pPr>
+        <w:spacing w:line="276" w:lineRule="auto"/>
         <w:rPr>
           <w:rFonts w:ascii="Times New Roman" w:hAnsi="Times New Roman" w:cs="Times New Roman"/>
           <w:lang w:eastAsia="es-EC"/>
@@ -3518,6 +3720,7 @@
     </w:p>
     <w:p>
       <w:pPr>
+        <w:spacing w:line="276" w:lineRule="auto"/>
         <w:rPr>
           <w:rFonts w:ascii="Times New Roman" w:hAnsi="Times New Roman" w:cs="Times New Roman"/>
           <w:lang w:eastAsia="es-EC"/>
@@ -3533,6 +3736,7 @@
     </w:p>
     <w:p>
       <w:pPr>
+        <w:spacing w:line="276" w:lineRule="auto"/>
         <w:rPr>
           <w:rFonts w:ascii="Times New Roman" w:hAnsi="Times New Roman" w:cs="Times New Roman"/>
           <w:lang w:eastAsia="es-EC"/>
@@ -3621,6 +3825,7 @@
     </w:p>
     <w:p>
       <w:pPr>
+        <w:spacing w:line="276" w:lineRule="auto"/>
         <w:rPr>
           <w:rFonts w:ascii="Times New Roman" w:hAnsi="Times New Roman" w:cs="Times New Roman"/>
           <w:lang w:eastAsia="es-EC"/>
@@ -3648,7 +3853,7 @@
                     <pic:cNvPicPr/>
                   </pic:nvPicPr>
                   <pic:blipFill>
-                    <a:blip r:embed="rId22"/>
+                    <a:blip r:embed="rId24"/>
                     <a:stretch>
                       <a:fillRect/>
                     </a:stretch>
@@ -3671,20 +3876,33 @@
     </w:p>
     <w:p>
       <w:pPr>
-        <w:rPr>
-          <w:rFonts w:ascii="Times New Roman" w:hAnsi="Times New Roman" w:cs="Times New Roman"/>
-          <w:b/>
-          <w:bCs/>
-          <w:lang w:eastAsia="es-EC"/>
-        </w:rPr>
-      </w:pPr>
-      <w:r>
-        <w:rPr>
-          <w:rFonts w:ascii="Times New Roman" w:hAnsi="Times New Roman" w:cs="Times New Roman"/>
-          <w:b/>
-          <w:bCs/>
-          <w:lang w:eastAsia="es-EC"/>
-        </w:rPr>
+        <w:spacing w:line="276" w:lineRule="auto"/>
+        <w:rPr>
+          <w:rFonts w:ascii="Times New Roman" w:hAnsi="Times New Roman" w:cs="Times New Roman"/>
+          <w:b/>
+          <w:bCs/>
+          <w:lang w:eastAsia="es-EC"/>
+        </w:rPr>
+      </w:pPr>
+    </w:p>
+    <w:p>
+      <w:pPr>
+        <w:spacing w:line="276" w:lineRule="auto"/>
+        <w:rPr>
+          <w:rFonts w:ascii="Times New Roman" w:hAnsi="Times New Roman" w:cs="Times New Roman"/>
+          <w:b/>
+          <w:bCs/>
+          <w:lang w:eastAsia="es-EC"/>
+        </w:rPr>
+      </w:pPr>
+      <w:r>
+        <w:rPr>
+          <w:rFonts w:ascii="Times New Roman" w:hAnsi="Times New Roman" w:cs="Times New Roman"/>
+          <w:b/>
+          <w:bCs/>
+          <w:lang w:eastAsia="es-EC"/>
+        </w:rPr>
+        <w:lastRenderedPageBreak/>
         <w:t xml:space="preserve">9.2 Segundo </w:t>
       </w:r>
       <w:proofErr w:type="spellStart"/>
@@ -3710,6 +3928,7 @@
     </w:p>
     <w:p>
       <w:pPr>
+        <w:spacing w:line="276" w:lineRule="auto"/>
         <w:rPr>
           <w:rFonts w:ascii="Times New Roman" w:hAnsi="Times New Roman" w:cs="Times New Roman"/>
           <w:lang w:eastAsia="es-EC"/>
@@ -3725,6 +3944,7 @@
     </w:p>
     <w:p>
       <w:pPr>
+        <w:spacing w:line="276" w:lineRule="auto"/>
         <w:rPr>
           <w:rFonts w:ascii="Times New Roman" w:hAnsi="Times New Roman" w:cs="Times New Roman"/>
           <w:lang w:eastAsia="es-EC"/>
@@ -3740,6 +3960,7 @@
     </w:p>
     <w:p>
       <w:pPr>
+        <w:spacing w:line="276" w:lineRule="auto"/>
         <w:rPr>
           <w:rFonts w:ascii="Times New Roman" w:hAnsi="Times New Roman" w:cs="Times New Roman"/>
           <w:lang w:eastAsia="es-EC"/>
@@ -3782,6 +4003,7 @@
     </w:p>
     <w:p>
       <w:pPr>
+        <w:spacing w:line="276" w:lineRule="auto"/>
         <w:rPr>
           <w:rFonts w:ascii="Times New Roman" w:hAnsi="Times New Roman" w:cs="Times New Roman"/>
           <w:lang w:eastAsia="es-EC"/>
@@ -3854,6 +4076,7 @@
     </w:p>
     <w:p>
       <w:pPr>
+        <w:spacing w:line="276" w:lineRule="auto"/>
         <w:rPr>
           <w:rFonts w:ascii="Times New Roman" w:hAnsi="Times New Roman" w:cs="Times New Roman"/>
           <w:lang w:eastAsia="es-EC"/>
@@ -3887,6 +4110,7 @@
     </w:p>
     <w:p>
       <w:pPr>
+        <w:spacing w:line="276" w:lineRule="auto"/>
         <w:rPr>
           <w:rFonts w:ascii="Times New Roman" w:hAnsi="Times New Roman" w:cs="Times New Roman"/>
           <w:b/>
@@ -3898,7 +4122,6 @@
         <w:rPr>
           <w:noProof/>
         </w:rPr>
-        <w:lastRenderedPageBreak/>
         <w:drawing>
           <wp:inline distT="0" distB="0" distL="0" distR="0" wp14:anchorId="179FC28C" wp14:editId="611CA04B">
             <wp:extent cx="5385435" cy="3417376"/>
@@ -3917,7 +4140,7 @@
                     </pic:cNvPicPr>
                   </pic:nvPicPr>
                   <pic:blipFill rotWithShape="1">
-                    <a:blip r:embed="rId23">
+                    <a:blip r:embed="rId25">
                       <a:extLst>
                         <a:ext uri="{28A0092B-C50C-407E-A947-70E740481C1C}">
                           <a14:useLocalDpi xmlns:a14="http://schemas.microsoft.com/office/drawing/2010/main" val="0"/>
@@ -3956,24 +4179,26 @@
     </w:p>
     <w:p>
       <w:pPr>
-        <w:rPr>
-          <w:rFonts w:ascii="Times New Roman" w:hAnsi="Times New Roman" w:cs="Times New Roman"/>
-          <w:b/>
-          <w:bCs/>
-          <w:lang w:eastAsia="es-EC"/>
-        </w:rPr>
-      </w:pPr>
-      <w:r>
-        <w:rPr>
-          <w:rFonts w:ascii="Times New Roman" w:hAnsi="Times New Roman" w:cs="Times New Roman"/>
-          <w:b/>
-          <w:bCs/>
+        <w:spacing w:line="276" w:lineRule="auto"/>
+        <w:rPr>
+          <w:rFonts w:ascii="Times New Roman" w:hAnsi="Times New Roman" w:cs="Times New Roman"/>
+          <w:b/>
+          <w:bCs/>
+          <w:lang w:eastAsia="es-EC"/>
+        </w:rPr>
+      </w:pPr>
+      <w:r>
+        <w:rPr>
+          <w:rFonts w:ascii="Times New Roman" w:hAnsi="Times New Roman" w:cs="Times New Roman"/>
+          <w:b/>
+          <w:bCs/>
+          <w:noProof/>
           <w:lang w:eastAsia="es-EC"/>
         </w:rPr>
         <w:drawing>
-          <wp:inline distT="0" distB="0" distL="0" distR="0" wp14:anchorId="655B6B2F" wp14:editId="67281FD4">
-            <wp:extent cx="5400040" cy="1160145"/>
-            <wp:effectExtent l="0" t="0" r="0" b="1905"/>
+          <wp:inline distT="0" distB="0" distL="0" distR="0" wp14:anchorId="655B6B2F" wp14:editId="0485BC3C">
+            <wp:extent cx="5190979" cy="1115230"/>
+            <wp:effectExtent l="0" t="0" r="0" b="8890"/>
             <wp:docPr id="6322214" name="Imagen 1"/>
             <wp:cNvGraphicFramePr>
               <a:graphicFrameLocks xmlns:a="http://schemas.openxmlformats.org/drawingml/2006/main" noChangeAspect="1"/>
@@ -3986,7 +4211,7 @@
                     <pic:cNvPicPr/>
                   </pic:nvPicPr>
                   <pic:blipFill>
-                    <a:blip r:embed="rId24"/>
+                    <a:blip r:embed="rId26"/>
                     <a:stretch>
                       <a:fillRect/>
                     </a:stretch>
@@ -3994,7 +4219,7 @@
                   <pic:spPr>
                     <a:xfrm>
                       <a:off x="0" y="0"/>
-                      <a:ext cx="5400040" cy="1160145"/>
+                      <a:ext cx="5205299" cy="1118306"/>
                     </a:xfrm>
                     <a:prstGeom prst="rect">
                       <a:avLst/>
@@ -4009,6 +4234,7 @@
     </w:p>
     <w:p>
       <w:pPr>
+        <w:spacing w:line="276" w:lineRule="auto"/>
         <w:rPr>
           <w:rFonts w:ascii="Times New Roman" w:hAnsi="Times New Roman" w:cs="Times New Roman"/>
           <w:b/>
@@ -4048,18 +4274,15 @@
     </w:p>
     <w:p>
       <w:pPr>
-        <w:rPr>
-          <w:rFonts w:ascii="Times New Roman" w:hAnsi="Times New Roman" w:cs="Times New Roman"/>
-          <w:b/>
-          <w:bCs/>
-          <w:lang w:eastAsia="es-EC"/>
-        </w:rPr>
-      </w:pPr>
-      <w:r>
-        <w:rPr>
-          <w:rFonts w:ascii="Times New Roman" w:hAnsi="Times New Roman" w:cs="Times New Roman"/>
-          <w:b/>
-          <w:bCs/>
+        <w:spacing w:line="276" w:lineRule="auto"/>
+        <w:rPr>
+          <w:rFonts w:ascii="Times New Roman" w:hAnsi="Times New Roman" w:cs="Times New Roman"/>
+          <w:lang w:eastAsia="es-EC"/>
+        </w:rPr>
+      </w:pPr>
+      <w:r>
+        <w:rPr>
+          <w:rFonts w:ascii="Times New Roman" w:hAnsi="Times New Roman" w:cs="Times New Roman"/>
           <w:lang w:eastAsia="es-EC"/>
         </w:rPr>
         <w:t>En la tercera etapa se registrará la finalización del contenido principal de la actividad.</w:t>
@@ -4067,18 +4290,15 @@
     </w:p>
     <w:p>
       <w:pPr>
-        <w:rPr>
-          <w:rFonts w:ascii="Times New Roman" w:hAnsi="Times New Roman" w:cs="Times New Roman"/>
-          <w:b/>
-          <w:bCs/>
-          <w:lang w:eastAsia="es-EC"/>
-        </w:rPr>
-      </w:pPr>
-      <w:r>
-        <w:rPr>
-          <w:rFonts w:ascii="Times New Roman" w:hAnsi="Times New Roman" w:cs="Times New Roman"/>
-          <w:b/>
-          <w:bCs/>
+        <w:spacing w:line="276" w:lineRule="auto"/>
+        <w:rPr>
+          <w:rFonts w:ascii="Times New Roman" w:hAnsi="Times New Roman" w:cs="Times New Roman"/>
+          <w:lang w:eastAsia="es-EC"/>
+        </w:rPr>
+      </w:pPr>
+      <w:r>
+        <w:rPr>
+          <w:rFonts w:ascii="Times New Roman" w:hAnsi="Times New Roman" w:cs="Times New Roman"/>
           <w:lang w:eastAsia="es-EC"/>
         </w:rPr>
         <w:t>Después de verificar el informe, se ejecutará:</w:t>
@@ -4086,10 +4306,9 @@
     </w:p>
     <w:p>
       <w:pPr>
-        <w:rPr>
-          <w:rFonts w:ascii="Times New Roman" w:hAnsi="Times New Roman" w:cs="Times New Roman"/>
-          <w:b/>
-          <w:bCs/>
+        <w:spacing w:line="276" w:lineRule="auto"/>
+        <w:rPr>
+          <w:rFonts w:ascii="Times New Roman" w:hAnsi="Times New Roman" w:cs="Times New Roman"/>
           <w:lang w:eastAsia="es-EC"/>
         </w:rPr>
       </w:pPr>
@@ -4097,8 +4316,6 @@
       <w:r>
         <w:rPr>
           <w:rFonts w:ascii="Times New Roman" w:hAnsi="Times New Roman" w:cs="Times New Roman"/>
-          <w:b/>
-          <w:bCs/>
           <w:lang w:eastAsia="es-EC"/>
         </w:rPr>
         <w:t>git</w:t>
@@ -4107,8 +4324,6 @@
       <w:r>
         <w:rPr>
           <w:rFonts w:ascii="Times New Roman" w:hAnsi="Times New Roman" w:cs="Times New Roman"/>
-          <w:b/>
-          <w:bCs/>
           <w:lang w:eastAsia="es-EC"/>
         </w:rPr>
         <w:t xml:space="preserve"> </w:t>
@@ -4118,8 +4333,6 @@
       <w:r>
         <w:rPr>
           <w:rFonts w:ascii="Times New Roman" w:hAnsi="Times New Roman" w:cs="Times New Roman"/>
-          <w:b/>
-          <w:bCs/>
           <w:lang w:eastAsia="es-EC"/>
         </w:rPr>
         <w:t>add</w:t>
@@ -4128,8 +4341,6 @@
       <w:r>
         <w:rPr>
           <w:rFonts w:ascii="Times New Roman" w:hAnsi="Times New Roman" w:cs="Times New Roman"/>
-          <w:b/>
-          <w:bCs/>
           <w:lang w:eastAsia="es-EC"/>
         </w:rPr>
         <w:t xml:space="preserve"> .</w:t>
@@ -4138,10 +4349,9 @@
     </w:p>
     <w:p>
       <w:pPr>
-        <w:rPr>
-          <w:rFonts w:ascii="Times New Roman" w:hAnsi="Times New Roman" w:cs="Times New Roman"/>
-          <w:b/>
-          <w:bCs/>
+        <w:spacing w:line="276" w:lineRule="auto"/>
+        <w:rPr>
+          <w:rFonts w:ascii="Times New Roman" w:hAnsi="Times New Roman" w:cs="Times New Roman"/>
           <w:lang w:eastAsia="es-EC"/>
         </w:rPr>
       </w:pPr>
@@ -4149,8 +4359,6 @@
       <w:r>
         <w:rPr>
           <w:rFonts w:ascii="Times New Roman" w:hAnsi="Times New Roman" w:cs="Times New Roman"/>
-          <w:b/>
-          <w:bCs/>
           <w:lang w:eastAsia="es-EC"/>
         </w:rPr>
         <w:t>git</w:t>
@@ -4159,8 +4367,6 @@
       <w:r>
         <w:rPr>
           <w:rFonts w:ascii="Times New Roman" w:hAnsi="Times New Roman" w:cs="Times New Roman"/>
-          <w:b/>
-          <w:bCs/>
           <w:lang w:eastAsia="es-EC"/>
         </w:rPr>
         <w:t xml:space="preserve"> </w:t>
@@ -4169,8 +4375,6 @@
       <w:r>
         <w:rPr>
           <w:rFonts w:ascii="Times New Roman" w:hAnsi="Times New Roman" w:cs="Times New Roman"/>
-          <w:b/>
-          <w:bCs/>
           <w:lang w:eastAsia="es-EC"/>
         </w:rPr>
         <w:t>commit</w:t>
@@ -4179,27 +4383,14 @@
       <w:r>
         <w:rPr>
           <w:rFonts w:ascii="Times New Roman" w:hAnsi="Times New Roman" w:cs="Times New Roman"/>
-          <w:b/>
-          <w:bCs/>
-          <w:lang w:eastAsia="es-EC"/>
-        </w:rPr>
-        <w:t xml:space="preserve"> -m "</w:t>
-      </w:r>
-      <w:r>
-        <w:rPr>
-          <w:rFonts w:ascii="Times New Roman" w:hAnsi="Times New Roman" w:cs="Times New Roman"/>
-          <w:b/>
-          <w:bCs/>
-          <w:lang w:eastAsia="es-EC"/>
-        </w:rPr>
-        <w:t xml:space="preserve">tercer </w:t>
+          <w:lang w:eastAsia="es-EC"/>
+        </w:rPr>
+        <w:t xml:space="preserve"> -m "tercer </w:t>
       </w:r>
       <w:proofErr w:type="spellStart"/>
       <w:r>
         <w:rPr>
           <w:rFonts w:ascii="Times New Roman" w:hAnsi="Times New Roman" w:cs="Times New Roman"/>
-          <w:b/>
-          <w:bCs/>
           <w:lang w:eastAsia="es-EC"/>
         </w:rPr>
         <w:t>commit</w:t>
@@ -4208,393 +4399,712 @@
       <w:r>
         <w:rPr>
           <w:rFonts w:ascii="Times New Roman" w:hAnsi="Times New Roman" w:cs="Times New Roman"/>
-          <w:b/>
-          <w:bCs/>
-          <w:lang w:eastAsia="es-EC"/>
-        </w:rPr>
-        <w:t xml:space="preserve">: </w:t>
-      </w:r>
-      <w:r>
-        <w:rPr>
-          <w:rFonts w:ascii="Times New Roman" w:hAnsi="Times New Roman" w:cs="Times New Roman"/>
-          <w:b/>
-          <w:bCs/>
-          <w:lang w:eastAsia="es-EC"/>
-        </w:rPr>
-        <w:t xml:space="preserve">se </w:t>
+          <w:lang w:eastAsia="es-EC"/>
+        </w:rPr>
+        <w:t>: se finaliz</w:t>
+      </w:r>
+      <w:r>
+        <w:rPr>
+          <w:rFonts w:ascii="Times New Roman" w:hAnsi="Times New Roman" w:cs="Times New Roman"/>
+          <w:lang w:eastAsia="es-EC"/>
+        </w:rPr>
+        <w:t>a</w:t>
+      </w:r>
+      <w:r>
+        <w:rPr>
+          <w:rFonts w:ascii="Times New Roman" w:hAnsi="Times New Roman" w:cs="Times New Roman"/>
+          <w:lang w:eastAsia="es-EC"/>
+        </w:rPr>
+        <w:t xml:space="preserve"> </w:t>
+      </w:r>
+      <w:r>
+        <w:rPr>
+          <w:rFonts w:ascii="Times New Roman" w:hAnsi="Times New Roman" w:cs="Times New Roman"/>
+          <w:lang w:eastAsia="es-EC"/>
+        </w:rPr>
+        <w:t xml:space="preserve">el trabajo de la actividad en la plantilla y se realizan últimos detalles para convertir en </w:t>
       </w:r>
       <w:proofErr w:type="spellStart"/>
       <w:r>
         <w:rPr>
           <w:rFonts w:ascii="Times New Roman" w:hAnsi="Times New Roman" w:cs="Times New Roman"/>
-          <w:b/>
-          <w:bCs/>
-          <w:lang w:eastAsia="es-EC"/>
-        </w:rPr>
-        <w:t>finalizo</w:t>
+          <w:lang w:eastAsia="es-EC"/>
+        </w:rPr>
+        <w:t>pdf</w:t>
       </w:r>
       <w:proofErr w:type="spellEnd"/>
       <w:r>
         <w:rPr>
           <w:rFonts w:ascii="Times New Roman" w:hAnsi="Times New Roman" w:cs="Times New Roman"/>
-          <w:b/>
-          <w:bCs/>
-          <w:lang w:eastAsia="es-EC"/>
-        </w:rPr>
-        <w:t xml:space="preserve"> el trabajo de la actividad</w:t>
-      </w:r>
-      <w:r>
-        <w:rPr>
-          <w:rFonts w:ascii="Times New Roman" w:hAnsi="Times New Roman" w:cs="Times New Roman"/>
-          <w:b/>
-          <w:bCs/>
-          <w:lang w:eastAsia="es-EC"/>
-        </w:rPr>
-        <w:t xml:space="preserve">, revisando y dando últimos detalles para convertir en </w:t>
-      </w:r>
+          <w:lang w:eastAsia="es-EC"/>
+        </w:rPr>
+        <w:t>"</w:t>
+      </w:r>
+    </w:p>
+    <w:p>
+      <w:pPr>
+        <w:spacing w:line="276" w:lineRule="auto"/>
+        <w:rPr>
+          <w:rFonts w:ascii="Times New Roman" w:hAnsi="Times New Roman" w:cs="Times New Roman"/>
+          <w:lang w:eastAsia="es-EC"/>
+        </w:rPr>
+      </w:pPr>
       <w:proofErr w:type="spellStart"/>
       <w:r>
         <w:rPr>
           <w:rFonts w:ascii="Times New Roman" w:hAnsi="Times New Roman" w:cs="Times New Roman"/>
-          <w:b/>
-          <w:bCs/>
-          <w:lang w:eastAsia="es-EC"/>
-        </w:rPr>
-        <w:t>pdf</w:t>
+          <w:lang w:eastAsia="es-EC"/>
+        </w:rPr>
+        <w:t>git</w:t>
       </w:r>
       <w:proofErr w:type="spellEnd"/>
       <w:r>
         <w:rPr>
           <w:rFonts w:ascii="Times New Roman" w:hAnsi="Times New Roman" w:cs="Times New Roman"/>
-          <w:b/>
-          <w:bCs/>
-          <w:lang w:eastAsia="es-EC"/>
-        </w:rPr>
-        <w:t>"</w:t>
-      </w:r>
-    </w:p>
-    <w:p>
-      <w:pPr>
-        <w:rPr>
-          <w:rFonts w:ascii="Times New Roman" w:hAnsi="Times New Roman" w:cs="Times New Roman"/>
-          <w:b/>
-          <w:bCs/>
-          <w:lang w:eastAsia="es-EC"/>
-        </w:rPr>
-      </w:pPr>
+          <w:lang w:eastAsia="es-EC"/>
+        </w:rPr>
+        <w:t xml:space="preserve"> </w:t>
+      </w:r>
       <w:proofErr w:type="spellStart"/>
       <w:r>
         <w:rPr>
           <w:rFonts w:ascii="Times New Roman" w:hAnsi="Times New Roman" w:cs="Times New Roman"/>
-          <w:b/>
-          <w:bCs/>
-          <w:lang w:eastAsia="es-EC"/>
-        </w:rPr>
-        <w:t>git</w:t>
+          <w:lang w:eastAsia="es-EC"/>
+        </w:rPr>
+        <w:t>push</w:t>
       </w:r>
       <w:proofErr w:type="spellEnd"/>
-      <w:r>
-        <w:rPr>
-          <w:rFonts w:ascii="Times New Roman" w:hAnsi="Times New Roman" w:cs="Times New Roman"/>
-          <w:b/>
-          <w:bCs/>
+    </w:p>
+    <w:p>
+      <w:pPr>
+        <w:rPr>
+          <w:rFonts w:ascii="Times New Roman" w:hAnsi="Times New Roman" w:cs="Times New Roman"/>
+          <w:b/>
+          <w:bCs/>
+          <w:lang w:eastAsia="es-EC"/>
+        </w:rPr>
+      </w:pPr>
+      <w:r>
+        <w:rPr>
+          <w:noProof/>
+        </w:rPr>
+        <w:lastRenderedPageBreak/>
+        <w:drawing>
+          <wp:inline distT="0" distB="0" distL="0" distR="0" wp14:anchorId="5D32EEFA" wp14:editId="3DB874C2">
+            <wp:extent cx="4742482" cy="1972879"/>
+            <wp:effectExtent l="0" t="0" r="1270" b="8890"/>
+            <wp:docPr id="495268345" name="Imagen 1"/>
+            <wp:cNvGraphicFramePr>
+              <a:graphicFrameLocks xmlns:a="http://schemas.openxmlformats.org/drawingml/2006/main" noChangeAspect="1"/>
+            </wp:cNvGraphicFramePr>
+            <a:graphic xmlns:a="http://schemas.openxmlformats.org/drawingml/2006/main">
+              <a:graphicData uri="http://schemas.openxmlformats.org/drawingml/2006/picture">
+                <pic:pic xmlns:pic="http://schemas.openxmlformats.org/drawingml/2006/picture">
+                  <pic:nvPicPr>
+                    <pic:cNvPr id="495268345" name=""/>
+                    <pic:cNvPicPr/>
+                  </pic:nvPicPr>
+                  <pic:blipFill rotWithShape="1">
+                    <a:blip r:embed="rId27"/>
+                    <a:srcRect r="29971" b="48215"/>
+                    <a:stretch>
+                      <a:fillRect/>
+                    </a:stretch>
+                  </pic:blipFill>
+                  <pic:spPr bwMode="auto">
+                    <a:xfrm>
+                      <a:off x="0" y="0"/>
+                      <a:ext cx="4742482" cy="1972879"/>
+                    </a:xfrm>
+                    <a:prstGeom prst="rect">
+                      <a:avLst/>
+                    </a:prstGeom>
+                    <a:ln>
+                      <a:noFill/>
+                    </a:ln>
+                    <a:extLst>
+                      <a:ext uri="{53640926-AAD7-44D8-BBD7-CCE9431645EC}">
+                        <a14:shadowObscured xmlns:a14="http://schemas.microsoft.com/office/drawing/2010/main"/>
+                      </a:ext>
+                    </a:extLst>
+                  </pic:spPr>
+                </pic:pic>
+              </a:graphicData>
+            </a:graphic>
+          </wp:inline>
+        </w:drawing>
+      </w:r>
+    </w:p>
+    <w:p>
+      <w:pPr>
+        <w:rPr>
+          <w:rFonts w:ascii="Times New Roman" w:hAnsi="Times New Roman" w:cs="Times New Roman"/>
+          <w:b/>
+          <w:bCs/>
+          <w:lang w:eastAsia="es-EC"/>
+        </w:rPr>
+      </w:pPr>
+      <w:r>
+        <w:rPr>
+          <w:rFonts w:ascii="Times New Roman" w:hAnsi="Times New Roman" w:cs="Times New Roman"/>
+          <w:b/>
+          <w:bCs/>
+          <w:noProof/>
+          <w:lang w:eastAsia="es-EC"/>
+        </w:rPr>
+        <w:drawing>
+          <wp:inline distT="0" distB="0" distL="0" distR="0" wp14:anchorId="2D145278" wp14:editId="619387F1">
+            <wp:extent cx="5400040" cy="1479550"/>
+            <wp:effectExtent l="0" t="0" r="0" b="6350"/>
+            <wp:docPr id="535956875" name="Imagen 1"/>
+            <wp:cNvGraphicFramePr>
+              <a:graphicFrameLocks xmlns:a="http://schemas.openxmlformats.org/drawingml/2006/main" noChangeAspect="1"/>
+            </wp:cNvGraphicFramePr>
+            <a:graphic xmlns:a="http://schemas.openxmlformats.org/drawingml/2006/main">
+              <a:graphicData uri="http://schemas.openxmlformats.org/drawingml/2006/picture">
+                <pic:pic xmlns:pic="http://schemas.openxmlformats.org/drawingml/2006/picture">
+                  <pic:nvPicPr>
+                    <pic:cNvPr id="535956875" name=""/>
+                    <pic:cNvPicPr/>
+                  </pic:nvPicPr>
+                  <pic:blipFill>
+                    <a:blip r:embed="rId28"/>
+                    <a:stretch>
+                      <a:fillRect/>
+                    </a:stretch>
+                  </pic:blipFill>
+                  <pic:spPr>
+                    <a:xfrm>
+                      <a:off x="0" y="0"/>
+                      <a:ext cx="5400040" cy="1479550"/>
+                    </a:xfrm>
+                    <a:prstGeom prst="rect">
+                      <a:avLst/>
+                    </a:prstGeom>
+                  </pic:spPr>
+                </pic:pic>
+              </a:graphicData>
+            </a:graphic>
+          </wp:inline>
+        </w:drawing>
+      </w:r>
+    </w:p>
+    <w:p>
+      <w:pPr>
+        <w:spacing w:line="276" w:lineRule="auto"/>
+        <w:rPr>
+          <w:rFonts w:ascii="Times New Roman" w:hAnsi="Times New Roman" w:cs="Times New Roman"/>
+          <w:b/>
+          <w:bCs/>
+          <w:lang w:eastAsia="es-EC"/>
+        </w:rPr>
+      </w:pPr>
+      <w:r>
+        <w:rPr>
+          <w:rFonts w:ascii="Times New Roman" w:hAnsi="Times New Roman" w:cs="Times New Roman"/>
+          <w:b/>
+          <w:bCs/>
+          <w:lang w:eastAsia="es-EC"/>
+        </w:rPr>
+        <w:t>10. RESULTADOS</w:t>
+      </w:r>
+    </w:p>
+    <w:p>
+      <w:pPr>
+        <w:spacing w:line="276" w:lineRule="auto"/>
+        <w:rPr>
+          <w:rFonts w:ascii="Times New Roman" w:hAnsi="Times New Roman" w:cs="Times New Roman"/>
+          <w:lang w:eastAsia="es-EC"/>
+        </w:rPr>
+      </w:pPr>
+      <w:r>
+        <w:rPr>
+          <w:rFonts w:ascii="Times New Roman" w:hAnsi="Times New Roman" w:cs="Times New Roman"/>
+          <w:lang w:eastAsia="es-EC"/>
+        </w:rPr>
+        <w:t>Como resultado del análisis se obtuvo una propuesta de diseño para un Sistema de Control de Rescate y Adopción Animal, representada mediante diferentes diagramas UML y patrones de diseño.</w:t>
+      </w:r>
+    </w:p>
+    <w:p>
+      <w:pPr>
+        <w:spacing w:line="276" w:lineRule="auto"/>
+        <w:rPr>
+          <w:rFonts w:ascii="Times New Roman" w:hAnsi="Times New Roman" w:cs="Times New Roman"/>
+          <w:lang w:eastAsia="es-EC"/>
+        </w:rPr>
+      </w:pPr>
+      <w:r>
+        <w:rPr>
+          <w:rFonts w:ascii="Times New Roman" w:hAnsi="Times New Roman" w:cs="Times New Roman"/>
+          <w:lang w:eastAsia="es-EC"/>
+        </w:rPr>
+        <w:t>El diagrama de casos de uso permitió identificar las principales interacciones del sistema, mientras que el diagrama de clases permitió establecer una estructura para los elementos que forman parte de la solución.</w:t>
+      </w:r>
+    </w:p>
+    <w:p>
+      <w:pPr>
+        <w:spacing w:line="276" w:lineRule="auto"/>
+        <w:rPr>
+          <w:rFonts w:ascii="Times New Roman" w:hAnsi="Times New Roman" w:cs="Times New Roman"/>
+          <w:lang w:eastAsia="es-EC"/>
+        </w:rPr>
+      </w:pPr>
+      <w:r>
+        <w:rPr>
+          <w:rFonts w:ascii="Times New Roman" w:hAnsi="Times New Roman" w:cs="Times New Roman"/>
+          <w:lang w:eastAsia="es-EC"/>
+        </w:rPr>
+        <w:t xml:space="preserve">También se planteó el uso de los patrones Singleton, </w:t>
+      </w:r>
+      <w:proofErr w:type="spellStart"/>
+      <w:r>
+        <w:rPr>
+          <w:rFonts w:ascii="Times New Roman" w:hAnsi="Times New Roman" w:cs="Times New Roman"/>
+          <w:lang w:eastAsia="es-EC"/>
+        </w:rPr>
+        <w:t>Observer</w:t>
+      </w:r>
+      <w:proofErr w:type="spellEnd"/>
+      <w:r>
+        <w:rPr>
+          <w:rFonts w:ascii="Times New Roman" w:hAnsi="Times New Roman" w:cs="Times New Roman"/>
+          <w:lang w:eastAsia="es-EC"/>
+        </w:rPr>
+        <w:t xml:space="preserve"> y Factory, con el objetivo de representar diferentes alternativas de organización y comunicación entre los componentes del sistema</w:t>
+      </w:r>
+      <w:r>
+        <w:rPr>
+          <w:rFonts w:ascii="Times New Roman" w:hAnsi="Times New Roman" w:cs="Times New Roman"/>
+          <w:lang w:eastAsia="es-EC"/>
+        </w:rPr>
+        <w:t xml:space="preserve"> consultando por diferentes medios</w:t>
+      </w:r>
+      <w:r>
+        <w:rPr>
+          <w:rFonts w:ascii="Times New Roman" w:hAnsi="Times New Roman" w:cs="Times New Roman"/>
+          <w:lang w:eastAsia="es-EC"/>
+        </w:rPr>
+        <w:t>.</w:t>
+      </w:r>
+    </w:p>
+    <w:p>
+      <w:pPr>
+        <w:spacing w:line="276" w:lineRule="auto"/>
+        <w:rPr>
+          <w:rFonts w:ascii="Times New Roman" w:hAnsi="Times New Roman" w:cs="Times New Roman"/>
+          <w:lang w:eastAsia="es-EC"/>
+        </w:rPr>
+      </w:pPr>
+      <w:r>
+        <w:rPr>
+          <w:rFonts w:ascii="Times New Roman" w:hAnsi="Times New Roman" w:cs="Times New Roman"/>
+          <w:lang w:eastAsia="es-EC"/>
+        </w:rPr>
+        <w:t xml:space="preserve">Finalmente, se estableció una estructura de control de versiones utilizando Git y GitHub, con las ramas </w:t>
+      </w:r>
+      <w:proofErr w:type="gramStart"/>
+      <w:r>
+        <w:rPr>
+          <w:rFonts w:ascii="Times New Roman" w:hAnsi="Times New Roman" w:cs="Times New Roman"/>
+          <w:lang w:eastAsia="es-EC"/>
+        </w:rPr>
+        <w:t>master</w:t>
+      </w:r>
+      <w:proofErr w:type="gramEnd"/>
+      <w:r>
+        <w:rPr>
+          <w:rFonts w:ascii="Times New Roman" w:hAnsi="Times New Roman" w:cs="Times New Roman"/>
+          <w:lang w:eastAsia="es-EC"/>
+        </w:rPr>
+        <w:t xml:space="preserve">, </w:t>
+      </w:r>
+      <w:proofErr w:type="spellStart"/>
+      <w:r>
+        <w:rPr>
+          <w:rFonts w:ascii="Times New Roman" w:hAnsi="Times New Roman" w:cs="Times New Roman"/>
+          <w:lang w:eastAsia="es-EC"/>
+        </w:rPr>
+        <w:t>develop</w:t>
+      </w:r>
+      <w:proofErr w:type="spellEnd"/>
+      <w:r>
+        <w:rPr>
+          <w:rFonts w:ascii="Times New Roman" w:hAnsi="Times New Roman" w:cs="Times New Roman"/>
+          <w:lang w:eastAsia="es-EC"/>
+        </w:rPr>
+        <w:t xml:space="preserve"> y </w:t>
+      </w:r>
+      <w:proofErr w:type="spellStart"/>
+      <w:r>
+        <w:rPr>
+          <w:rFonts w:ascii="Times New Roman" w:hAnsi="Times New Roman" w:cs="Times New Roman"/>
+          <w:lang w:eastAsia="es-EC"/>
+        </w:rPr>
+        <w:t>feature</w:t>
+      </w:r>
+      <w:proofErr w:type="spellEnd"/>
+      <w:r>
+        <w:rPr>
+          <w:rFonts w:ascii="Times New Roman" w:hAnsi="Times New Roman" w:cs="Times New Roman"/>
+          <w:lang w:eastAsia="es-EC"/>
+        </w:rPr>
+        <w:t xml:space="preserve">/, permitiendo organizar los avances del proyecto mediante </w:t>
+      </w:r>
+      <w:proofErr w:type="spellStart"/>
+      <w:r>
+        <w:rPr>
+          <w:rFonts w:ascii="Times New Roman" w:hAnsi="Times New Roman" w:cs="Times New Roman"/>
+          <w:lang w:eastAsia="es-EC"/>
+        </w:rPr>
+        <w:t>commits</w:t>
+      </w:r>
+      <w:proofErr w:type="spellEnd"/>
+      <w:r>
+        <w:rPr>
+          <w:rFonts w:ascii="Times New Roman" w:hAnsi="Times New Roman" w:cs="Times New Roman"/>
+          <w:lang w:eastAsia="es-EC"/>
+        </w:rPr>
+        <w:t>.</w:t>
+      </w:r>
+    </w:p>
+    <w:p>
+      <w:pPr>
+        <w:spacing w:line="276" w:lineRule="auto"/>
+        <w:rPr>
+          <w:rFonts w:ascii="Times New Roman" w:hAnsi="Times New Roman" w:cs="Times New Roman"/>
+          <w:b/>
+          <w:bCs/>
+          <w:lang w:eastAsia="es-EC"/>
+        </w:rPr>
+      </w:pPr>
+    </w:p>
+    <w:p>
+      <w:pPr>
+        <w:spacing w:line="276" w:lineRule="auto"/>
+        <w:rPr>
+          <w:rFonts w:ascii="Times New Roman" w:hAnsi="Times New Roman" w:cs="Times New Roman"/>
+          <w:b/>
+          <w:bCs/>
+          <w:lang w:eastAsia="es-EC"/>
+        </w:rPr>
+      </w:pPr>
+    </w:p>
+    <w:p>
+      <w:pPr>
+        <w:spacing w:line="276" w:lineRule="auto"/>
+        <w:rPr>
+          <w:rFonts w:ascii="Times New Roman" w:hAnsi="Times New Roman" w:cs="Times New Roman"/>
+          <w:b/>
+          <w:bCs/>
+          <w:lang w:eastAsia="es-EC"/>
+        </w:rPr>
+      </w:pPr>
+    </w:p>
+    <w:p>
+      <w:pPr>
+        <w:spacing w:line="276" w:lineRule="auto"/>
+        <w:rPr>
+          <w:rFonts w:ascii="Times New Roman" w:hAnsi="Times New Roman" w:cs="Times New Roman"/>
+          <w:b/>
+          <w:bCs/>
+          <w:lang w:eastAsia="es-EC"/>
+        </w:rPr>
+      </w:pPr>
+    </w:p>
+    <w:p>
+      <w:pPr>
+        <w:spacing w:line="276" w:lineRule="auto"/>
+        <w:rPr>
+          <w:rFonts w:ascii="Times New Roman" w:hAnsi="Times New Roman" w:cs="Times New Roman"/>
+          <w:b/>
+          <w:bCs/>
+          <w:lang w:eastAsia="es-EC"/>
+        </w:rPr>
+      </w:pPr>
+    </w:p>
+    <w:p>
+      <w:pPr>
+        <w:spacing w:line="276" w:lineRule="auto"/>
+        <w:rPr>
+          <w:rFonts w:ascii="Times New Roman" w:hAnsi="Times New Roman" w:cs="Times New Roman"/>
+          <w:b/>
+          <w:bCs/>
+          <w:lang w:eastAsia="es-EC"/>
+        </w:rPr>
+      </w:pPr>
+    </w:p>
+    <w:p>
+      <w:pPr>
+        <w:spacing w:line="276" w:lineRule="auto"/>
+        <w:rPr>
+          <w:rFonts w:ascii="Times New Roman" w:hAnsi="Times New Roman" w:cs="Times New Roman"/>
+          <w:b/>
+          <w:bCs/>
+          <w:lang w:eastAsia="es-EC"/>
+        </w:rPr>
+      </w:pPr>
+    </w:p>
+    <w:p>
+      <w:pPr>
+        <w:spacing w:line="276" w:lineRule="auto"/>
+        <w:rPr>
+          <w:rFonts w:ascii="Times New Roman" w:hAnsi="Times New Roman" w:cs="Times New Roman"/>
+          <w:b/>
+          <w:bCs/>
+          <w:lang w:eastAsia="es-EC"/>
+        </w:rPr>
+      </w:pPr>
+      <w:r>
+        <w:rPr>
+          <w:rFonts w:ascii="Times New Roman" w:hAnsi="Times New Roman" w:cs="Times New Roman"/>
+          <w:b/>
+          <w:bCs/>
+          <w:lang w:eastAsia="es-EC"/>
+        </w:rPr>
+        <w:lastRenderedPageBreak/>
+        <w:t>11. CONCLUSIONES</w:t>
+      </w:r>
+    </w:p>
+    <w:p>
+      <w:pPr>
+        <w:spacing w:line="276" w:lineRule="auto"/>
+        <w:rPr>
+          <w:rFonts w:ascii="Times New Roman" w:hAnsi="Times New Roman" w:cs="Times New Roman"/>
+          <w:lang w:eastAsia="es-EC"/>
+        </w:rPr>
+      </w:pPr>
+      <w:r>
+        <w:rPr>
+          <w:rFonts w:ascii="Times New Roman" w:hAnsi="Times New Roman" w:cs="Times New Roman"/>
+          <w:lang w:eastAsia="es-EC"/>
+        </w:rPr>
+        <w:t>El desarrollo de la actividad permitió comprender la importancia de realizar un análisis previo antes de implementar un sistema informático</w:t>
+      </w:r>
+      <w:r>
+        <w:rPr>
+          <w:rFonts w:ascii="Times New Roman" w:hAnsi="Times New Roman" w:cs="Times New Roman"/>
+          <w:lang w:eastAsia="es-EC"/>
+        </w:rPr>
+        <w:t>, l</w:t>
+      </w:r>
+      <w:r>
+        <w:rPr>
+          <w:rFonts w:ascii="Times New Roman" w:hAnsi="Times New Roman" w:cs="Times New Roman"/>
+          <w:lang w:eastAsia="es-EC"/>
+        </w:rPr>
+        <w:t>a utilización de diagramas UML facilita la representación de los elementos que intervienen en una solución y permite comprender mejor la estructura propuesta.</w:t>
+      </w:r>
+    </w:p>
+    <w:p>
+      <w:pPr>
+        <w:spacing w:line="276" w:lineRule="auto"/>
+        <w:rPr>
+          <w:rFonts w:ascii="Times New Roman" w:hAnsi="Times New Roman" w:cs="Times New Roman"/>
+          <w:lang w:eastAsia="es-EC"/>
+        </w:rPr>
+      </w:pPr>
+      <w:r>
+        <w:rPr>
+          <w:rFonts w:ascii="Times New Roman" w:hAnsi="Times New Roman" w:cs="Times New Roman"/>
+          <w:lang w:eastAsia="es-EC"/>
+        </w:rPr>
+        <w:t xml:space="preserve">La aplicación de patrones de diseño como Singleton, </w:t>
+      </w:r>
+      <w:proofErr w:type="spellStart"/>
+      <w:r>
+        <w:rPr>
+          <w:rFonts w:ascii="Times New Roman" w:hAnsi="Times New Roman" w:cs="Times New Roman"/>
+          <w:lang w:eastAsia="es-EC"/>
+        </w:rPr>
+        <w:t>Observer</w:t>
+      </w:r>
+      <w:proofErr w:type="spellEnd"/>
+      <w:r>
+        <w:rPr>
+          <w:rFonts w:ascii="Times New Roman" w:hAnsi="Times New Roman" w:cs="Times New Roman"/>
+          <w:lang w:eastAsia="es-EC"/>
+        </w:rPr>
+        <w:t xml:space="preserve"> y Factory permitió conocer diferentes alternativas para organizar los componentes de un sistema y establecer relaciones entre ellos de una manera estructurada.</w:t>
+      </w:r>
+    </w:p>
+    <w:p>
+      <w:pPr>
+        <w:spacing w:line="276" w:lineRule="auto"/>
+        <w:rPr>
+          <w:rFonts w:ascii="Times New Roman" w:hAnsi="Times New Roman" w:cs="Times New Roman"/>
+          <w:lang w:eastAsia="es-EC"/>
+        </w:rPr>
+      </w:pPr>
+      <w:r>
+        <w:rPr>
+          <w:rFonts w:ascii="Times New Roman" w:hAnsi="Times New Roman" w:cs="Times New Roman"/>
+          <w:lang w:eastAsia="es-EC"/>
+        </w:rPr>
+        <w:t xml:space="preserve">Además, el uso de Git y GitHub permitió comprender la importancia del control de versiones durante el desarrollo de software. La utilización de ramas como </w:t>
+      </w:r>
+      <w:proofErr w:type="gramStart"/>
+      <w:r>
+        <w:rPr>
+          <w:rFonts w:ascii="Times New Roman" w:hAnsi="Times New Roman" w:cs="Times New Roman"/>
+          <w:lang w:eastAsia="es-EC"/>
+        </w:rPr>
+        <w:t>master</w:t>
+      </w:r>
+      <w:proofErr w:type="gramEnd"/>
+      <w:r>
+        <w:rPr>
+          <w:rFonts w:ascii="Times New Roman" w:hAnsi="Times New Roman" w:cs="Times New Roman"/>
+          <w:lang w:eastAsia="es-EC"/>
+        </w:rPr>
+        <w:t xml:space="preserve">, </w:t>
+      </w:r>
+      <w:proofErr w:type="spellStart"/>
+      <w:r>
+        <w:rPr>
+          <w:rFonts w:ascii="Times New Roman" w:hAnsi="Times New Roman" w:cs="Times New Roman"/>
+          <w:lang w:eastAsia="es-EC"/>
+        </w:rPr>
+        <w:t>develop</w:t>
+      </w:r>
+      <w:proofErr w:type="spellEnd"/>
+      <w:r>
+        <w:rPr>
+          <w:rFonts w:ascii="Times New Roman" w:hAnsi="Times New Roman" w:cs="Times New Roman"/>
+          <w:lang w:eastAsia="es-EC"/>
+        </w:rPr>
+        <w:t xml:space="preserve"> y </w:t>
+      </w:r>
+      <w:proofErr w:type="spellStart"/>
+      <w:r>
+        <w:rPr>
+          <w:rFonts w:ascii="Times New Roman" w:hAnsi="Times New Roman" w:cs="Times New Roman"/>
+          <w:lang w:eastAsia="es-EC"/>
+        </w:rPr>
+        <w:t>feature</w:t>
+      </w:r>
+      <w:proofErr w:type="spellEnd"/>
+      <w:r>
+        <w:rPr>
+          <w:rFonts w:ascii="Times New Roman" w:hAnsi="Times New Roman" w:cs="Times New Roman"/>
+          <w:lang w:eastAsia="es-EC"/>
+        </w:rPr>
+        <w:t>/ permite organizar los diferentes avances y mantener un historial de modificaciones del proyecto.</w:t>
+      </w:r>
+    </w:p>
+    <w:p>
+      <w:pPr>
+        <w:rPr>
+          <w:rFonts w:ascii="Times New Roman" w:hAnsi="Times New Roman" w:cs="Times New Roman"/>
+          <w:b/>
+          <w:bCs/>
+          <w:lang w:eastAsia="es-EC"/>
+        </w:rPr>
+      </w:pPr>
+      <w:proofErr w:type="gramStart"/>
+      <w:r>
+        <w:rPr>
+          <w:rFonts w:ascii="Times New Roman" w:hAnsi="Times New Roman" w:cs="Times New Roman"/>
+          <w:b/>
+          <w:bCs/>
+          <w:lang w:eastAsia="es-EC"/>
+        </w:rPr>
+        <w:t>LINK</w:t>
+      </w:r>
+      <w:proofErr w:type="gramEnd"/>
+      <w:r>
+        <w:rPr>
+          <w:rFonts w:ascii="Times New Roman" w:hAnsi="Times New Roman" w:cs="Times New Roman"/>
+          <w:b/>
+          <w:bCs/>
+          <w:lang w:eastAsia="es-EC"/>
+        </w:rPr>
+        <w:t xml:space="preserve"> LUCIDCHART:</w:t>
+      </w:r>
+    </w:p>
+    <w:p>
+      <w:pPr>
+        <w:rPr>
+          <w:rFonts w:ascii="Times New Roman" w:hAnsi="Times New Roman" w:cs="Times New Roman"/>
+          <w:lang w:eastAsia="es-EC"/>
+        </w:rPr>
+      </w:pPr>
+      <w:hyperlink r:id="rId29" w:history="1">
+        <w:r>
+          <w:rPr>
+            <w:rStyle w:val="Hipervnculo"/>
+            <w:rFonts w:ascii="Times New Roman" w:hAnsi="Times New Roman" w:cs="Times New Roman"/>
+            <w:lang w:eastAsia="es-EC"/>
+          </w:rPr>
+          <w:t>https://lucid.app/lucidchart/726b9791-22a9-4a39-8086-3683ccb42373/edit?viewport_loc=-572%2C-205%2C2494%2C1298%2C0_0&amp;invitationId=inv_4147f79e-8783-48f0-b615-7e0fef234a3c</w:t>
+        </w:r>
+      </w:hyperlink>
+      <w:r>
+        <w:rPr>
+          <w:rFonts w:ascii="Times New Roman" w:hAnsi="Times New Roman" w:cs="Times New Roman"/>
           <w:lang w:eastAsia="es-EC"/>
         </w:rPr>
         <w:t xml:space="preserve"> </w:t>
       </w:r>
-      <w:proofErr w:type="spellStart"/>
-      <w:r>
-        <w:rPr>
-          <w:rFonts w:ascii="Times New Roman" w:hAnsi="Times New Roman" w:cs="Times New Roman"/>
-          <w:b/>
-          <w:bCs/>
-          <w:lang w:eastAsia="es-EC"/>
-        </w:rPr>
-        <w:t>push</w:t>
-      </w:r>
-      <w:proofErr w:type="spellEnd"/>
-    </w:p>
-    <w:p>
-      <w:pPr>
-        <w:rPr>
-          <w:rFonts w:ascii="Times New Roman" w:hAnsi="Times New Roman" w:cs="Times New Roman"/>
-          <w:b/>
-          <w:bCs/>
-          <w:lang w:eastAsia="es-EC"/>
-        </w:rPr>
-      </w:pPr>
-    </w:p>
-    <w:p>
-      <w:pPr>
-        <w:rPr>
-          <w:rFonts w:ascii="Times New Roman" w:hAnsi="Times New Roman" w:cs="Times New Roman"/>
-          <w:b/>
-          <w:bCs/>
-          <w:lang w:eastAsia="es-EC"/>
-        </w:rPr>
-      </w:pPr>
-    </w:p>
-    <w:p>
-      <w:pPr>
-        <w:rPr>
-          <w:rFonts w:ascii="Times New Roman" w:hAnsi="Times New Roman" w:cs="Times New Roman"/>
-          <w:b/>
-          <w:bCs/>
-          <w:lang w:eastAsia="es-EC"/>
-        </w:rPr>
-      </w:pPr>
-    </w:p>
-    <w:p>
-      <w:pPr>
-        <w:rPr>
-          <w:rFonts w:ascii="Times New Roman" w:hAnsi="Times New Roman" w:cs="Times New Roman"/>
-          <w:lang w:eastAsia="es-EC"/>
-        </w:rPr>
-      </w:pPr>
-    </w:p>
-    <w:p>
-      <w:pPr>
-        <w:rPr>
-          <w:rFonts w:ascii="Times New Roman" w:hAnsi="Times New Roman" w:cs="Times New Roman"/>
-          <w:lang w:eastAsia="es-EC"/>
-        </w:rPr>
-      </w:pPr>
-    </w:p>
-    <w:p>
-      <w:pPr>
-        <w:rPr>
-          <w:rFonts w:ascii="Times New Roman" w:hAnsi="Times New Roman" w:cs="Times New Roman"/>
-          <w:lang w:eastAsia="es-EC"/>
-        </w:rPr>
-      </w:pPr>
-    </w:p>
-    <w:p>
-      <w:pPr>
-        <w:rPr>
-          <w:rFonts w:ascii="Times New Roman" w:hAnsi="Times New Roman" w:cs="Times New Roman"/>
-          <w:lang w:eastAsia="es-EC"/>
-        </w:rPr>
-      </w:pPr>
-    </w:p>
-    <w:p>
-      <w:pPr>
-        <w:rPr>
-          <w:rFonts w:ascii="Times New Roman" w:hAnsi="Times New Roman" w:cs="Times New Roman"/>
-          <w:lang w:eastAsia="es-EC"/>
-        </w:rPr>
-      </w:pPr>
-    </w:p>
-    <w:p>
-      <w:pPr>
-        <w:rPr>
-          <w:rFonts w:ascii="Times New Roman" w:hAnsi="Times New Roman" w:cs="Times New Roman"/>
-          <w:lang w:eastAsia="es-EC"/>
-        </w:rPr>
-      </w:pPr>
-    </w:p>
-    <w:p>
-      <w:pPr>
-        <w:rPr>
-          <w:rFonts w:ascii="Times New Roman" w:hAnsi="Times New Roman" w:cs="Times New Roman"/>
-          <w:lang w:eastAsia="es-EC"/>
-        </w:rPr>
-      </w:pPr>
-    </w:p>
-    <w:p>
-      <w:pPr>
-        <w:rPr>
-          <w:rFonts w:ascii="Times New Roman" w:hAnsi="Times New Roman" w:cs="Times New Roman"/>
-          <w:lang w:eastAsia="es-EC"/>
-        </w:rPr>
-      </w:pPr>
-    </w:p>
-    <w:p>
-      <w:pPr>
-        <w:rPr>
-          <w:rFonts w:ascii="Times New Roman" w:hAnsi="Times New Roman" w:cs="Times New Roman"/>
-          <w:lang w:eastAsia="es-EC"/>
-        </w:rPr>
-      </w:pPr>
-    </w:p>
-    <w:p>
-      <w:pPr>
-        <w:rPr>
-          <w:rFonts w:ascii="Times New Roman" w:hAnsi="Times New Roman" w:cs="Times New Roman"/>
-          <w:lang w:eastAsia="es-EC"/>
-        </w:rPr>
-      </w:pPr>
-    </w:p>
-    <w:p>
-      <w:pPr>
-        <w:rPr>
-          <w:rFonts w:ascii="Times New Roman" w:hAnsi="Times New Roman" w:cs="Times New Roman"/>
-          <w:lang w:eastAsia="es-EC"/>
-        </w:rPr>
-      </w:pPr>
-    </w:p>
-    <w:p>
-      <w:pPr>
-        <w:rPr>
-          <w:rFonts w:ascii="Times New Roman" w:hAnsi="Times New Roman" w:cs="Times New Roman"/>
-          <w:lang w:eastAsia="es-EC"/>
-        </w:rPr>
-      </w:pPr>
-    </w:p>
-    <w:p>
-      <w:pPr>
-        <w:rPr>
-          <w:rFonts w:ascii="Times New Roman" w:hAnsi="Times New Roman" w:cs="Times New Roman"/>
-          <w:lang w:eastAsia="es-EC"/>
-        </w:rPr>
-      </w:pPr>
-    </w:p>
-    <w:p>
-      <w:pPr>
-        <w:rPr>
-          <w:rFonts w:ascii="Times New Roman" w:hAnsi="Times New Roman" w:cs="Times New Roman"/>
-          <w:lang w:eastAsia="es-EC"/>
-        </w:rPr>
-      </w:pPr>
-    </w:p>
-    <w:p>
-      <w:pPr>
-        <w:rPr>
-          <w:rFonts w:ascii="Times New Roman" w:hAnsi="Times New Roman" w:cs="Times New Roman"/>
-          <w:lang w:eastAsia="es-EC"/>
-        </w:rPr>
-      </w:pPr>
-    </w:p>
-    <w:p>
-      <w:pPr>
-        <w:rPr>
-          <w:rFonts w:ascii="Times New Roman" w:hAnsi="Times New Roman" w:cs="Times New Roman"/>
-          <w:lang w:eastAsia="es-EC"/>
-        </w:rPr>
-      </w:pPr>
-    </w:p>
-    <w:p>
-      <w:pPr>
-        <w:rPr>
-          <w:rFonts w:ascii="Times New Roman" w:hAnsi="Times New Roman" w:cs="Times New Roman"/>
-          <w:lang w:eastAsia="es-EC"/>
-        </w:rPr>
-      </w:pPr>
-    </w:p>
-    <w:p>
-      <w:pPr>
-        <w:rPr>
-          <w:rFonts w:ascii="Times New Roman" w:hAnsi="Times New Roman" w:cs="Times New Roman"/>
-          <w:lang w:eastAsia="es-EC"/>
-        </w:rPr>
-      </w:pPr>
-    </w:p>
-    <w:p>
-      <w:pPr>
-        <w:rPr>
-          <w:rFonts w:ascii="Times New Roman" w:hAnsi="Times New Roman" w:cs="Times New Roman"/>
-          <w:lang w:eastAsia="es-EC"/>
-        </w:rPr>
-      </w:pPr>
-    </w:p>
-    <w:p>
-      <w:pPr>
-        <w:rPr>
-          <w:rFonts w:ascii="Times New Roman" w:hAnsi="Times New Roman" w:cs="Times New Roman"/>
-          <w:lang w:eastAsia="es-EC"/>
-        </w:rPr>
-      </w:pPr>
-    </w:p>
-    <w:p>
-      <w:pPr>
-        <w:rPr>
-          <w:rFonts w:ascii="Times New Roman" w:hAnsi="Times New Roman" w:cs="Times New Roman"/>
-          <w:lang w:eastAsia="es-EC"/>
-        </w:rPr>
-      </w:pPr>
-    </w:p>
-    <w:p>
-      <w:pPr>
-        <w:rPr>
-          <w:rFonts w:ascii="Times New Roman" w:hAnsi="Times New Roman" w:cs="Times New Roman"/>
-          <w:lang w:eastAsia="es-EC"/>
-        </w:rPr>
-      </w:pPr>
-    </w:p>
-    <w:p>
-      <w:pPr>
-        <w:rPr>
-          <w:rFonts w:ascii="Times New Roman" w:hAnsi="Times New Roman" w:cs="Times New Roman"/>
-          <w:lang w:eastAsia="es-EC"/>
-        </w:rPr>
-      </w:pPr>
-    </w:p>
-    <w:p>
-      <w:pPr>
-        <w:rPr>
-          <w:rFonts w:ascii="Times New Roman" w:hAnsi="Times New Roman" w:cs="Times New Roman"/>
-          <w:lang w:eastAsia="es-EC"/>
-        </w:rPr>
-      </w:pPr>
-    </w:p>
-    <w:p>
-      <w:pPr>
-        <w:rPr>
-          <w:rFonts w:ascii="Times New Roman" w:hAnsi="Times New Roman" w:cs="Times New Roman"/>
-          <w:lang w:eastAsia="es-EC"/>
-        </w:rPr>
-      </w:pPr>
-    </w:p>
-    <w:p>
-      <w:pPr>
-        <w:rPr>
-          <w:rFonts w:ascii="Times New Roman" w:hAnsi="Times New Roman" w:cs="Times New Roman"/>
-          <w:lang w:eastAsia="es-EC"/>
-        </w:rPr>
-      </w:pPr>
-    </w:p>
-    <w:p>
-      <w:pPr>
-        <w:rPr>
-          <w:rFonts w:ascii="Times New Roman" w:hAnsi="Times New Roman" w:cs="Times New Roman"/>
-          <w:lang w:eastAsia="es-EC"/>
-        </w:rPr>
-      </w:pPr>
-    </w:p>
-    <w:p>
-      <w:pPr>
-        <w:rPr>
-          <w:rFonts w:ascii="Times New Roman" w:hAnsi="Times New Roman" w:cs="Times New Roman"/>
-          <w:lang w:eastAsia="es-EC"/>
-        </w:rPr>
-      </w:pPr>
-    </w:p>
-    <w:p>
-      <w:pPr>
-        <w:rPr>
-          <w:rFonts w:ascii="Times New Roman" w:hAnsi="Times New Roman" w:cs="Times New Roman"/>
-          <w:b/>
-          <w:bCs/>
-          <w:lang w:eastAsia="es-EC"/>
-        </w:rPr>
-      </w:pPr>
-      <w:r>
-        <w:rPr>
-          <w:rFonts w:ascii="Times New Roman" w:hAnsi="Times New Roman" w:cs="Times New Roman"/>
-          <w:b/>
-          <w:bCs/>
-          <w:lang w:eastAsia="es-EC"/>
-        </w:rPr>
-        <w:pict w14:anchorId="67470AD2">
-          <v:rect id="_x0000_i1026" style="width:0;height:1.5pt" o:hralign="center" o:hrstd="t" o:hr="t" fillcolor="#a0a0a0" stroked="f"/>
-        </w:pict>
-      </w:r>
-    </w:p>
-    <w:p>
-      <w:pPr>
-        <w:rPr>
-          <w:rFonts w:ascii="Times New Roman" w:hAnsi="Times New Roman" w:cs="Times New Roman"/>
-          <w:b/>
-          <w:bCs/>
+    </w:p>
+    <w:p>
+      <w:pPr>
+        <w:rPr>
+          <w:rFonts w:ascii="Times New Roman" w:hAnsi="Times New Roman" w:cs="Times New Roman"/>
+          <w:b/>
+          <w:bCs/>
+          <w:lang w:eastAsia="es-EC"/>
+        </w:rPr>
+      </w:pPr>
+      <w:proofErr w:type="gramStart"/>
+      <w:r>
+        <w:rPr>
+          <w:rFonts w:ascii="Times New Roman" w:hAnsi="Times New Roman" w:cs="Times New Roman"/>
+          <w:b/>
+          <w:bCs/>
+          <w:lang w:eastAsia="es-EC"/>
+        </w:rPr>
+        <w:t>LINK</w:t>
+      </w:r>
+      <w:proofErr w:type="gramEnd"/>
+      <w:r>
+        <w:rPr>
+          <w:rFonts w:ascii="Times New Roman" w:hAnsi="Times New Roman" w:cs="Times New Roman"/>
+          <w:b/>
+          <w:bCs/>
+          <w:lang w:eastAsia="es-EC"/>
+        </w:rPr>
+        <w:t xml:space="preserve"> GITHUB:</w:t>
+      </w:r>
+    </w:p>
+    <w:p>
+      <w:pPr>
+        <w:rPr>
+          <w:rFonts w:ascii="Times New Roman" w:hAnsi="Times New Roman" w:cs="Times New Roman"/>
+          <w:lang w:eastAsia="es-EC"/>
+        </w:rPr>
+      </w:pPr>
+      <w:hyperlink r:id="rId30" w:history="1">
+        <w:r>
+          <w:rPr>
+            <w:rStyle w:val="Hipervnculo"/>
+            <w:rFonts w:ascii="Times New Roman" w:hAnsi="Times New Roman" w:cs="Times New Roman"/>
+            <w:lang w:eastAsia="es-EC"/>
+          </w:rPr>
+          <w:t>https://github.com/miguel7utm/sistema-rescate-adopcion-animal</w:t>
+        </w:r>
+      </w:hyperlink>
+      <w:r>
+        <w:rPr>
+          <w:rFonts w:ascii="Times New Roman" w:hAnsi="Times New Roman" w:cs="Times New Roman"/>
+          <w:lang w:eastAsia="es-EC"/>
+        </w:rPr>
+        <w:t xml:space="preserve"> </w:t>
+      </w:r>
+    </w:p>
+    <w:p>
+      <w:pPr>
+        <w:rPr>
+          <w:rFonts w:ascii="Times New Roman" w:hAnsi="Times New Roman" w:cs="Times New Roman"/>
           <w:lang w:eastAsia="es-EC"/>
         </w:rPr>
       </w:pPr>
@@ -4641,262 +5151,6 @@
           <w:lang w:eastAsia="es-EC"/>
         </w:rPr>
       </w:pPr>
-    </w:p>
-    <w:p>
-      <w:pPr>
-        <w:pStyle w:val="Sinespaciado"/>
-        <w:spacing w:line="360" w:lineRule="auto"/>
-        <w:jc w:val="both"/>
-        <w:rPr>
-          <w:rFonts w:ascii="Arial" w:hAnsi="Arial" w:cs="Arial"/>
-          <w:b/>
-          <w:bCs/>
-          <w:lang w:eastAsia="es-EC"/>
-        </w:rPr>
-      </w:pPr>
-    </w:p>
-    <w:p>
-      <w:pPr>
-        <w:pStyle w:val="Sinespaciado"/>
-        <w:spacing w:line="360" w:lineRule="auto"/>
-        <w:jc w:val="both"/>
-        <w:rPr>
-          <w:rFonts w:ascii="Arial" w:hAnsi="Arial" w:cs="Arial"/>
-          <w:b/>
-          <w:bCs/>
-          <w:lang w:eastAsia="es-EC"/>
-        </w:rPr>
-      </w:pPr>
-    </w:p>
-    <w:p>
-      <w:pPr>
-        <w:pStyle w:val="Sinespaciado"/>
-        <w:spacing w:line="360" w:lineRule="auto"/>
-        <w:jc w:val="both"/>
-        <w:rPr>
-          <w:rFonts w:ascii="Arial" w:hAnsi="Arial" w:cs="Arial"/>
-          <w:b/>
-          <w:bCs/>
-          <w:lang w:eastAsia="es-EC"/>
-        </w:rPr>
-      </w:pPr>
-    </w:p>
-    <w:p>
-      <w:pPr>
-        <w:pStyle w:val="Sinespaciado"/>
-        <w:spacing w:line="360" w:lineRule="auto"/>
-        <w:jc w:val="both"/>
-        <w:rPr>
-          <w:rFonts w:ascii="Arial" w:hAnsi="Arial" w:cs="Arial"/>
-          <w:b/>
-          <w:bCs/>
-          <w:lang w:eastAsia="es-EC"/>
-        </w:rPr>
-      </w:pPr>
-    </w:p>
-    <w:p>
-      <w:pPr>
-        <w:pStyle w:val="Sinespaciado"/>
-        <w:spacing w:line="360" w:lineRule="auto"/>
-        <w:jc w:val="both"/>
-        <w:rPr>
-          <w:rFonts w:ascii="Arial" w:hAnsi="Arial" w:cs="Arial"/>
-          <w:b/>
-          <w:bCs/>
-          <w:lang w:eastAsia="es-EC"/>
-        </w:rPr>
-      </w:pPr>
-    </w:p>
-    <w:p>
-      <w:pPr>
-        <w:pStyle w:val="Sinespaciado"/>
-        <w:spacing w:line="360" w:lineRule="auto"/>
-        <w:jc w:val="both"/>
-        <w:rPr>
-          <w:rFonts w:ascii="Arial" w:hAnsi="Arial" w:cs="Arial"/>
-          <w:b/>
-          <w:bCs/>
-          <w:lang w:eastAsia="es-EC"/>
-        </w:rPr>
-      </w:pPr>
-    </w:p>
-    <w:p>
-      <w:pPr>
-        <w:pStyle w:val="Sinespaciado"/>
-        <w:spacing w:line="360" w:lineRule="auto"/>
-        <w:jc w:val="both"/>
-        <w:rPr>
-          <w:rFonts w:ascii="Arial" w:hAnsi="Arial" w:cs="Arial"/>
-          <w:b/>
-          <w:bCs/>
-          <w:lang w:eastAsia="es-EC"/>
-        </w:rPr>
-      </w:pPr>
-    </w:p>
-    <w:p>
-      <w:pPr>
-        <w:pStyle w:val="Sinespaciado"/>
-        <w:spacing w:line="360" w:lineRule="auto"/>
-        <w:jc w:val="both"/>
-        <w:rPr>
-          <w:rFonts w:ascii="Arial" w:hAnsi="Arial" w:cs="Arial"/>
-          <w:b/>
-          <w:bCs/>
-          <w:lang w:eastAsia="es-EC"/>
-        </w:rPr>
-      </w:pPr>
-    </w:p>
-    <w:p>
-      <w:pPr>
-        <w:pStyle w:val="Sinespaciado"/>
-        <w:spacing w:line="360" w:lineRule="auto"/>
-        <w:jc w:val="both"/>
-        <w:rPr>
-          <w:rFonts w:ascii="Arial" w:hAnsi="Arial" w:cs="Arial"/>
-          <w:b/>
-          <w:bCs/>
-          <w:lang w:eastAsia="es-EC"/>
-        </w:rPr>
-      </w:pPr>
-    </w:p>
-    <w:p>
-      <w:pPr>
-        <w:pStyle w:val="Sinespaciado"/>
-        <w:spacing w:line="360" w:lineRule="auto"/>
-        <w:jc w:val="both"/>
-        <w:rPr>
-          <w:rFonts w:ascii="Arial" w:hAnsi="Arial" w:cs="Arial"/>
-          <w:b/>
-          <w:bCs/>
-          <w:lang w:eastAsia="es-EC"/>
-        </w:rPr>
-      </w:pPr>
-    </w:p>
-    <w:p>
-      <w:pPr>
-        <w:pStyle w:val="Sinespaciado"/>
-        <w:spacing w:line="360" w:lineRule="auto"/>
-        <w:jc w:val="both"/>
-        <w:rPr>
-          <w:rFonts w:ascii="Arial" w:hAnsi="Arial" w:cs="Arial"/>
-          <w:b/>
-          <w:bCs/>
-          <w:lang w:eastAsia="es-EC"/>
-        </w:rPr>
-      </w:pPr>
-    </w:p>
-    <w:p>
-      <w:pPr>
-        <w:pStyle w:val="Sinespaciado"/>
-        <w:spacing w:line="360" w:lineRule="auto"/>
-        <w:jc w:val="both"/>
-        <w:rPr>
-          <w:rFonts w:ascii="Arial" w:hAnsi="Arial" w:cs="Arial"/>
-          <w:b/>
-          <w:bCs/>
-          <w:lang w:eastAsia="es-EC"/>
-        </w:rPr>
-      </w:pPr>
-    </w:p>
-    <w:p>
-      <w:pPr>
-        <w:pStyle w:val="Sinespaciado"/>
-        <w:spacing w:line="360" w:lineRule="auto"/>
-        <w:jc w:val="both"/>
-        <w:rPr>
-          <w:rFonts w:ascii="Arial" w:hAnsi="Arial" w:cs="Arial"/>
-          <w:b/>
-          <w:bCs/>
-          <w:lang w:eastAsia="es-EC"/>
-        </w:rPr>
-      </w:pPr>
-    </w:p>
-    <w:p>
-      <w:pPr>
-        <w:pStyle w:val="Sinespaciado"/>
-        <w:spacing w:line="360" w:lineRule="auto"/>
-        <w:jc w:val="both"/>
-        <w:rPr>
-          <w:rFonts w:ascii="Arial" w:hAnsi="Arial" w:cs="Arial"/>
-          <w:b/>
-          <w:bCs/>
-          <w:lang w:eastAsia="es-EC"/>
-        </w:rPr>
-      </w:pPr>
-    </w:p>
-    <w:p>
-      <w:pPr>
-        <w:pStyle w:val="Sinespaciado"/>
-        <w:spacing w:line="360" w:lineRule="auto"/>
-        <w:jc w:val="both"/>
-        <w:rPr>
-          <w:rFonts w:ascii="Arial" w:hAnsi="Arial" w:cs="Arial"/>
-          <w:b/>
-          <w:bCs/>
-          <w:lang w:eastAsia="es-EC"/>
-        </w:rPr>
-      </w:pPr>
-    </w:p>
-    <w:p>
-      <w:pPr>
-        <w:pStyle w:val="Sinespaciado"/>
-        <w:spacing w:line="360" w:lineRule="auto"/>
-        <w:jc w:val="both"/>
-        <w:rPr>
-          <w:rFonts w:ascii="Arial" w:hAnsi="Arial" w:cs="Arial"/>
-          <w:b/>
-          <w:bCs/>
-          <w:lang w:eastAsia="es-EC"/>
-        </w:rPr>
-      </w:pPr>
-    </w:p>
-    <w:p>
-      <w:pPr>
-        <w:pStyle w:val="Sinespaciado"/>
-        <w:spacing w:line="360" w:lineRule="auto"/>
-        <w:jc w:val="both"/>
-        <w:rPr>
-          <w:rFonts w:ascii="Arial" w:hAnsi="Arial" w:cs="Arial"/>
-          <w:b/>
-          <w:bCs/>
-          <w:lang w:eastAsia="es-EC"/>
-        </w:rPr>
-      </w:pPr>
-    </w:p>
-    <w:p>
-      <w:pPr>
-        <w:pStyle w:val="Sinespaciado"/>
-        <w:spacing w:line="360" w:lineRule="auto"/>
-        <w:jc w:val="both"/>
-        <w:rPr>
-          <w:rFonts w:ascii="Arial" w:hAnsi="Arial" w:cs="Arial"/>
-          <w:b/>
-          <w:bCs/>
-          <w:lang w:eastAsia="es-EC"/>
-        </w:rPr>
-      </w:pPr>
-    </w:p>
-    <w:p>
-      <w:pPr>
-        <w:pStyle w:val="Sinespaciado"/>
-        <w:spacing w:line="360" w:lineRule="auto"/>
-        <w:jc w:val="both"/>
-        <w:rPr>
-          <w:rFonts w:ascii="Arial" w:hAnsi="Arial" w:cs="Arial"/>
-          <w:b/>
-          <w:bCs/>
-          <w:lang w:eastAsia="es-EC"/>
-        </w:rPr>
-      </w:pPr>
-      <w:r>
-        <w:rPr>
-          <w:rFonts w:ascii="Arial" w:hAnsi="Arial" w:cs="Arial"/>
-          <w:b/>
-          <w:bCs/>
-          <w:lang w:eastAsia="es-EC"/>
-        </w:rPr>
-        <w:t>Evidencias</w:t>
-      </w:r>
     </w:p>
     <w:p>
       <w:pPr>
@@ -4923,119 +5177,17 @@
       <w:r>
         <w:rPr>
           <w:rFonts w:ascii="Arial" w:hAnsi="Arial" w:cs="Arial"/>
-          <w:b/>
-          <w:bCs/>
           <w:i/>
           <w:iCs/>
           <w:sz w:val="20"/>
           <w:szCs w:val="20"/>
           <w:lang w:eastAsia="es-EC"/>
         </w:rPr>
-        <w:t>(</w:t>
-      </w:r>
-      <w:r>
-        <w:rPr>
-          <w:rFonts w:ascii="Arial" w:eastAsia="Arial" w:hAnsi="Arial" w:cs="Arial"/>
-          <w:i/>
-          <w:iCs/>
-          <w:color w:val="000000"/>
-          <w:sz w:val="20"/>
-          <w:szCs w:val="20"/>
-        </w:rPr>
-        <w:t>Código de la ejecución de los ejercicios, enlace drive donde se encuentren los mismos y Capturas de pantalla claras y relevantes, donde evidencie el proceso realizado).</w:t>
-      </w:r>
-      <w:r>
-        <w:rPr>
-          <w:rFonts w:ascii="Arial" w:hAnsi="Arial" w:cs="Arial"/>
-          <w:b/>
-          <w:bCs/>
-          <w:sz w:val="24"/>
-          <w:szCs w:val="24"/>
-          <w:lang w:eastAsia="es-EC"/>
-        </w:rPr>
-        <w:br w:type="page"/>
-      </w:r>
-    </w:p>
-    <w:p>
-      <w:pPr>
-        <w:pStyle w:val="Sinespaciado"/>
-        <w:spacing w:line="360" w:lineRule="auto"/>
-        <w:jc w:val="both"/>
-        <w:rPr>
-          <w:rFonts w:ascii="Arial" w:hAnsi="Arial" w:cs="Arial"/>
-          <w:b/>
-          <w:bCs/>
-          <w:lang w:eastAsia="es-EC"/>
-        </w:rPr>
-      </w:pPr>
-      <w:r>
-        <w:rPr>
-          <w:rFonts w:ascii="Arial" w:hAnsi="Arial" w:cs="Arial"/>
-          <w:b/>
-          <w:bCs/>
-          <w:lang w:eastAsia="es-EC"/>
-        </w:rPr>
-        <w:lastRenderedPageBreak/>
-        <w:t>Bibliografía</w:t>
-      </w:r>
-    </w:p>
-    <w:p>
-      <w:pPr>
-        <w:widowControl w:val="0"/>
-        <w:pBdr>
-          <w:top w:val="nil"/>
-          <w:left w:val="nil"/>
-          <w:bottom w:val="nil"/>
-          <w:right w:val="nil"/>
-          <w:between w:val="nil"/>
-        </w:pBdr>
-        <w:spacing w:after="0" w:line="240" w:lineRule="auto"/>
-        <w:jc w:val="both"/>
-        <w:rPr>
-          <w:rFonts w:ascii="Arial" w:hAnsi="Arial" w:cs="Arial"/>
-          <w:i/>
-          <w:iCs/>
-          <w:sz w:val="20"/>
-          <w:szCs w:val="20"/>
-          <w:lang w:eastAsia="es-EC"/>
-        </w:rPr>
-      </w:pPr>
-      <w:r>
-        <w:rPr>
-          <w:rFonts w:ascii="Arial" w:hAnsi="Arial" w:cs="Arial"/>
-          <w:i/>
-          <w:iCs/>
-          <w:sz w:val="20"/>
-          <w:szCs w:val="20"/>
-          <w:lang w:eastAsia="es-EC"/>
-        </w:rPr>
-        <w:t>(</w:t>
-      </w:r>
-      <w:r>
-        <w:rPr>
-          <w:rFonts w:ascii="Arial" w:hAnsi="Arial" w:cs="Arial"/>
-          <w:i/>
-          <w:iCs/>
-          <w:sz w:val="20"/>
-          <w:szCs w:val="20"/>
-          <w:lang w:eastAsia="es-EC"/>
-        </w:rPr>
-        <w:t>Referencias bibliográficas y/o enlaces en Internet (normas APA) que se utilizaron para realizar la práctica.</w:t>
-      </w:r>
-      <w:r>
-        <w:rPr>
-          <w:rFonts w:ascii="Arial" w:hAnsi="Arial" w:cs="Arial"/>
-          <w:i/>
-          <w:iCs/>
-          <w:sz w:val="20"/>
-          <w:szCs w:val="20"/>
-          <w:lang w:eastAsia="es-EC"/>
-        </w:rPr>
-        <w:t>)</w:t>
+        <w:t xml:space="preserve"> </w:t>
       </w:r>
     </w:p>
     <w:sectPr>
-      <w:headerReference w:type="first" r:id="rId25"/>
+      <w:headerReference w:type="first" r:id="rId31"/>
       <w:pgSz w:w="11906" w:h="16838"/>
       <w:pgMar w:top="1417" w:right="1701" w:bottom="1417" w:left="1701" w:header="708" w:footer="708" w:gutter="0"/>
       <w:pgNumType w:start="1"/>
@@ -5907,7 +6059,7 @@
         <v:path o:extrusionok="f" gradientshapeok="t" o:connecttype="rect"/>
         <o:lock v:ext="edit" aspectratio="t"/>
       </v:shapetype>
-      <v:shape id="_x0000_i1025" type="#_x0000_t75" style="width:11.6pt;height:11.6pt" o:bullet="t">
+      <v:shape id="_x0000_i1025" type="#_x0000_t75" style="width:11.65pt;height:11.65pt" o:bullet="t">
         <v:imagedata r:id="rId1" o:title="mso3E28"/>
       </v:shape>
     </w:pict>
@@ -9210,6 +9362,7 @@
   <w:style w:type="character" w:default="1" w:styleId="Fuentedeprrafopredeter">
     <w:name w:val="Default Paragraph Font"/>
     <w:uiPriority w:val="1"/>
+    <w:semiHidden/>
     <w:unhideWhenUsed/>
   </w:style>
   <w:style w:type="table" w:default="1" w:styleId="Tablanormal">
@@ -9688,6 +9841,18 @@
       </w:tcPr>
     </w:tblStylePr>
   </w:style>
+  <w:style w:type="character" w:styleId="Mencinsinresolver">
+    <w:name w:val="Unresolved Mention"/>
+    <w:basedOn w:val="Fuentedeprrafopredeter"/>
+    <w:uiPriority w:val="99"/>
+    <w:semiHidden/>
+    <w:unhideWhenUsed/>
+    <w:rsid w:val="009644EA"/>
+    <w:rPr>
+      <w:color w:val="605E5C"/>
+      <w:shd w:val="clear" w:color="auto" w:fill="E1DFDD"/>
+    </w:rPr>
+  </w:style>
 </w:styles>
 </file>
 

</xml_diff>